<commit_message>
Add transitions between slides in the oral script and speaker notes
</commit_message>
<xml_diff>
--- a/presentation/oral_script.docx
+++ b/presentation/oral_script.docx
@@ -51,7 +51,7 @@
           <w:sz w:val="21"/>
           <w:szCs w:val="21"/>
         </w:rPr>
-        <w:t>About 1247 words: at a calm pace (about 130 words per minute), this is a little under 10 minutes.</w:t>
+        <w:t>About 1303 words: at a calm pace (about 130 words per minute), this is about 10 minutes. Without the 111 optional words, about 9 minutes: a safety margin.</w:t>
       </w:r>
     </w:p>
     <w:p>
@@ -68,7 +68,7 @@
           <w:sz w:val="21"/>
           <w:szCs w:val="21"/>
         </w:rPr>
-        <w:t>Read it aloud 3 times, with the slides, and time yourself once. Speak slowly; pause after each bold sentence: it is the one the jury must remember.</w:t>
+        <w:t>Each slide ends with a link to the next one ("so now we try to fix it"). Keep these links even when you are late: they make the six steps one story.</w:t>
       </w:r>
     </w:p>
     <w:p>
@@ -85,7 +85,7 @@
           <w:sz w:val="21"/>
           <w:szCs w:val="21"/>
         </w:rPr>
-        <w:t>Blue text in brackets is a stage cue (where to point); do not read it. Grey sentences marked (optional) can be skipped if you are late.</w:t>
+        <w:t>Read it aloud 3 times, with the slides, and time yourself once. Speak slowly; pause after each bold sentence: it is the one the jury must remember.</w:t>
       </w:r>
     </w:p>
     <w:p>
@@ -102,6 +102,23 @@
           <w:sz w:val="21"/>
           <w:szCs w:val="21"/>
         </w:rPr>
+        <w:t>Blue text in brackets is a stage cue (where to point); do not read it. Grey sentences marked (optional) can be skipped if you are late.</w:t>
+      </w:r>
+    </w:p>
+    <w:p>
+      <w:pPr>
+        <w:pStyle w:val="Paragraphedeliste"/>
+        <w:numPr>
+          <w:ilvl w:val="0"/>
+          <w:numId w:val="1"/>
+        </w:numPr>
+        <w:spacing w:after="80"/>
+      </w:pPr>
+      <w:r>
+        <w:rPr>
+          <w:sz w:val="21"/>
+          <w:szCs w:val="21"/>
+        </w:rPr>
         <w:t>If you present with a teammate, a natural split is slides 1 to 6, then slides 7 to 11.</w:t>
       </w:r>
     </w:p>
@@ -127,7 +144,7 @@
           <w:sz w:val="19"/>
           <w:szCs w:val="19"/>
         </w:rPr>
-        <w:t>0:00 to 0:30 · 30 s · 91 words</w:t>
+        <w:t>0:00 to 0:40 · 40 s · 91 words</w:t>
       </w:r>
     </w:p>
     <w:p>
@@ -205,7 +222,7 @@
           <w:sz w:val="19"/>
           <w:szCs w:val="19"/>
         </w:rPr>
-        <w:t>0:30 to 1:20 · 50 s · 93 words</w:t>
+        <w:t>0:40 to 1:25 · 45 s · 93 words</w:t>
       </w:r>
     </w:p>
     <w:p>
@@ -285,7 +302,7 @@
           <w:sz w:val="19"/>
           <w:szCs w:val="19"/>
         </w:rPr>
-        <w:t>1:20 to 2:15 · 55 s · 119 words</w:t>
+        <w:t>1:25 to 2:20 · 55 s · 119 words</w:t>
       </w:r>
     </w:p>
     <w:p>
@@ -364,7 +381,16 @@
           <w:sz w:val="25"/>
           <w:szCs w:val="25"/>
         </w:rPr>
-        <w:t xml:space="preserve"> With a random split, 23 of our 32 known painters would be in two piles, and a model could learn to recognise Monet instead of Impressionism. With our split: zero. I will come back to this, because we measured its effect.</w:t>
+        <w:t xml:space="preserve"> With a random split, 23 of our 32 known painters would be in two piles, and a model could learn to recognise Monet instead of Impressionism. With our split: zero. </w:t>
+      </w:r>
+      <w:r>
+        <w:rPr>
+          <w:b/>
+          <w:bCs/>
+          <w:sz w:val="25"/>
+          <w:szCs w:val="25"/>
+        </w:rPr>
+        <w:t>With fair data in place, we could build our first model.</w:t>
       </w:r>
     </w:p>
     <w:p>
@@ -387,19 +413,19 @@
           <w:sz w:val="19"/>
           <w:szCs w:val="19"/>
         </w:rPr>
-        <w:t>2:15 to 3:15 · 60 s · 137 words</w:t>
-      </w:r>
-    </w:p>
-    <w:p>
-      <w:pPr>
-        <w:spacing w:after="160" w:line="320" w:lineRule="auto"/>
-      </w:pPr>
-      <w:r>
-        <w:rPr>
-          <w:sz w:val="25"/>
-          <w:szCs w:val="25"/>
-        </w:rPr>
-        <w:t>Step two: our own network. Our first model is the network of the course: a multi-layer perceptron built from nn.Linear layers and ReLU, with our own training loop. It reads the pixels of a 64 by 64 image: 12 288 inputs and 6.4 million parameters.</w:t>
+        <w:t>2:20 to 3:20 · 60 s · 135 words</w:t>
+      </w:r>
+    </w:p>
+    <w:p>
+      <w:pPr>
+        <w:spacing w:after="160" w:line="320" w:lineRule="auto"/>
+      </w:pPr>
+      <w:r>
+        <w:rPr>
+          <w:sz w:val="25"/>
+          <w:szCs w:val="25"/>
+        </w:rPr>
+        <w:t>Step two. We started with the simplest neural network of the course: a multi-layer perceptron built from nn.Linear layers and ReLU, with our own training loop. It reads the pixels of a 64 by 64 image: 12 288 inputs and 6.4 million parameters.</w:t>
       </w:r>
     </w:p>
     <w:p>
@@ -440,7 +466,24 @@
           <w:sz w:val="25"/>
           <w:szCs w:val="25"/>
         </w:rPr>
-        <w:t xml:space="preserve"> The training accuracy goes to 99.7 percent, but the validation accuracy stays around 40 percent, and the validation loss goes up after epoch 3. </w:t>
+        <w:t xml:space="preserve"> The training accuracy goes to 99.7 percent, but the validation accuracy stays around 40 percent. </w:t>
+      </w:r>
+      <w:r>
+        <w:rPr>
+          <w:i/>
+          <w:iCs/>
+          <w:color w:val="8A8F9C"/>
+          <w:sz w:val="25"/>
+          <w:szCs w:val="25"/>
+        </w:rPr>
+        <w:t>(optional) And the validation loss goes up after epoch 3.</w:t>
+      </w:r>
+      <w:r>
+        <w:rPr>
+          <w:sz w:val="25"/>
+          <w:szCs w:val="25"/>
+        </w:rPr>
+        <w:t xml:space="preserve"> </w:t>
       </w:r>
       <w:r>
         <w:rPr>
@@ -474,19 +517,19 @@
           <w:sz w:val="19"/>
           <w:szCs w:val="19"/>
         </w:rPr>
-        <w:t>3:15 to 4:10 · 55 s · 127 words</w:t>
-      </w:r>
-    </w:p>
-    <w:p>
-      <w:pPr>
-        <w:spacing w:after="160" w:line="320" w:lineRule="auto"/>
-      </w:pPr>
-      <w:r>
-        <w:rPr>
-          <w:sz w:val="25"/>
-          <w:szCs w:val="25"/>
-        </w:rPr>
-        <w:t xml:space="preserve">Step three: monitoring. We looked inside the network during training, not only at the loss. The gradient reaches every layer and only 4 percent of the neurons are dead: the training is healthy, the problem is overfitting. </w:t>
+        <w:t>3:20 to 4:25 · 65 s · 136 words</w:t>
+      </w:r>
+    </w:p>
+    <w:p>
+      <w:pPr>
+        <w:spacing w:after="160" w:line="320" w:lineRule="auto"/>
+      </w:pPr>
+      <w:r>
+        <w:rPr>
+          <w:sz w:val="25"/>
+          <w:szCs w:val="25"/>
+        </w:rPr>
+        <w:t xml:space="preserve">Step three. Our MLP overfits, so we wanted to fix it. But first, we looked inside the network to check that the training itself was healthy: the gradient reaches every layer and only 4 percent of the neurons are dead. So the problem really is overfitting. </w:t>
       </w:r>
       <w:r>
         <w:rPr>
@@ -508,7 +551,7 @@
           <w:sz w:val="25"/>
           <w:szCs w:val="25"/>
         </w:rPr>
-        <w:t xml:space="preserve">Then we tested the tools of session 6, each with 3 seeds, because one run on 219 images is noisy. </w:t>
+        <w:t xml:space="preserve">So we attacked it with the tools of session 6, 3 seeds each. </w:t>
       </w:r>
       <w:r>
         <w:rPr>
@@ -525,19 +568,19 @@
           <w:sz w:val="25"/>
           <w:szCs w:val="25"/>
         </w:rPr>
-        <w:t xml:space="preserve"> Alone, each tool helps a little. All together, weight decay, dropout, batch norm, flips, early stopping and a cosine schedule take the MLP from 38.8 to 45.5 percent, and the gap between train and validation from 0.61 to 0.12.</w:t>
-      </w:r>
-    </w:p>
-    <w:p>
-      <w:pPr>
-        <w:spacing w:after="160" w:line="320" w:lineRule="auto"/>
-      </w:pPr>
-      <w:r>
-        <w:rPr>
-          <w:sz w:val="25"/>
-          <w:szCs w:val="25"/>
-        </w:rPr>
-        <w:t xml:space="preserve">But one number shows the real limit: </w:t>
+        <w:t xml:space="preserve"> Alone, each tool helps a little. All together, weight decay, dropout, batch norm, flips and early stopping take the MLP from 38.8 to 45.5 percent, and the gap between train and validation from 0.61 to 0.12.</w:t>
+      </w:r>
+    </w:p>
+    <w:p>
+      <w:pPr>
+        <w:spacing w:after="160" w:line="320" w:lineRule="auto"/>
+      </w:pPr>
+      <w:r>
+        <w:rPr>
+          <w:sz w:val="25"/>
+          <w:szCs w:val="25"/>
+        </w:rPr>
+        <w:t xml:space="preserve">Overfitting is under control. But one number shows a deeper limit: </w:t>
       </w:r>
       <w:r>
         <w:rPr>
@@ -547,6 +590,13 @@
           <w:szCs w:val="25"/>
         </w:rPr>
         <w:t>the MLP finds only 7 percent of the Cubist paintings. It sees colours, not shapes.</w:t>
+      </w:r>
+      <w:r>
+        <w:rPr>
+          <w:sz w:val="25"/>
+          <w:szCs w:val="25"/>
+        </w:rPr>
+        <w:t xml:space="preserve"> This will decide our next model.</w:t>
       </w:r>
     </w:p>
     <w:p>
@@ -569,19 +619,19 @@
           <w:sz w:val="19"/>
           <w:szCs w:val="19"/>
         </w:rPr>
-        <w:t>4:10 to 5:05 · 55 s · 122 words</w:t>
-      </w:r>
-    </w:p>
-    <w:p>
-      <w:pPr>
-        <w:spacing w:after="160" w:line="320" w:lineRule="auto"/>
-      </w:pPr>
-      <w:r>
-        <w:rPr>
-          <w:sz w:val="25"/>
-          <w:szCs w:val="25"/>
-        </w:rPr>
-        <w:t xml:space="preserve">Still in step three, we wanted to be ready for problems in production, so we broke the training four times on purpose, and diagnosed each run. </w:t>
+        <w:t>4:25 to 5:20 · 55 s · 123 words</w:t>
+      </w:r>
+    </w:p>
+    <w:p>
+      <w:pPr>
+        <w:spacing w:after="160" w:line="320" w:lineRule="auto"/>
+      </w:pPr>
+      <w:r>
+        <w:rPr>
+          <w:sz w:val="25"/>
+          <w:szCs w:val="25"/>
+        </w:rPr>
+        <w:t xml:space="preserve">But overfitting is not the only way a training can go wrong. To be ready for other failures, we broke the training four times on purpose, and diagnosed each run. </w:t>
       </w:r>
       <w:r>
         <w:rPr>
@@ -603,7 +653,7 @@
           <w:sz w:val="25"/>
           <w:szCs w:val="25"/>
         </w:rPr>
-        <w:t>A learning rate 100 times too big killed 99.6 percent of the neurons of layer 2. A forgotten zero_grad made the gradients pile up: 26 times bigger after two epochs. Raw pixels, without standardisation, gave a first loss of 16 instead of 1.6. And eight sigmoid layers gave a vanishing gradient: the first layer received less than a millionth of the gradient of the last one.</w:t>
+        <w:t>A learning rate 100 times too big killed 99.6 percent of the neurons of layer 2. A forgotten zero_grad made the gradients pile up: 26 times bigger after two epochs. Raw pixels, without standardisation, gave a first loss of 16 instead of 1.6. And eight sigmoid layers gave a vanishing gradient: the first layer got a millionth of the gradient of the last.</w:t>
       </w:r>
     </w:p>
     <w:p>
@@ -659,19 +709,19 @@
           <w:sz w:val="19"/>
           <w:szCs w:val="19"/>
         </w:rPr>
-        <w:t>5:05 to 6:05 · 60 s · 118 words</w:t>
-      </w:r>
-    </w:p>
-    <w:p>
-      <w:pPr>
-        <w:spacing w:after="160" w:line="320" w:lineRule="auto"/>
-      </w:pPr>
-      <w:r>
-        <w:rPr>
-          <w:sz w:val="25"/>
-          <w:szCs w:val="25"/>
-        </w:rPr>
-        <w:t>Step four. Our MLP sees colours but not shapes, and to see shapes, we need a convolutional network. With only 1 061 images we cannot train one from zero, so we reuse ResNet18, already trained on 1.2 million ImageNet photos.</w:t>
+        <w:t>5:20 to 6:20 · 60 s · 129 words</w:t>
+      </w:r>
+    </w:p>
+    <w:p>
+      <w:pPr>
+        <w:spacing w:after="160" w:line="320" w:lineRule="auto"/>
+      </w:pPr>
+      <w:r>
+        <w:rPr>
+          <w:sz w:val="25"/>
+          <w:szCs w:val="25"/>
+        </w:rPr>
+        <w:t>With a training we can now trust, step four goes back to the deeper limit: our MLP sees colours, not shapes. To see shapes, we need a convolutional network. With only 1 061 images we cannot train one from zero, so we reuse ResNet18, already trained on 1.2 million ImageNet photos.</w:t>
       </w:r>
     </w:p>
     <w:p>
@@ -728,7 +778,17 @@
           <w:sz w:val="25"/>
           <w:szCs w:val="25"/>
         </w:rPr>
-        <w:t>And we measured two silent bugs: forgetting model.eval() drops the score to 12.8 percent, and forgetting the ImageNet normalisation costs 6 points. Nothing crashes: only measuring shows them.</w:t>
+        <w:t xml:space="preserve">And we measured two silent bugs: forgetting model.eval() drops the score to 12.8 percent, and forgetting the ImageNet normalisation costs 6 points. </w:t>
+      </w:r>
+      <w:r>
+        <w:rPr>
+          <w:i/>
+          <w:iCs/>
+          <w:color w:val="8A8F9C"/>
+          <w:sz w:val="25"/>
+          <w:szCs w:val="25"/>
+        </w:rPr>
+        <w:t>(optional) Nothing crashes: only measuring shows them.</w:t>
       </w:r>
     </w:p>
     <w:p>
@@ -751,19 +811,19 @@
           <w:sz w:val="19"/>
           <w:szCs w:val="19"/>
         </w:rPr>
-        <w:t>6:05 to 6:55 · 50 s · 96 words</w:t>
-      </w:r>
-    </w:p>
-    <w:p>
-      <w:pPr>
-        <w:spacing w:after="160" w:line="320" w:lineRule="auto"/>
-      </w:pPr>
-      <w:r>
-        <w:rPr>
-          <w:sz w:val="25"/>
-          <w:szCs w:val="25"/>
-        </w:rPr>
-        <w:t>With this stronger model, we could finally test the painter rule of step one. To measure it fairly, we scored the same images twice with cross-validation, and changed only one thing: whether the model had seen other paintings by the same painter.</w:t>
+        <w:t>6:20 to 7:15 · 55 s · 116 words</w:t>
+      </w:r>
+    </w:p>
+    <w:p>
+      <w:pPr>
+        <w:spacing w:after="160" w:line="320" w:lineRule="auto"/>
+      </w:pPr>
+      <w:r>
+        <w:rPr>
+          <w:sz w:val="25"/>
+          <w:szCs w:val="25"/>
+        </w:rPr>
+        <w:t>But a model this strong can also learn shortcuts, like recognising a painter's hand instead of a style. So we finally tested the painter rule of step one. To measure it fairly, we scored the same images twice with cross-validation, and changed only one thing: whether the model had seen other paintings by the same painter.</w:t>
       </w:r>
     </w:p>
     <w:p>
@@ -830,7 +890,16 @@
           <w:sz w:val="25"/>
           <w:szCs w:val="25"/>
         </w:rPr>
-        <w:t>So the model partly recognises painters, and a random split would have given the director a score that is too good. Our split protects the result.</w:t>
+        <w:t xml:space="preserve">So the model partly recognises painters, and a random split would have given the director a score that is too good. </w:t>
+      </w:r>
+      <w:r>
+        <w:rPr>
+          <w:b/>
+          <w:bCs/>
+          <w:sz w:val="25"/>
+          <w:szCs w:val="25"/>
+        </w:rPr>
+        <w:t>Our split protects the result: we can trust the final test.</w:t>
       </w:r>
     </w:p>
     <w:p>
@@ -855,19 +924,19 @@
           <w:sz w:val="19"/>
           <w:szCs w:val="19"/>
         </w:rPr>
-        <w:t>6:55 to 7:55 · 60 s · 129 words</w:t>
-      </w:r>
-    </w:p>
-    <w:p>
-      <w:pPr>
-        <w:spacing w:after="160" w:line="320" w:lineRule="auto"/>
-      </w:pPr>
-      <w:r>
-        <w:rPr>
-          <w:sz w:val="25"/>
-          <w:szCs w:val="25"/>
-        </w:rPr>
-        <w:t xml:space="preserve">Step five: the final test. We opened the 220 test paintings once, for every model, including classical models with no neural network, such as a random forest on hand-made colour and texture features. </w:t>
+        <w:t>7:15 to 8:15 · 60 s · 131 words</w:t>
+      </w:r>
+    </w:p>
+    <w:p>
+      <w:pPr>
+        <w:spacing w:after="160" w:line="320" w:lineRule="auto"/>
+      </w:pPr>
+      <w:r>
+        <w:rPr>
+          <w:sz w:val="25"/>
+          <w:szCs w:val="25"/>
+        </w:rPr>
+        <w:t xml:space="preserve">Step five, the final test: the only time we opened the 220 test paintings, once, for every model, including classical models without any neural network. </w:t>
       </w:r>
       <w:r>
         <w:rPr>
@@ -884,7 +953,7 @@
           <w:sz w:val="25"/>
           <w:szCs w:val="25"/>
         </w:rPr>
-        <w:t xml:space="preserve"> The pretrained models are at the top, from 83 to 88 percent. The random forest reaches 67, our MLP 41.</w:t>
+        <w:t xml:space="preserve"> The pretrained models are at the top, from 83 to 88 percent. The best classical model, a random forest on hand-made colour and texture features, reaches 67; our MLP 41.</w:t>
       </w:r>
     </w:p>
     <w:p>
@@ -977,19 +1046,19 @@
           <w:sz w:val="19"/>
           <w:szCs w:val="19"/>
         </w:rPr>
-        <w:t>7:55 to 8:40 · 45 s · 75 words</w:t>
-      </w:r>
-    </w:p>
-    <w:p>
-      <w:pPr>
-        <w:spacing w:after="160" w:line="320" w:lineRule="auto"/>
-      </w:pPr>
-      <w:r>
-        <w:rPr>
-          <w:sz w:val="25"/>
-          <w:szCs w:val="25"/>
-        </w:rPr>
-        <w:t xml:space="preserve">Step six: is it affordable on a kiosk? We timed one photo at a time, from the image to the answer. </w:t>
+        <w:t>8:15 to 8:55 · 40 s · 90 words</w:t>
+      </w:r>
+    </w:p>
+    <w:p>
+      <w:pPr>
+        <w:spacing w:after="160" w:line="320" w:lineRule="auto"/>
+      </w:pPr>
+      <w:r>
+        <w:rPr>
+          <w:sz w:val="25"/>
+          <w:szCs w:val="25"/>
+        </w:rPr>
+        <w:t xml:space="preserve">Accuracy is only half of the director's question; the other half is the cost. So step six: is it affordable on a kiosk? We timed one photo at a time, from the image to the answer. </w:t>
       </w:r>
       <w:r>
         <w:rPr>
@@ -1069,19 +1138,19 @@
           <w:sz w:val="19"/>
           <w:szCs w:val="19"/>
         </w:rPr>
-        <w:t>8:40 to 9:50 · 70 s · 140 words</w:t>
-      </w:r>
-    </w:p>
-    <w:p>
-      <w:pPr>
-        <w:spacing w:after="160" w:line="320" w:lineRule="auto"/>
-      </w:pPr>
-      <w:r>
-        <w:rPr>
-          <w:sz w:val="25"/>
-          <w:szCs w:val="25"/>
-        </w:rPr>
-        <w:t xml:space="preserve">Let's put the six steps together. </w:t>
+        <w:t>8:55 to 10:00 · 65 s · 140 words</w:t>
+      </w:r>
+    </w:p>
+    <w:p>
+      <w:pPr>
+        <w:spacing w:after="160" w:line="320" w:lineRule="auto"/>
+      </w:pPr>
+      <w:r>
+        <w:rPr>
+          <w:sz w:val="25"/>
+          <w:szCs w:val="25"/>
+        </w:rPr>
+        <w:t xml:space="preserve">We can now answer the director. </w:t>
       </w:r>
       <w:r>
         <w:rPr>
@@ -1325,10 +1394,10 @@
 <file path=word/numbering.xml><?xml version="1.0" encoding="utf-8"?>
 <w:numbering xmlns:wpc="http://schemas.microsoft.com/office/word/2010/wordprocessingCanvas" xmlns:cx="http://schemas.microsoft.com/office/drawing/2014/chartex" xmlns:cx1="http://schemas.microsoft.com/office/drawing/2015/9/8/chartex" xmlns:cx2="http://schemas.microsoft.com/office/drawing/2015/10/21/chartex" xmlns:cx3="http://schemas.microsoft.com/office/drawing/2016/5/9/chartex" xmlns:cx4="http://schemas.microsoft.com/office/drawing/2016/5/10/chartex" xmlns:cx5="http://schemas.microsoft.com/office/drawing/2016/5/11/chartex" xmlns:cx6="http://schemas.microsoft.com/office/drawing/2016/5/12/chartex" xmlns:cx7="http://schemas.microsoft.com/office/drawing/2016/5/13/chartex" xmlns:cx8="http://schemas.microsoft.com/office/drawing/2016/5/14/chartex" xmlns:mc="http://schemas.openxmlformats.org/markup-compatibility/2006" xmlns:aink="http://schemas.microsoft.com/office/drawing/2016/ink" xmlns:am3d="http://schemas.microsoft.com/office/drawing/2017/model3d" xmlns:o="urn:schemas-microsoft-com:office:office" xmlns:oel="http://schemas.microsoft.com/office/2019/extlst" xmlns:r="http://schemas.openxmlformats.org/officeDocument/2006/relationships" xmlns:m="http://schemas.openxmlformats.org/officeDocument/2006/math" xmlns:v="urn:schemas-microsoft-com:vml" xmlns:wp14="http://schemas.microsoft.com/office/word/2010/wordprocessingDrawing" xmlns:wp="http://schemas.openxmlformats.org/drawingml/2006/wordprocessingDrawing" xmlns:w10="urn:schemas-microsoft-com:office:word" xmlns:w="http://schemas.openxmlformats.org/wordprocessingml/2006/main" xmlns:w14="http://schemas.microsoft.com/office/word/2010/wordml" xmlns:w15="http://schemas.microsoft.com/office/word/2012/wordml" xmlns:w16cex="http://schemas.microsoft.com/office/word/2018/wordml/cex" xmlns:w16cid="http://schemas.microsoft.com/office/word/2016/wordml/cid" xmlns:w16="http://schemas.microsoft.com/office/word/2018/wordml" xmlns:w16du="http://schemas.microsoft.com/office/word/2023/wordml/word16du" xmlns:w16sdtdh="http://schemas.microsoft.com/office/word/2020/wordml/sdtdatahash" xmlns:w16sdtfl="http://schemas.microsoft.com/office/word/2024/wordml/sdtformatlock" xmlns:w16se="http://schemas.microsoft.com/office/word/2015/wordml/symex" xmlns:wpg="http://schemas.microsoft.com/office/word/2010/wordprocessingGroup" xmlns:wpi="http://schemas.microsoft.com/office/word/2010/wordprocessingInk" xmlns:wne="http://schemas.microsoft.com/office/word/2006/wordml" xmlns:wps="http://schemas.microsoft.com/office/word/2010/wordprocessingShape" mc:Ignorable="w14 w15 w16se w16cid w16 w16cex w16sdtdh w16sdtfl w16du wp14">
   <w:abstractNum w:abstractNumId="0" w15:restartNumberingAfterBreak="0">
-    <w:nsid w:val="0BDD4BBF"/>
+    <w:nsid w:val="79E52A6A"/>
     <w:multiLevelType w:val="hybridMultilevel"/>
-    <w:tmpl w:val="28ACAFD0"/>
-    <w:lvl w:ilvl="0" w:tplc="4FD40E64">
+    <w:tmpl w:val="89C6D4C4"/>
+    <w:lvl w:ilvl="0" w:tplc="E4B0CEF2">
       <w:start w:val="1"/>
       <w:numFmt w:val="bullet"/>
       <w:lvlText w:val="●"/>
@@ -1337,7 +1406,7 @@
         <w:ind w:left="720" w:hanging="360"/>
       </w:pPr>
     </w:lvl>
-    <w:lvl w:ilvl="1" w:tplc="73388E52" w:tentative="1">
+    <w:lvl w:ilvl="1" w:tplc="D380979C" w:tentative="1">
       <w:start w:val="1"/>
       <w:numFmt w:val="bullet"/>
       <w:lvlText w:val="○"/>
@@ -1346,7 +1415,7 @@
         <w:ind w:left="1440" w:hanging="360"/>
       </w:pPr>
     </w:lvl>
-    <w:lvl w:ilvl="2" w:tplc="55540930" w:tentative="1">
+    <w:lvl w:ilvl="2" w:tplc="BB94A0C4" w:tentative="1">
       <w:start w:val="1"/>
       <w:numFmt w:val="bullet"/>
       <w:lvlText w:val="■"/>
@@ -1355,7 +1424,7 @@
         <w:ind w:left="2160" w:hanging="360"/>
       </w:pPr>
     </w:lvl>
-    <w:lvl w:ilvl="3" w:tplc="E3D64CFA" w:tentative="1">
+    <w:lvl w:ilvl="3" w:tplc="0C346740" w:tentative="1">
       <w:start w:val="1"/>
       <w:numFmt w:val="bullet"/>
       <w:lvlText w:val="●"/>
@@ -1364,7 +1433,7 @@
         <w:ind w:left="2880" w:hanging="360"/>
       </w:pPr>
     </w:lvl>
-    <w:lvl w:ilvl="4" w:tplc="87E00F0A" w:tentative="1">
+    <w:lvl w:ilvl="4" w:tplc="692678F0" w:tentative="1">
       <w:start w:val="1"/>
       <w:numFmt w:val="bullet"/>
       <w:lvlText w:val="○"/>
@@ -1373,7 +1442,7 @@
         <w:ind w:left="3600" w:hanging="360"/>
       </w:pPr>
     </w:lvl>
-    <w:lvl w:ilvl="5" w:tplc="5CEAE4D6" w:tentative="1">
+    <w:lvl w:ilvl="5" w:tplc="07B64E98" w:tentative="1">
       <w:start w:val="1"/>
       <w:numFmt w:val="bullet"/>
       <w:lvlText w:val="■"/>
@@ -1382,7 +1451,7 @@
         <w:ind w:left="4320" w:hanging="360"/>
       </w:pPr>
     </w:lvl>
-    <w:lvl w:ilvl="6" w:tplc="A7922C58" w:tentative="1">
+    <w:lvl w:ilvl="6" w:tplc="80F807EA" w:tentative="1">
       <w:start w:val="1"/>
       <w:numFmt w:val="bullet"/>
       <w:lvlText w:val="●"/>
@@ -1391,7 +1460,7 @@
         <w:ind w:left="5040" w:hanging="360"/>
       </w:pPr>
     </w:lvl>
-    <w:lvl w:ilvl="7" w:tplc="9F44A128" w:tentative="1">
+    <w:lvl w:ilvl="7" w:tplc="F6D4B54C" w:tentative="1">
       <w:start w:val="1"/>
       <w:numFmt w:val="bullet"/>
       <w:lvlText w:val="●"/>
@@ -1400,7 +1469,7 @@
         <w:ind w:left="5760" w:hanging="360"/>
       </w:pPr>
     </w:lvl>
-    <w:lvl w:ilvl="8" w:tplc="17CAFF78" w:tentative="1">
+    <w:lvl w:ilvl="8" w:tplc="9CC6ECA8" w:tentative="1">
       <w:start w:val="1"/>
       <w:numFmt w:val="bullet"/>
       <w:lvlText w:val="●"/>
@@ -1410,7 +1479,7 @@
       </w:pPr>
     </w:lvl>
   </w:abstractNum>
-  <w:num w:numId="1" w16cid:durableId="533925318">
+  <w:num w:numId="1" w16cid:durableId="1190100165">
     <w:abstractNumId w:val="0"/>
     <w:lvlOverride w:ilvl="0">
       <w:startOverride w:val="1"/>

</xml_diff>

<commit_message>
Move the training doctor slide to the backups and show the ResNet monitoring in the talk
</commit_message>
<xml_diff>
--- a/presentation/oral_script.docx
+++ b/presentation/oral_script.docx
@@ -51,7 +51,7 @@
           <w:sz w:val="21"/>
           <w:szCs w:val="21"/>
         </w:rPr>
-        <w:t>About 1303 words: at a calm pace (about 130 words per minute), this is about 10 minutes. Without the 111 optional words, about 9 minutes: a safety margin.</w:t>
+        <w:t>About 1201 words: at a calm pace (about 130 words per minute), this is about 9 minutes. Without the 109 optional words, about 8 minutes. The rest of the 10 minutes is a safety margin for pauses, clicks and nerves.</w:t>
       </w:r>
     </w:p>
     <w:p>
@@ -68,7 +68,7 @@
           <w:sz w:val="21"/>
           <w:szCs w:val="21"/>
         </w:rPr>
-        <w:t>Each slide ends with a link to the next one ("so now we try to fix it"). Keep these links even when you are late: they make the six steps one story.</w:t>
+        <w:t>Every slide ends with a green TRANSITION box, always built the same way: "We saw that... So now...". Say it while you click to the next slide, and never skip it, even when you are late: it turns the six steps into one story.</w:t>
       </w:r>
     </w:p>
     <w:p>
@@ -119,7 +119,213 @@
           <w:sz w:val="21"/>
           <w:szCs w:val="21"/>
         </w:rPr>
-        <w:t>If you present with a teammate, a natural split is slides 1 to 6, then slides 7 to 11.</w:t>
+        <w:t>If you present with a teammate, a natural split is slides 1 to 5, then slides 6 to 10.</w:t>
+      </w:r>
+    </w:p>
+    <w:p>
+      <w:pPr>
+        <w:pStyle w:val="Titre2"/>
+      </w:pPr>
+      <w:r>
+        <w:t>The story, transition by transition</w:t>
+      </w:r>
+    </w:p>
+    <w:p>
+      <w:pPr>
+        <w:spacing w:after="60"/>
+      </w:pPr>
+      <w:r>
+        <w:rPr>
+          <w:b/>
+          <w:bCs/>
+          <w:color w:val="1E6B45"/>
+          <w:sz w:val="20"/>
+          <w:szCs w:val="20"/>
+        </w:rPr>
+        <w:t xml:space="preserve">1 to 2:  </w:t>
+      </w:r>
+      <w:r>
+        <w:rPr>
+          <w:sz w:val="20"/>
+          <w:szCs w:val="20"/>
+        </w:rPr>
+        <w:t>To answer it, we did not jump straight to a model. So now, here is our path: six steps.</w:t>
+      </w:r>
+    </w:p>
+    <w:p>
+      <w:pPr>
+        <w:spacing w:after="60"/>
+      </w:pPr>
+      <w:r>
+        <w:rPr>
+          <w:b/>
+          <w:bCs/>
+          <w:color w:val="1E6B45"/>
+          <w:sz w:val="20"/>
+          <w:szCs w:val="20"/>
+        </w:rPr>
+        <w:t xml:space="preserve">2 to 3:  </w:t>
+      </w:r>
+      <w:r>
+        <w:rPr>
+          <w:sz w:val="20"/>
+          <w:szCs w:val="20"/>
+        </w:rPr>
+        <w:t>So now, let's start with step one: the data, and how we made the test fair.</w:t>
+      </w:r>
+    </w:p>
+    <w:p>
+      <w:pPr>
+        <w:spacing w:after="60"/>
+      </w:pPr>
+      <w:r>
+        <w:rPr>
+          <w:b/>
+          <w:bCs/>
+          <w:color w:val="1E6B45"/>
+          <w:sz w:val="20"/>
+          <w:szCs w:val="20"/>
+        </w:rPr>
+        <w:t xml:space="preserve">3 to 4:  </w:t>
+      </w:r>
+      <w:r>
+        <w:rPr>
+          <w:sz w:val="20"/>
+          <w:szCs w:val="20"/>
+        </w:rPr>
+        <w:t>We saw that our data is ready and our test is fair. So now, step two: we can build our first model.</w:t>
+      </w:r>
+    </w:p>
+    <w:p>
+      <w:pPr>
+        <w:spacing w:after="60"/>
+      </w:pPr>
+      <w:r>
+        <w:rPr>
+          <w:b/>
+          <w:bCs/>
+          <w:color w:val="1E6B45"/>
+          <w:sz w:val="20"/>
+          <w:szCs w:val="20"/>
+        </w:rPr>
+        <w:t xml:space="preserve">4 to 5:  </w:t>
+      </w:r>
+      <w:r>
+        <w:rPr>
+          <w:sz w:val="20"/>
+          <w:szCs w:val="20"/>
+        </w:rPr>
+        <w:t>We saw that our MLP is overfitting. So now, step three: we try to fix this overfitting.</w:t>
+      </w:r>
+    </w:p>
+    <w:p>
+      <w:pPr>
+        <w:spacing w:after="60"/>
+      </w:pPr>
+      <w:r>
+        <w:rPr>
+          <w:b/>
+          <w:bCs/>
+          <w:color w:val="1E6B45"/>
+          <w:sz w:val="20"/>
+          <w:szCs w:val="20"/>
+        </w:rPr>
+        <w:t xml:space="preserve">5 to 6:  </w:t>
+      </w:r>
+      <w:r>
+        <w:rPr>
+          <w:sz w:val="20"/>
+          <w:szCs w:val="20"/>
+        </w:rPr>
+        <w:t>We saw that the overfitting is under control. But our MLP still sees colours, not shapes. So now, step four: we need a network that sees shapes.</w:t>
+      </w:r>
+    </w:p>
+    <w:p>
+      <w:pPr>
+        <w:spacing w:after="60"/>
+      </w:pPr>
+      <w:r>
+        <w:rPr>
+          <w:b/>
+          <w:bCs/>
+          <w:color w:val="1E6B45"/>
+          <w:sz w:val="20"/>
+          <w:szCs w:val="20"/>
+        </w:rPr>
+        <w:t xml:space="preserve">6 to 7:  </w:t>
+      </w:r>
+      <w:r>
+        <w:rPr>
+          <w:sz w:val="20"/>
+          <w:szCs w:val="20"/>
+        </w:rPr>
+        <w:t>We saw that ResNet18 reaches 88 percent. But a model this strong could cheat, by recognising the painter instead of the style. So now, we check if it cheats.</w:t>
+      </w:r>
+    </w:p>
+    <w:p>
+      <w:pPr>
+        <w:spacing w:after="60"/>
+      </w:pPr>
+      <w:r>
+        <w:rPr>
+          <w:b/>
+          <w:bCs/>
+          <w:color w:val="1E6B45"/>
+          <w:sz w:val="20"/>
+          <w:szCs w:val="20"/>
+        </w:rPr>
+        <w:t xml:space="preserve">7 to 8:  </w:t>
+      </w:r>
+      <w:r>
+        <w:rPr>
+          <w:sz w:val="20"/>
+          <w:szCs w:val="20"/>
+        </w:rPr>
+        <w:t>We saw that our split stops this cheating: we can trust our test. So now, step five: the final test of every model.</w:t>
+      </w:r>
+    </w:p>
+    <w:p>
+      <w:pPr>
+        <w:spacing w:after="60"/>
+      </w:pPr>
+      <w:r>
+        <w:rPr>
+          <w:b/>
+          <w:bCs/>
+          <w:color w:val="1E6B45"/>
+          <w:sz w:val="20"/>
+          <w:szCs w:val="20"/>
+        </w:rPr>
+        <w:t xml:space="preserve">8 to 9:  </w:t>
+      </w:r>
+      <w:r>
+        <w:rPr>
+          <w:sz w:val="20"/>
+          <w:szCs w:val="20"/>
+        </w:rPr>
+        <w:t>We saw that the pretrained network is the most accurate. But accuracy is only half of the director's question. So now, step six: what does it cost on a kiosk?</w:t>
+      </w:r>
+    </w:p>
+    <w:p>
+      <w:pPr>
+        <w:spacing w:after="60"/>
+      </w:pPr>
+      <w:r>
+        <w:rPr>
+          <w:b/>
+          <w:bCs/>
+          <w:color w:val="1E6B45"/>
+          <w:sz w:val="20"/>
+          <w:szCs w:val="20"/>
+        </w:rPr>
+        <w:t xml:space="preserve">9 to 10:  </w:t>
+      </w:r>
+      <w:r>
+        <w:rPr>
+          <w:sz w:val="20"/>
+          <w:szCs w:val="20"/>
+        </w:rPr>
+        <w:t>We saw that it is accurate, fast and cheap. So now, we have everything we need to answer the director.</w:t>
       </w:r>
     </w:p>
     <w:p>
@@ -144,7 +350,7 @@
           <w:sz w:val="19"/>
           <w:szCs w:val="19"/>
         </w:rPr>
-        <w:t>0:00 to 0:40 · 40 s · 91 words</w:t>
+        <w:t>0:00 to 0:45 · 45 s · 102 words</w:t>
       </w:r>
     </w:p>
     <w:p>
@@ -156,7 +362,7 @@
           <w:sz w:val="25"/>
           <w:szCs w:val="25"/>
         </w:rPr>
-        <w:t>Good morning. Imagine you are in a museum. You point your phone at a painting, and a guide tells you its style and the story of that movement. Our museum wants exactly this, on visitors' phones and on kiosks in the galleries.</w:t>
+        <w:t>Good morning. Imagine you point your phone at a painting in a museum, and a guide tells you its style. Our museum wants exactly this, on visitors' phones and on kiosks in the galleries.</w:t>
       </w:r>
     </w:p>
     <w:p>
@@ -204,6 +410,55 @@
     </w:p>
     <w:p>
       <w:pPr>
+        <w:keepNext/>
+        <w:pBdr>
+          <w:left w:val="single" w:sz="18" w:space="8" w:color="1E6B45"/>
+        </w:pBdr>
+        <w:shd w:val="clear" w:color="auto" w:fill="EAF5EE"/>
+        <w:spacing w:before="60"/>
+        <w:ind w:left="170" w:right="170"/>
+      </w:pPr>
+      <w:r>
+        <w:rPr>
+          <w:b/>
+          <w:bCs/>
+          <w:color w:val="1E6B45"/>
+          <w:sz w:val="17"/>
+          <w:szCs w:val="17"/>
+        </w:rPr>
+        <w:t>TRANSITION TO SLIDE 2</w:t>
+      </w:r>
+    </w:p>
+    <w:p>
+      <w:pPr>
+        <w:pBdr>
+          <w:left w:val="single" w:sz="18" w:space="8" w:color="1E6B45"/>
+        </w:pBdr>
+        <w:shd w:val="clear" w:color="auto" w:fill="EAF5EE"/>
+        <w:spacing w:after="200" w:line="320" w:lineRule="auto"/>
+        <w:ind w:left="170" w:right="170"/>
+      </w:pPr>
+      <w:r>
+        <w:rPr>
+          <w:color w:val="1E6B45"/>
+          <w:sz w:val="25"/>
+          <w:szCs w:val="25"/>
+        </w:rPr>
+        <w:t xml:space="preserve">To answer it, we did not jump straight to a model. </w:t>
+      </w:r>
+      <w:r>
+        <w:rPr>
+          <w:b/>
+          <w:bCs/>
+          <w:color w:val="1E6B45"/>
+          <w:sz w:val="25"/>
+          <w:szCs w:val="25"/>
+        </w:rPr>
+        <w:t>So now, here is our path: six steps.</w:t>
+      </w:r>
+    </w:p>
+    <w:p>
+      <w:pPr>
         <w:pStyle w:val="Titre1"/>
         <w:keepNext/>
       </w:pPr>
@@ -222,20 +477,13 @@
           <w:sz w:val="19"/>
           <w:szCs w:val="19"/>
         </w:rPr>
-        <w:t>0:40 to 1:25 · 45 s · 93 words</w:t>
+        <w:t>0:45 to 1:25 · 40 s · 89 words</w:t>
       </w:r>
     </w:p>
     <w:p>
       <w:pPr>
         <w:spacing w:after="160" w:line="320" w:lineRule="auto"/>
       </w:pPr>
-      <w:r>
-        <w:rPr>
-          <w:sz w:val="25"/>
-          <w:szCs w:val="25"/>
-        </w:rPr>
-        <w:t xml:space="preserve">To answer, we went step by step, and each step told us what to try next. </w:t>
-      </w:r>
       <w:r>
         <w:rPr>
           <w:i/>
@@ -246,6 +494,13 @@
         </w:rPr>
         <w:t>[point at the six steps, one by one]</w:t>
       </w:r>
+      <w:r>
+        <w:rPr>
+          <w:sz w:val="25"/>
+          <w:szCs w:val="25"/>
+        </w:rPr>
+        <w:t xml:space="preserve"> Step one: the data, and a fair test. Step two: our own neural network. Step three: we monitor its training, diagnose what goes wrong and fix it. Step four: a pretrained convolutional network, ResNet18. Step five: a final test of every model, classical models included. Step six: the cost on a kiosk CPU.</w:t>
+      </w:r>
     </w:p>
     <w:p>
       <w:pPr>
@@ -256,13 +511,8 @@
           <w:sz w:val="25"/>
           <w:szCs w:val="25"/>
         </w:rPr>
-        <w:t>Step one: the data, and a fair test. Step two: our own network, a multi-layer perceptron built from PyTorch primitives. Step three: we watched its training from the inside and learned to diagnose failures. Step four: a pretrained convolutional network, ResNet18. Step five: a final test of every model, classical models included. Step six: the cost on a kiosk CPU.</w:t>
-      </w:r>
-    </w:p>
-    <w:p>
-      <w:pPr>
-        <w:spacing w:after="160" w:line="320" w:lineRule="auto"/>
-      </w:pPr>
+        <w:t xml:space="preserve">Each step told us what to try next. </w:t>
+      </w:r>
       <w:r>
         <w:rPr>
           <w:b/>
@@ -272,12 +522,46 @@
         </w:rPr>
         <w:t>At the end of these six steps, we will have our answer.</w:t>
       </w:r>
-      <w:r>
-        <w:rPr>
-          <w:sz w:val="25"/>
-          <w:szCs w:val="25"/>
-        </w:rPr>
-        <w:t xml:space="preserve"> Let's start with the data.</w:t>
+    </w:p>
+    <w:p>
+      <w:pPr>
+        <w:keepNext/>
+        <w:pBdr>
+          <w:left w:val="single" w:sz="18" w:space="8" w:color="1E6B45"/>
+        </w:pBdr>
+        <w:shd w:val="clear" w:color="auto" w:fill="EAF5EE"/>
+        <w:spacing w:before="60"/>
+        <w:ind w:left="170" w:right="170"/>
+      </w:pPr>
+      <w:r>
+        <w:rPr>
+          <w:b/>
+          <w:bCs/>
+          <w:color w:val="1E6B45"/>
+          <w:sz w:val="17"/>
+          <w:szCs w:val="17"/>
+        </w:rPr>
+        <w:t>TRANSITION TO SLIDE 3</w:t>
+      </w:r>
+    </w:p>
+    <w:p>
+      <w:pPr>
+        <w:pBdr>
+          <w:left w:val="single" w:sz="18" w:space="8" w:color="1E6B45"/>
+        </w:pBdr>
+        <w:shd w:val="clear" w:color="auto" w:fill="EAF5EE"/>
+        <w:spacing w:after="200" w:line="320" w:lineRule="auto"/>
+        <w:ind w:left="170" w:right="170"/>
+      </w:pPr>
+      <w:r>
+        <w:rPr>
+          <w:b/>
+          <w:bCs/>
+          <w:color w:val="1E6B45"/>
+          <w:sz w:val="25"/>
+          <w:szCs w:val="25"/>
+        </w:rPr>
+        <w:t>So now, let's start with step one: the data, and how we made the test fair.</w:t>
       </w:r>
     </w:p>
     <w:p>
@@ -302,7 +586,7 @@
           <w:sz w:val="19"/>
           <w:szCs w:val="19"/>
         </w:rPr>
-        <w:t>1:25 to 2:20 · 55 s · 119 words</w:t>
+        <w:t>1:25 to 2:20 · 55 s · 124 words</w:t>
       </w:r>
     </w:p>
     <w:p>
@@ -314,7 +598,7 @@
           <w:sz w:val="25"/>
           <w:szCs w:val="25"/>
         </w:rPr>
-        <w:t xml:space="preserve">Step one: the data. We took 1 500 paintings from WikiArt, 300 per style. </w:t>
+        <w:t xml:space="preserve">We took 1 500 paintings from WikiArt, 300 per style. </w:t>
       </w:r>
       <w:r>
         <w:rPr>
@@ -324,7 +608,7 @@
           <w:sz w:val="25"/>
           <w:szCs w:val="25"/>
         </w:rPr>
-        <w:t>(optional) We used the course script with a fixed seed, so anyone can download exactly the same images.</w:t>
+        <w:t>(optional) We used the course script with a fixed seed: anyone can download the same images.</w:t>
       </w:r>
     </w:p>
     <w:p>
@@ -381,16 +665,56 @@
           <w:sz w:val="25"/>
           <w:szCs w:val="25"/>
         </w:rPr>
-        <w:t xml:space="preserve"> With a random split, 23 of our 32 known painters would be in two piles, and a model could learn to recognise Monet instead of Impressionism. With our split: zero. </w:t>
-      </w:r>
-      <w:r>
-        <w:rPr>
-          <w:b/>
-          <w:bCs/>
-          <w:sz w:val="25"/>
-          <w:szCs w:val="25"/>
-        </w:rPr>
-        <w:t>With fair data in place, we could build our first model.</w:t>
+        <w:t xml:space="preserve"> With a random split, 23 of our 32 known painters would be in two piles, and a model could learn to recognise Monet instead of Impressionism. With our split: zero.</w:t>
+      </w:r>
+    </w:p>
+    <w:p>
+      <w:pPr>
+        <w:keepNext/>
+        <w:pBdr>
+          <w:left w:val="single" w:sz="18" w:space="8" w:color="1E6B45"/>
+        </w:pBdr>
+        <w:shd w:val="clear" w:color="auto" w:fill="EAF5EE"/>
+        <w:spacing w:before="60"/>
+        <w:ind w:left="170" w:right="170"/>
+      </w:pPr>
+      <w:r>
+        <w:rPr>
+          <w:b/>
+          <w:bCs/>
+          <w:color w:val="1E6B45"/>
+          <w:sz w:val="17"/>
+          <w:szCs w:val="17"/>
+        </w:rPr>
+        <w:t>TRANSITION TO SLIDE 4</w:t>
+      </w:r>
+    </w:p>
+    <w:p>
+      <w:pPr>
+        <w:pBdr>
+          <w:left w:val="single" w:sz="18" w:space="8" w:color="1E6B45"/>
+        </w:pBdr>
+        <w:shd w:val="clear" w:color="auto" w:fill="EAF5EE"/>
+        <w:spacing w:after="200" w:line="320" w:lineRule="auto"/>
+        <w:ind w:left="170" w:right="170"/>
+      </w:pPr>
+      <w:r>
+        <w:rPr>
+          <w:color w:val="1E6B45"/>
+          <w:sz w:val="25"/>
+          <w:szCs w:val="25"/>
+        </w:rPr>
+        <w:t xml:space="preserve">We saw that our data is ready and our test is fair. </w:t>
+      </w:r>
+      <w:r>
+        <w:rPr>
+          <w:b/>
+          <w:bCs/>
+          <w:color w:val="1E6B45"/>
+          <w:sz w:val="25"/>
+          <w:szCs w:val="25"/>
+        </w:rPr>
+        <w:t>So now, step two: we can build our first model.</w:t>
       </w:r>
     </w:p>
     <w:p>
@@ -413,7 +737,7 @@
           <w:sz w:val="19"/>
           <w:szCs w:val="19"/>
         </w:rPr>
-        <w:t>2:20 to 3:20 · 60 s · 135 words</w:t>
+        <w:t>2:20 to 3:25 · 65 s · 146 words</w:t>
       </w:r>
     </w:p>
     <w:p>
@@ -425,7 +749,17 @@
           <w:sz w:val="25"/>
           <w:szCs w:val="25"/>
         </w:rPr>
-        <w:t>Step two. We started with the simplest neural network of the course: a multi-layer perceptron built from nn.Linear layers and ReLU, with our own training loop. It reads the pixels of a 64 by 64 image: 12 288 inputs and 6.4 million parameters.</w:t>
+        <w:t xml:space="preserve">Our first model is the simplest neural network of the course: a multi-layer perceptron built from nn.Linear layers and ReLU. </w:t>
+      </w:r>
+      <w:r>
+        <w:rPr>
+          <w:i/>
+          <w:iCs/>
+          <w:color w:val="8A8F9C"/>
+          <w:sz w:val="25"/>
+          <w:szCs w:val="25"/>
+        </w:rPr>
+        <w:t>(optional) It reads the pixels of a 64 by 64 image: 12 288 inputs and 6.4 million parameters.</w:t>
       </w:r>
     </w:p>
     <w:p>
@@ -497,6 +831,55 @@
     </w:p>
     <w:p>
       <w:pPr>
+        <w:keepNext/>
+        <w:pBdr>
+          <w:left w:val="single" w:sz="18" w:space="8" w:color="1E6B45"/>
+        </w:pBdr>
+        <w:shd w:val="clear" w:color="auto" w:fill="EAF5EE"/>
+        <w:spacing w:before="60"/>
+        <w:ind w:left="170" w:right="170"/>
+      </w:pPr>
+      <w:r>
+        <w:rPr>
+          <w:b/>
+          <w:bCs/>
+          <w:color w:val="1E6B45"/>
+          <w:sz w:val="17"/>
+          <w:szCs w:val="17"/>
+        </w:rPr>
+        <w:t>TRANSITION TO SLIDE 5</w:t>
+      </w:r>
+    </w:p>
+    <w:p>
+      <w:pPr>
+        <w:pBdr>
+          <w:left w:val="single" w:sz="18" w:space="8" w:color="1E6B45"/>
+        </w:pBdr>
+        <w:shd w:val="clear" w:color="auto" w:fill="EAF5EE"/>
+        <w:spacing w:after="200" w:line="320" w:lineRule="auto"/>
+        <w:ind w:left="170" w:right="170"/>
+      </w:pPr>
+      <w:r>
+        <w:rPr>
+          <w:color w:val="1E6B45"/>
+          <w:sz w:val="25"/>
+          <w:szCs w:val="25"/>
+        </w:rPr>
+        <w:t xml:space="preserve">We saw that our MLP is overfitting. </w:t>
+      </w:r>
+      <w:r>
+        <w:rPr>
+          <w:b/>
+          <w:bCs/>
+          <w:color w:val="1E6B45"/>
+          <w:sz w:val="25"/>
+          <w:szCs w:val="25"/>
+        </w:rPr>
+        <w:t>So now, step three: we try to fix this overfitting.</w:t>
+      </w:r>
+    </w:p>
+    <w:p>
+      <w:pPr>
         <w:pStyle w:val="Titre1"/>
         <w:keepNext/>
         <w:pageBreakBefore/>
@@ -517,7 +900,7 @@
           <w:sz w:val="19"/>
           <w:szCs w:val="19"/>
         </w:rPr>
-        <w:t>3:20 to 4:25 · 65 s · 136 words</w:t>
+        <w:t>3:25 to 4:25 · 60 s · 135 words</w:t>
       </w:r>
     </w:p>
     <w:p>
@@ -529,17 +912,7 @@
           <w:sz w:val="25"/>
           <w:szCs w:val="25"/>
         </w:rPr>
-        <w:t xml:space="preserve">Step three. Our MLP overfits, so we wanted to fix it. But first, we looked inside the network to check that the training itself was healthy: the gradient reaches every layer and only 4 percent of the neurons are dead. So the problem really is overfitting. </w:t>
-      </w:r>
-      <w:r>
-        <w:rPr>
-          <w:i/>
-          <w:iCs/>
-          <w:color w:val="8A8F9C"/>
-          <w:sz w:val="25"/>
-          <w:szCs w:val="25"/>
-        </w:rPr>
-        <w:t>(optional) We also tried 8 learning rates and kept 0.0001.</w:t>
+        <w:t>Before fixing it, we looked inside the network to check that the training itself was healthy: the gradient reaches every layer and only 4 percent of the neurons are dead. So the problem really is overfitting.</w:t>
       </w:r>
     </w:p>
     <w:p>
@@ -551,7 +924,7 @@
           <w:sz w:val="25"/>
           <w:szCs w:val="25"/>
         </w:rPr>
-        <w:t xml:space="preserve">So we attacked it with the tools of session 6, 3 seeds each. </w:t>
+        <w:t xml:space="preserve">Then we attacked the overfitting with the tools of session 6, 3 seeds each. </w:t>
       </w:r>
       <w:r>
         <w:rPr>
@@ -580,7 +953,7 @@
           <w:sz w:val="25"/>
           <w:szCs w:val="25"/>
         </w:rPr>
-        <w:t xml:space="preserve">Overfitting is under control. But one number shows a deeper limit: </w:t>
+        <w:t xml:space="preserve">But one number shows a deeper limit: </w:t>
       </w:r>
       <w:r>
         <w:rPr>
@@ -591,12 +964,54 @@
         </w:rPr>
         <w:t>the MLP finds only 7 percent of the Cubist paintings. It sees colours, not shapes.</w:t>
       </w:r>
-      <w:r>
-        <w:rPr>
-          <w:sz w:val="25"/>
-          <w:szCs w:val="25"/>
-        </w:rPr>
-        <w:t xml:space="preserve"> This will decide our next model.</w:t>
+    </w:p>
+    <w:p>
+      <w:pPr>
+        <w:keepNext/>
+        <w:pBdr>
+          <w:left w:val="single" w:sz="18" w:space="8" w:color="1E6B45"/>
+        </w:pBdr>
+        <w:shd w:val="clear" w:color="auto" w:fill="EAF5EE"/>
+        <w:spacing w:before="60"/>
+        <w:ind w:left="170" w:right="170"/>
+      </w:pPr>
+      <w:r>
+        <w:rPr>
+          <w:b/>
+          <w:bCs/>
+          <w:color w:val="1E6B45"/>
+          <w:sz w:val="17"/>
+          <w:szCs w:val="17"/>
+        </w:rPr>
+        <w:t>TRANSITION TO SLIDE 6</w:t>
+      </w:r>
+    </w:p>
+    <w:p>
+      <w:pPr>
+        <w:pBdr>
+          <w:left w:val="single" w:sz="18" w:space="8" w:color="1E6B45"/>
+        </w:pBdr>
+        <w:shd w:val="clear" w:color="auto" w:fill="EAF5EE"/>
+        <w:spacing w:after="200" w:line="320" w:lineRule="auto"/>
+        <w:ind w:left="170" w:right="170"/>
+      </w:pPr>
+      <w:r>
+        <w:rPr>
+          <w:color w:val="1E6B45"/>
+          <w:sz w:val="25"/>
+          <w:szCs w:val="25"/>
+        </w:rPr>
+        <w:t xml:space="preserve">We saw that the overfitting is under control. But our MLP still sees colours, not shapes. </w:t>
+      </w:r>
+      <w:r>
+        <w:rPr>
+          <w:b/>
+          <w:bCs/>
+          <w:color w:val="1E6B45"/>
+          <w:sz w:val="25"/>
+          <w:szCs w:val="25"/>
+        </w:rPr>
+        <w:t>So now, step four: we need a network that sees shapes.</w:t>
       </w:r>
     </w:p>
     <w:p>
@@ -605,7 +1020,7 @@
         <w:keepNext/>
       </w:pPr>
       <w:r>
-        <w:t>Slide 6 · Four broken runs, four signatures</w:t>
+        <w:t>Slide 6 · A pretrained ResNet18 sees shapes</w:t>
       </w:r>
     </w:p>
     <w:p>
@@ -619,7 +1034,7 @@
           <w:sz w:val="19"/>
           <w:szCs w:val="19"/>
         </w:rPr>
-        <w:t>4:25 to 5:20 · 55 s · 123 words</w:t>
+        <w:t>4:25 to 5:30 · 65 s · 140 words</w:t>
       </w:r>
     </w:p>
     <w:p>
@@ -631,7 +1046,19 @@
           <w:sz w:val="25"/>
           <w:szCs w:val="25"/>
         </w:rPr>
-        <w:t xml:space="preserve">But overfitting is not the only way a training can go wrong. To be ready for other failures, we broke the training four times on purpose, and diagnosed each run. </w:t>
+        <w:t>A convolutional network sees shapes. But with only 1 061 images, we cannot train one from zero. So we reuse ResNet18, already trained on 1.2 million ImageNet photos.</w:t>
+      </w:r>
+    </w:p>
+    <w:p>
+      <w:pPr>
+        <w:spacing w:after="160" w:line="320" w:lineRule="auto"/>
+      </w:pPr>
+      <w:r>
+        <w:rPr>
+          <w:sz w:val="25"/>
+          <w:szCs w:val="25"/>
+        </w:rPr>
+        <w:t xml:space="preserve">We freeze it: each painting becomes 512 numbers, and we train only one linear layer, 2 565 weights, in less than a second. </w:t>
       </w:r>
       <w:r>
         <w:rPr>
@@ -641,19 +1068,30 @@
           <w:sz w:val="21"/>
           <w:szCs w:val="21"/>
         </w:rPr>
-        <w:t>[point at the table, row by row]</w:t>
-      </w:r>
-    </w:p>
-    <w:p>
-      <w:pPr>
-        <w:spacing w:after="160" w:line="320" w:lineRule="auto"/>
-      </w:pPr>
-      <w:r>
-        <w:rPr>
-          <w:sz w:val="25"/>
-          <w:szCs w:val="25"/>
-        </w:rPr>
-        <w:t>A learning rate 100 times too big killed 99.6 percent of the neurons of layer 2. A forgotten zero_grad made the gradients pile up: 26 times bigger after two epochs. Raw pixels, without standardisation, gave a first loss of 16 instead of 1.6. And eight sigmoid layers gave a vanishing gradient: the first layer got a millionth of the gradient of the last.</w:t>
+        <w:t>[point at the blue bar]</w:t>
+      </w:r>
+      <w:r>
+        <w:rPr>
+          <w:sz w:val="25"/>
+          <w:szCs w:val="25"/>
+        </w:rPr>
+        <w:t xml:space="preserve"> </w:t>
+      </w:r>
+      <w:r>
+        <w:rPr>
+          <w:b/>
+          <w:bCs/>
+          <w:sz w:val="25"/>
+          <w:szCs w:val="25"/>
+        </w:rPr>
+        <w:t>Result: 88.1 percent on validation, almost twice our best MLP.</w:t>
+      </w:r>
+      <w:r>
+        <w:rPr>
+          <w:sz w:val="25"/>
+          <w:szCs w:val="25"/>
+        </w:rPr>
+        <w:t xml:space="preserve"> We also fine-tuned the last block: 8.4 million weights for 1 061 images. It overfits: 85.4 percent.</w:t>
       </w:r>
     </w:p>
     <w:p>
@@ -668,23 +1106,72 @@
           <w:sz w:val="21"/>
           <w:szCs w:val="21"/>
         </w:rPr>
-        <w:t>[point at the lesson]</w:t>
-      </w:r>
-      <w:r>
-        <w:rPr>
-          <w:sz w:val="25"/>
-          <w:szCs w:val="25"/>
-        </w:rPr>
-        <w:t xml:space="preserve"> The lesson: </w:t>
-      </w:r>
-      <w:r>
-        <w:rPr>
-          <w:b/>
-          <w:bCs/>
-          <w:sz w:val="25"/>
-          <w:szCs w:val="25"/>
-        </w:rPr>
-        <w:t>two of these bugs show the same symptom, a loss stuck at ln 5. Only the monitoring, dead neurons or the gradient per layer, can tell them apart.</w:t>
+        <w:t>[point at the bottom card]</w:t>
+      </w:r>
+      <w:r>
+        <w:rPr>
+          <w:sz w:val="25"/>
+          <w:szCs w:val="25"/>
+        </w:rPr>
+        <w:t xml:space="preserve"> We monitored it like the MLP, with train and validation curves: the gap between them is only 0.09, against 0.61 for our first MLP. </w:t>
+      </w:r>
+      <w:r>
+        <w:rPr>
+          <w:b/>
+          <w:bCs/>
+          <w:sz w:val="25"/>
+          <w:szCs w:val="25"/>
+        </w:rPr>
+        <w:t>It learns the styles, not the paintings by heart.</w:t>
+      </w:r>
+    </w:p>
+    <w:p>
+      <w:pPr>
+        <w:keepNext/>
+        <w:pBdr>
+          <w:left w:val="single" w:sz="18" w:space="8" w:color="1E6B45"/>
+        </w:pBdr>
+        <w:shd w:val="clear" w:color="auto" w:fill="EAF5EE"/>
+        <w:spacing w:before="60"/>
+        <w:ind w:left="170" w:right="170"/>
+      </w:pPr>
+      <w:r>
+        <w:rPr>
+          <w:b/>
+          <w:bCs/>
+          <w:color w:val="1E6B45"/>
+          <w:sz w:val="17"/>
+          <w:szCs w:val="17"/>
+        </w:rPr>
+        <w:t>TRANSITION TO SLIDE 7</w:t>
+      </w:r>
+    </w:p>
+    <w:p>
+      <w:pPr>
+        <w:pBdr>
+          <w:left w:val="single" w:sz="18" w:space="8" w:color="1E6B45"/>
+        </w:pBdr>
+        <w:shd w:val="clear" w:color="auto" w:fill="EAF5EE"/>
+        <w:spacing w:after="200" w:line="320" w:lineRule="auto"/>
+        <w:ind w:left="170" w:right="170"/>
+      </w:pPr>
+      <w:r>
+        <w:rPr>
+          <w:color w:val="1E6B45"/>
+          <w:sz w:val="25"/>
+          <w:szCs w:val="25"/>
+        </w:rPr>
+        <w:t xml:space="preserve">We saw that ResNet18 reaches 88 percent. But a model this strong could cheat, by recognising the painter instead of the style. </w:t>
+      </w:r>
+      <w:r>
+        <w:rPr>
+          <w:b/>
+          <w:bCs/>
+          <w:color w:val="1E6B45"/>
+          <w:sz w:val="25"/>
+          <w:szCs w:val="25"/>
+        </w:rPr>
+        <w:t>So now, we check if it cheats.</w:t>
       </w:r>
     </w:p>
     <w:p>
@@ -695,7 +1182,7 @@
       </w:pPr>
       <w:r>
         <w:lastRenderedPageBreak/>
-        <w:t>Slide 7 · A pretrained ResNet18 sees shapes</w:t>
+        <w:t>Slide 7 · Seeing the painter inflates the score</w:t>
       </w:r>
     </w:p>
     <w:p>
@@ -709,7 +1196,7 @@
           <w:sz w:val="19"/>
           <w:szCs w:val="19"/>
         </w:rPr>
-        <w:t>5:20 to 6:20 · 60 s · 129 words</w:t>
+        <w:t>5:30 to 6:20 · 50 s · 106 words</w:t>
       </w:r>
     </w:p>
     <w:p>
@@ -721,20 +1208,13 @@
           <w:sz w:val="25"/>
           <w:szCs w:val="25"/>
         </w:rPr>
-        <w:t>With a training we can now trust, step four goes back to the deeper limit: our MLP sees colours, not shapes. To see shapes, we need a convolutional network. With only 1 061 images we cannot train one from zero, so we reuse ResNet18, already trained on 1.2 million ImageNet photos.</w:t>
+        <w:t>Remember the painter rule of step one. To measure its effect, we scored the same images twice with cross-validation, and changed only one thing: whether the model had seen other paintings by the same painter.</w:t>
       </w:r>
     </w:p>
     <w:p>
       <w:pPr>
         <w:spacing w:after="160" w:line="320" w:lineRule="auto"/>
       </w:pPr>
-      <w:r>
-        <w:rPr>
-          <w:sz w:val="25"/>
-          <w:szCs w:val="25"/>
-        </w:rPr>
-        <w:t xml:space="preserve">We freeze it: each painting becomes 512 numbers, and we train only one linear layer, 2 565 weights, in less than a second. </w:t>
-      </w:r>
       <w:r>
         <w:rPr>
           <w:i/>
@@ -743,7 +1223,23 @@
           <w:sz w:val="21"/>
           <w:szCs w:val="21"/>
         </w:rPr>
-        <w:t>[point at the blue bar]</w:t>
+        <w:t>[point at the left bars]</w:t>
+      </w:r>
+      <w:r>
+        <w:rPr>
+          <w:sz w:val="25"/>
+          <w:szCs w:val="25"/>
+        </w:rPr>
+        <w:t xml:space="preserve"> On images by known painters: 83.7 percent when the painter was seen, 72.3 when not. </w:t>
+      </w:r>
+      <w:r>
+        <w:rPr>
+          <w:b/>
+          <w:bCs/>
+          <w:sz w:val="25"/>
+          <w:szCs w:val="25"/>
+        </w:rPr>
+        <w:t>11 points of flattery.</w:t>
       </w:r>
       <w:r>
         <w:rPr>
@@ -752,84 +1248,6 @@
         </w:rPr>
         <w:t xml:space="preserve"> </w:t>
       </w:r>
-      <w:r>
-        <w:rPr>
-          <w:b/>
-          <w:bCs/>
-          <w:sz w:val="25"/>
-          <w:szCs w:val="25"/>
-        </w:rPr>
-        <w:t>Result: 88.1 percent on validation, almost twice our best MLP.</w:t>
-      </w:r>
-      <w:r>
-        <w:rPr>
-          <w:sz w:val="25"/>
-          <w:szCs w:val="25"/>
-        </w:rPr>
-        <w:t xml:space="preserve"> We also fine-tuned the last block: 8.4 million weights for 1 061 images. It overfits: 85.4 percent.</w:t>
-      </w:r>
-    </w:p>
-    <w:p>
-      <w:pPr>
-        <w:spacing w:after="160" w:line="320" w:lineRule="auto"/>
-      </w:pPr>
-      <w:r>
-        <w:rPr>
-          <w:sz w:val="25"/>
-          <w:szCs w:val="25"/>
-        </w:rPr>
-        <w:t xml:space="preserve">And we measured two silent bugs: forgetting model.eval() drops the score to 12.8 percent, and forgetting the ImageNet normalisation costs 6 points. </w:t>
-      </w:r>
-      <w:r>
-        <w:rPr>
-          <w:i/>
-          <w:iCs/>
-          <w:color w:val="8A8F9C"/>
-          <w:sz w:val="25"/>
-          <w:szCs w:val="25"/>
-        </w:rPr>
-        <w:t>(optional) Nothing crashes: only measuring shows them.</w:t>
-      </w:r>
-    </w:p>
-    <w:p>
-      <w:pPr>
-        <w:pStyle w:val="Titre1"/>
-        <w:keepNext/>
-      </w:pPr>
-      <w:r>
-        <w:t>Slide 8 · Seeing the painter inflates the score</w:t>
-      </w:r>
-    </w:p>
-    <w:p>
-      <w:pPr>
-        <w:keepNext/>
-        <w:spacing w:after="160"/>
-      </w:pPr>
-      <w:r>
-        <w:rPr>
-          <w:color w:val="5F6473"/>
-          <w:sz w:val="19"/>
-          <w:szCs w:val="19"/>
-        </w:rPr>
-        <w:t>6:20 to 7:15 · 55 s · 116 words</w:t>
-      </w:r>
-    </w:p>
-    <w:p>
-      <w:pPr>
-        <w:spacing w:after="160" w:line="320" w:lineRule="auto"/>
-      </w:pPr>
-      <w:r>
-        <w:rPr>
-          <w:sz w:val="25"/>
-          <w:szCs w:val="25"/>
-        </w:rPr>
-        <w:t>But a model this strong can also learn shortcuts, like recognising a painter's hand instead of a style. So we finally tested the painter rule of step one. To measure it fairly, we scored the same images twice with cross-validation, and changed only one thing: whether the model had seen other paintings by the same painter.</w:t>
-      </w:r>
-    </w:p>
-    <w:p>
-      <w:pPr>
-        <w:spacing w:after="160" w:line="320" w:lineRule="auto"/>
-      </w:pPr>
       <w:r>
         <w:rPr>
           <w:i/>
@@ -838,30 +1256,110 @@
           <w:sz w:val="21"/>
           <w:szCs w:val="21"/>
         </w:rPr>
-        <w:t>[point at the left bars]</w:t>
-      </w:r>
-      <w:r>
-        <w:rPr>
-          <w:sz w:val="25"/>
-          <w:szCs w:val="25"/>
-        </w:rPr>
-        <w:t xml:space="preserve"> On images by known painters: 83.7 percent when the painter was seen, 72.3 when not. </w:t>
-      </w:r>
-      <w:r>
-        <w:rPr>
-          <w:b/>
-          <w:bCs/>
-          <w:sz w:val="25"/>
-          <w:szCs w:val="25"/>
-        </w:rPr>
-        <w:t>11 points of flattery.</w:t>
-      </w:r>
-      <w:r>
-        <w:rPr>
-          <w:sz w:val="25"/>
-          <w:szCs w:val="25"/>
-        </w:rPr>
-        <w:t xml:space="preserve"> </w:t>
+        <w:t>[point at the right bars]</w:t>
+      </w:r>
+      <w:r>
+        <w:rPr>
+          <w:sz w:val="25"/>
+          <w:szCs w:val="25"/>
+        </w:rPr>
+        <w:t xml:space="preserve"> On the control group, the unknown painters, nothing changes.</w:t>
+      </w:r>
+    </w:p>
+    <w:p>
+      <w:pPr>
+        <w:spacing w:after="160" w:line="320" w:lineRule="auto"/>
+      </w:pPr>
+      <w:r>
+        <w:rPr>
+          <w:sz w:val="25"/>
+          <w:szCs w:val="25"/>
+        </w:rPr>
+        <w:t>So the model partly recognises painters: a random split would have given the director a score that is too good.</w:t>
+      </w:r>
+    </w:p>
+    <w:p>
+      <w:pPr>
+        <w:keepNext/>
+        <w:pBdr>
+          <w:left w:val="single" w:sz="18" w:space="8" w:color="1E6B45"/>
+        </w:pBdr>
+        <w:shd w:val="clear" w:color="auto" w:fill="EAF5EE"/>
+        <w:spacing w:before="60"/>
+        <w:ind w:left="170" w:right="170"/>
+      </w:pPr>
+      <w:r>
+        <w:rPr>
+          <w:b/>
+          <w:bCs/>
+          <w:color w:val="1E6B45"/>
+          <w:sz w:val="17"/>
+          <w:szCs w:val="17"/>
+        </w:rPr>
+        <w:t>TRANSITION TO SLIDE 8</w:t>
+      </w:r>
+    </w:p>
+    <w:p>
+      <w:pPr>
+        <w:pBdr>
+          <w:left w:val="single" w:sz="18" w:space="8" w:color="1E6B45"/>
+        </w:pBdr>
+        <w:shd w:val="clear" w:color="auto" w:fill="EAF5EE"/>
+        <w:spacing w:after="200" w:line="320" w:lineRule="auto"/>
+        <w:ind w:left="170" w:right="170"/>
+      </w:pPr>
+      <w:r>
+        <w:rPr>
+          <w:color w:val="1E6B45"/>
+          <w:sz w:val="25"/>
+          <w:szCs w:val="25"/>
+        </w:rPr>
+        <w:t xml:space="preserve">We saw that our split stops this cheating: we can trust our test. </w:t>
+      </w:r>
+      <w:r>
+        <w:rPr>
+          <w:b/>
+          <w:bCs/>
+          <w:color w:val="1E6B45"/>
+          <w:sz w:val="25"/>
+          <w:szCs w:val="25"/>
+        </w:rPr>
+        <w:t>So now, step five: the final test of every model.</w:t>
+      </w:r>
+    </w:p>
+    <w:p>
+      <w:pPr>
+        <w:pStyle w:val="Titre1"/>
+        <w:keepNext/>
+      </w:pPr>
+      <w:r>
+        <w:t>Slide 8 · Final test: the pretrained network wins</w:t>
+      </w:r>
+    </w:p>
+    <w:p>
+      <w:pPr>
+        <w:keepNext/>
+        <w:spacing w:after="160"/>
+      </w:pPr>
+      <w:r>
+        <w:rPr>
+          <w:color w:val="5F6473"/>
+          <w:sz w:val="19"/>
+          <w:szCs w:val="19"/>
+        </w:rPr>
+        <w:t>6:20 to 7:25 · 65 s · 145 words</w:t>
+      </w:r>
+    </w:p>
+    <w:p>
+      <w:pPr>
+        <w:spacing w:after="160" w:line="320" w:lineRule="auto"/>
+      </w:pPr>
+      <w:r>
+        <w:rPr>
+          <w:sz w:val="25"/>
+          <w:szCs w:val="25"/>
+        </w:rPr>
+        <w:t xml:space="preserve">We opened the 220 test paintings only once, for every model, classical models included. </w:t>
       </w:r>
       <w:r>
         <w:rPr>
@@ -871,14 +1369,14 @@
           <w:sz w:val="21"/>
           <w:szCs w:val="21"/>
         </w:rPr>
-        <w:t>[point at the right bars]</w:t>
-      </w:r>
-      <w:r>
-        <w:rPr>
-          <w:sz w:val="25"/>
-          <w:szCs w:val="25"/>
-        </w:rPr>
-        <w:t xml:space="preserve"> On the control group, the unknown painters, nothing changes.</w:t>
+        <w:t>[point at the top bars]</w:t>
+      </w:r>
+      <w:r>
+        <w:rPr>
+          <w:sz w:val="25"/>
+          <w:szCs w:val="25"/>
+        </w:rPr>
+        <w:t xml:space="preserve"> The pretrained models are at the top, from 83 to 88 percent. The best classical model, a random forest on hand-made colour and texture features, reaches 67; our MLP 41.</w:t>
       </w:r>
     </w:p>
     <w:p>
@@ -890,53 +1388,7 @@
           <w:sz w:val="25"/>
           <w:szCs w:val="25"/>
         </w:rPr>
-        <w:t xml:space="preserve">So the model partly recognises painters, and a random split would have given the director a score that is too good. </w:t>
-      </w:r>
-      <w:r>
-        <w:rPr>
-          <w:b/>
-          <w:bCs/>
-          <w:sz w:val="25"/>
-          <w:szCs w:val="25"/>
-        </w:rPr>
-        <w:t>Our split protects the result: we can trust the final test.</w:t>
-      </w:r>
-    </w:p>
-    <w:p>
-      <w:pPr>
-        <w:pStyle w:val="Titre1"/>
-        <w:keepNext/>
-        <w:pageBreakBefore/>
-      </w:pPr>
-      <w:r>
-        <w:lastRenderedPageBreak/>
-        <w:t>Slide 9 · Final test: the pretrained network wins</w:t>
-      </w:r>
-    </w:p>
-    <w:p>
-      <w:pPr>
-        <w:keepNext/>
-        <w:spacing w:after="160"/>
-      </w:pPr>
-      <w:r>
-        <w:rPr>
-          <w:color w:val="5F6473"/>
-          <w:sz w:val="19"/>
-          <w:szCs w:val="19"/>
-        </w:rPr>
-        <w:t>7:15 to 8:15 · 60 s · 131 words</w:t>
-      </w:r>
-    </w:p>
-    <w:p>
-      <w:pPr>
-        <w:spacing w:after="160" w:line="320" w:lineRule="auto"/>
-      </w:pPr>
-      <w:r>
-        <w:rPr>
-          <w:sz w:val="25"/>
-          <w:szCs w:val="25"/>
-        </w:rPr>
-        <w:t xml:space="preserve">Step five, the final test: the only time we opened the 220 test paintings, once, for every model, including classical models without any neural network. </w:t>
+        <w:t xml:space="preserve">Is the gap real? </w:t>
       </w:r>
       <w:r>
         <w:rPr>
@@ -946,27 +1398,29 @@
           <w:sz w:val="21"/>
           <w:szCs w:val="21"/>
         </w:rPr>
-        <w:t>[point at the top bars]</w:t>
-      </w:r>
-      <w:r>
-        <w:rPr>
-          <w:sz w:val="25"/>
-          <w:szCs w:val="25"/>
-        </w:rPr>
-        <w:t xml:space="preserve"> The pretrained models are at the top, from 83 to 88 percent. The best classical model, a random forest on hand-made colour and texture features, reaches 67; our MLP 41.</w:t>
+        <w:t>[point at the blue card]</w:t>
+      </w:r>
+      <w:r>
+        <w:rPr>
+          <w:sz w:val="25"/>
+          <w:szCs w:val="25"/>
+        </w:rPr>
+        <w:t xml:space="preserve"> A paired bootstrap on the same test paintings gives our model a lead of </w:t>
+      </w:r>
+      <w:r>
+        <w:rPr>
+          <w:b/>
+          <w:bCs/>
+          <w:sz w:val="25"/>
+          <w:szCs w:val="25"/>
+        </w:rPr>
+        <w:t>16.4 points over the random forest, between 9 and 24 points: it is not luck.</w:t>
       </w:r>
     </w:p>
     <w:p>
       <w:pPr>
         <w:spacing w:after="160" w:line="320" w:lineRule="auto"/>
       </w:pPr>
-      <w:r>
-        <w:rPr>
-          <w:sz w:val="25"/>
-          <w:szCs w:val="25"/>
-        </w:rPr>
-        <w:t xml:space="preserve">Is the gap real? </w:t>
-      </w:r>
       <w:r>
         <w:rPr>
           <w:i/>
@@ -975,29 +1429,111 @@
           <w:sz w:val="21"/>
           <w:szCs w:val="21"/>
         </w:rPr>
-        <w:t>[point at the blue card]</w:t>
-      </w:r>
-      <w:r>
-        <w:rPr>
-          <w:sz w:val="25"/>
-          <w:szCs w:val="25"/>
-        </w:rPr>
-        <w:t xml:space="preserve"> A paired bootstrap, 5 000 redraws of the same test paintings, gives our model a lead of </w:t>
-      </w:r>
-      <w:r>
-        <w:rPr>
-          <w:b/>
-          <w:bCs/>
-          <w:sz w:val="25"/>
-          <w:szCs w:val="25"/>
-        </w:rPr>
-        <w:t>16.4 points over the random forest, between 9 and 24 points: it is not luck.</w:t>
+        <w:t>[point at the grey card]</w:t>
+      </w:r>
+      <w:r>
+        <w:rPr>
+          <w:sz w:val="25"/>
+          <w:szCs w:val="25"/>
+        </w:rPr>
+        <w:t xml:space="preserve"> </w:t>
+      </w:r>
+      <w:r>
+        <w:rPr>
+          <w:i/>
+          <w:iCs/>
+          <w:color w:val="8A8F9C"/>
+          <w:sz w:val="25"/>
+          <w:szCs w:val="25"/>
+        </w:rPr>
+        <w:t>(optional) One honest note: the fine-tuned model is first on the test, but it was second on validation. With 220 images, a score moves by about 5 points by chance, so we keep the model chosen before the test.</w:t>
+      </w:r>
+    </w:p>
+    <w:p>
+      <w:pPr>
+        <w:keepNext/>
+        <w:pBdr>
+          <w:left w:val="single" w:sz="18" w:space="8" w:color="1E6B45"/>
+        </w:pBdr>
+        <w:shd w:val="clear" w:color="auto" w:fill="EAF5EE"/>
+        <w:spacing w:before="60"/>
+        <w:ind w:left="170" w:right="170"/>
+      </w:pPr>
+      <w:r>
+        <w:rPr>
+          <w:b/>
+          <w:bCs/>
+          <w:color w:val="1E6B45"/>
+          <w:sz w:val="17"/>
+          <w:szCs w:val="17"/>
+        </w:rPr>
+        <w:t>TRANSITION TO SLIDE 9</w:t>
+      </w:r>
+    </w:p>
+    <w:p>
+      <w:pPr>
+        <w:pBdr>
+          <w:left w:val="single" w:sz="18" w:space="8" w:color="1E6B45"/>
+        </w:pBdr>
+        <w:shd w:val="clear" w:color="auto" w:fill="EAF5EE"/>
+        <w:spacing w:after="200" w:line="320" w:lineRule="auto"/>
+        <w:ind w:left="170" w:right="170"/>
+      </w:pPr>
+      <w:r>
+        <w:rPr>
+          <w:color w:val="1E6B45"/>
+          <w:sz w:val="25"/>
+          <w:szCs w:val="25"/>
+        </w:rPr>
+        <w:t xml:space="preserve">We saw that the pretrained network is the most accurate. But accuracy is only half of the director's question. </w:t>
+      </w:r>
+      <w:r>
+        <w:rPr>
+          <w:b/>
+          <w:bCs/>
+          <w:color w:val="1E6B45"/>
+          <w:sz w:val="25"/>
+          <w:szCs w:val="25"/>
+        </w:rPr>
+        <w:t>So now, step six: what does it cost on a kiosk?</w:t>
+      </w:r>
+    </w:p>
+    <w:p>
+      <w:pPr>
+        <w:pStyle w:val="Titre1"/>
+        <w:keepNext/>
+        <w:pageBreakBefore/>
+      </w:pPr>
+      <w:r>
+        <w:lastRenderedPageBreak/>
+        <w:t>Slide 9 · Fast and cheap enough for a kiosk</w:t>
+      </w:r>
+    </w:p>
+    <w:p>
+      <w:pPr>
+        <w:keepNext/>
+        <w:spacing w:after="160"/>
+      </w:pPr>
+      <w:r>
+        <w:rPr>
+          <w:color w:val="5F6473"/>
+          <w:sz w:val="19"/>
+          <w:szCs w:val="19"/>
+        </w:rPr>
+        <w:t>7:25 to 8:05 · 40 s · 87 words</w:t>
       </w:r>
     </w:p>
     <w:p>
       <w:pPr>
         <w:spacing w:after="160" w:line="320" w:lineRule="auto"/>
       </w:pPr>
+      <w:r>
+        <w:rPr>
+          <w:sz w:val="25"/>
+          <w:szCs w:val="25"/>
+        </w:rPr>
+        <w:t xml:space="preserve">We timed one photo at a time, from the image to the answer. </w:t>
+      </w:r>
       <w:r>
         <w:rPr>
           <w:i/>
@@ -1006,14 +1542,42 @@
           <w:sz w:val="21"/>
           <w:szCs w:val="21"/>
         </w:rPr>
-        <w:t>[point at the grey card]</w:t>
-      </w:r>
-      <w:r>
-        <w:rPr>
-          <w:sz w:val="25"/>
-          <w:szCs w:val="25"/>
-        </w:rPr>
-        <w:t xml:space="preserve"> </w:t>
+        <w:t>[point at the blue card]</w:t>
+      </w:r>
+      <w:r>
+        <w:rPr>
+          <w:sz w:val="25"/>
+          <w:szCs w:val="25"/>
+        </w:rPr>
+        <w:t xml:space="preserve"> The ResNet needs </w:t>
+      </w:r>
+      <w:r>
+        <w:rPr>
+          <w:b/>
+          <w:bCs/>
+          <w:sz w:val="25"/>
+          <w:szCs w:val="25"/>
+        </w:rPr>
+        <w:t>53 milliseconds on one CPU thread</w:t>
+      </w:r>
+      <w:r>
+        <w:rPr>
+          <w:sz w:val="25"/>
+          <w:szCs w:val="25"/>
+        </w:rPr>
+        <w:t>, 26 with four threads: faster than a blink. Even on a kiosk four times slower, it answers in a fifth of a second.</w:t>
+      </w:r>
+    </w:p>
+    <w:p>
+      <w:pPr>
+        <w:spacing w:after="160" w:line="320" w:lineRule="auto"/>
+      </w:pPr>
+      <w:r>
+        <w:rPr>
+          <w:sz w:val="25"/>
+          <w:szCs w:val="25"/>
+        </w:rPr>
+        <w:t xml:space="preserve">The model file is 45 megabytes. </w:t>
       </w:r>
       <w:r>
         <w:rPr>
@@ -1023,7 +1587,56 @@
           <w:sz w:val="25"/>
           <w:szCs w:val="25"/>
         </w:rPr>
-        <w:t>(optional) One honest note: the fine-tuned model is first on the test, but it was second on validation. With about 220 images, a score moves by about 5 points by chance, so we keep the model we chose before the test.</w:t>
+        <w:t>(optional) And when the collection changes, we only recompute the features and retrain one layer, in seconds.</w:t>
+      </w:r>
+    </w:p>
+    <w:p>
+      <w:pPr>
+        <w:keepNext/>
+        <w:pBdr>
+          <w:left w:val="single" w:sz="18" w:space="8" w:color="1E6B45"/>
+        </w:pBdr>
+        <w:shd w:val="clear" w:color="auto" w:fill="EAF5EE"/>
+        <w:spacing w:before="60"/>
+        <w:ind w:left="170" w:right="170"/>
+      </w:pPr>
+      <w:r>
+        <w:rPr>
+          <w:b/>
+          <w:bCs/>
+          <w:color w:val="1E6B45"/>
+          <w:sz w:val="17"/>
+          <w:szCs w:val="17"/>
+        </w:rPr>
+        <w:t>TRANSITION TO SLIDE 10</w:t>
+      </w:r>
+    </w:p>
+    <w:p>
+      <w:pPr>
+        <w:pBdr>
+          <w:left w:val="single" w:sz="18" w:space="8" w:color="1E6B45"/>
+        </w:pBdr>
+        <w:shd w:val="clear" w:color="auto" w:fill="EAF5EE"/>
+        <w:spacing w:after="200" w:line="320" w:lineRule="auto"/>
+        <w:ind w:left="170" w:right="170"/>
+      </w:pPr>
+      <w:r>
+        <w:rPr>
+          <w:color w:val="1E6B45"/>
+          <w:sz w:val="25"/>
+          <w:szCs w:val="25"/>
+        </w:rPr>
+        <w:t xml:space="preserve">We saw that it is accurate, fast and cheap. </w:t>
+      </w:r>
+      <w:r>
+        <w:rPr>
+          <w:b/>
+          <w:bCs/>
+          <w:color w:val="1E6B45"/>
+          <w:sz w:val="25"/>
+          <w:szCs w:val="25"/>
+        </w:rPr>
+        <w:t>So now, we have everything we need to answer the director.</w:t>
       </w:r>
     </w:p>
     <w:p>
@@ -1032,7 +1645,7 @@
         <w:keepNext/>
       </w:pPr>
       <w:r>
-        <w:t>Slide 10 · Fast and cheap enough for a kiosk</w:t>
+        <w:t>Slide 10 · Our choice: frozen ResNet18 + linear head</w:t>
       </w:r>
     </w:p>
     <w:p>
@@ -1046,20 +1659,13 @@
           <w:sz w:val="19"/>
           <w:szCs w:val="19"/>
         </w:rPr>
-        <w:t>8:15 to 8:55 · 40 s · 90 words</w:t>
+        <w:t>8:05 to 9:05 · 60 s · 127 words</w:t>
       </w:r>
     </w:p>
     <w:p>
       <w:pPr>
         <w:spacing w:after="160" w:line="320" w:lineRule="auto"/>
       </w:pPr>
-      <w:r>
-        <w:rPr>
-          <w:sz w:val="25"/>
-          <w:szCs w:val="25"/>
-        </w:rPr>
-        <w:t xml:space="preserve">Accuracy is only half of the director's question; the other half is the cost. So step six: is it affordable on a kiosk? We timed one photo at a time, from the image to the answer. </w:t>
-      </w:r>
       <w:r>
         <w:rPr>
           <w:i/>
@@ -1068,98 +1674,6 @@
           <w:sz w:val="21"/>
           <w:szCs w:val="21"/>
         </w:rPr>
-        <w:t>[point at the blue card]</w:t>
-      </w:r>
-      <w:r>
-        <w:rPr>
-          <w:sz w:val="25"/>
-          <w:szCs w:val="25"/>
-        </w:rPr>
-        <w:t xml:space="preserve"> The ResNet needs </w:t>
-      </w:r>
-      <w:r>
-        <w:rPr>
-          <w:b/>
-          <w:bCs/>
-          <w:sz w:val="25"/>
-          <w:szCs w:val="25"/>
-        </w:rPr>
-        <w:t>53 milliseconds on one CPU thread</w:t>
-      </w:r>
-      <w:r>
-        <w:rPr>
-          <w:sz w:val="25"/>
-          <w:szCs w:val="25"/>
-        </w:rPr>
-        <w:t>, 26 with four threads: faster than a blink. Even on a kiosk four times slower, it answers in a fifth of a second.</w:t>
-      </w:r>
-    </w:p>
-    <w:p>
-      <w:pPr>
-        <w:spacing w:after="160" w:line="320" w:lineRule="auto"/>
-      </w:pPr>
-      <w:r>
-        <w:rPr>
-          <w:sz w:val="25"/>
-          <w:szCs w:val="25"/>
-        </w:rPr>
-        <w:t xml:space="preserve">The model file is 45 megabytes. </w:t>
-      </w:r>
-      <w:r>
-        <w:rPr>
-          <w:i/>
-          <w:iCs/>
-          <w:color w:val="8A8F9C"/>
-          <w:sz w:val="25"/>
-          <w:szCs w:val="25"/>
-        </w:rPr>
-        <w:t>(optional) And when the collection changes, we only recompute the features and retrain one layer, in seconds.</w:t>
-      </w:r>
-    </w:p>
-    <w:p>
-      <w:pPr>
-        <w:pStyle w:val="Titre1"/>
-        <w:keepNext/>
-        <w:pageBreakBefore/>
-      </w:pPr>
-      <w:r>
-        <w:lastRenderedPageBreak/>
-        <w:t>Slide 11 · Our choice: frozen ResNet18 + linear head</w:t>
-      </w:r>
-    </w:p>
-    <w:p>
-      <w:pPr>
-        <w:keepNext/>
-        <w:spacing w:after="160"/>
-      </w:pPr>
-      <w:r>
-        <w:rPr>
-          <w:color w:val="5F6473"/>
-          <w:sz w:val="19"/>
-          <w:szCs w:val="19"/>
-        </w:rPr>
-        <w:t>8:55 to 10:00 · 65 s · 140 words</w:t>
-      </w:r>
-    </w:p>
-    <w:p>
-      <w:pPr>
-        <w:spacing w:after="160" w:line="320" w:lineRule="auto"/>
-      </w:pPr>
-      <w:r>
-        <w:rPr>
-          <w:sz w:val="25"/>
-          <w:szCs w:val="25"/>
-        </w:rPr>
-        <w:t xml:space="preserve">We can now answer the director. </w:t>
-      </w:r>
-      <w:r>
-        <w:rPr>
-          <w:i/>
-          <w:iCs/>
-          <w:color w:val="1C5FB0"/>
-          <w:sz w:val="21"/>
-          <w:szCs w:val="21"/>
-        </w:rPr>
         <w:t>[point at the line under the title]</w:t>
       </w:r>
       <w:r>
@@ -1167,7 +1681,7 @@
           <w:sz w:val="25"/>
           <w:szCs w:val="25"/>
         </w:rPr>
-        <w:t xml:space="preserve"> On the test, our own MLP reached 41 percent, the best classical model 67, and the frozen ResNet18 83, at a cost a kiosk can afford.</w:t>
+        <w:t xml:space="preserve"> On the test, our own MLP reached 41 percent, the best classical model 67, and the frozen ResNet18 83.</w:t>
       </w:r>
     </w:p>
     <w:p>
@@ -1394,10 +1908,10 @@
 <file path=word/numbering.xml><?xml version="1.0" encoding="utf-8"?>
 <w:numbering xmlns:wpc="http://schemas.microsoft.com/office/word/2010/wordprocessingCanvas" xmlns:cx="http://schemas.microsoft.com/office/drawing/2014/chartex" xmlns:cx1="http://schemas.microsoft.com/office/drawing/2015/9/8/chartex" xmlns:cx2="http://schemas.microsoft.com/office/drawing/2015/10/21/chartex" xmlns:cx3="http://schemas.microsoft.com/office/drawing/2016/5/9/chartex" xmlns:cx4="http://schemas.microsoft.com/office/drawing/2016/5/10/chartex" xmlns:cx5="http://schemas.microsoft.com/office/drawing/2016/5/11/chartex" xmlns:cx6="http://schemas.microsoft.com/office/drawing/2016/5/12/chartex" xmlns:cx7="http://schemas.microsoft.com/office/drawing/2016/5/13/chartex" xmlns:cx8="http://schemas.microsoft.com/office/drawing/2016/5/14/chartex" xmlns:mc="http://schemas.openxmlformats.org/markup-compatibility/2006" xmlns:aink="http://schemas.microsoft.com/office/drawing/2016/ink" xmlns:am3d="http://schemas.microsoft.com/office/drawing/2017/model3d" xmlns:o="urn:schemas-microsoft-com:office:office" xmlns:oel="http://schemas.microsoft.com/office/2019/extlst" xmlns:r="http://schemas.openxmlformats.org/officeDocument/2006/relationships" xmlns:m="http://schemas.openxmlformats.org/officeDocument/2006/math" xmlns:v="urn:schemas-microsoft-com:vml" xmlns:wp14="http://schemas.microsoft.com/office/word/2010/wordprocessingDrawing" xmlns:wp="http://schemas.openxmlformats.org/drawingml/2006/wordprocessingDrawing" xmlns:w10="urn:schemas-microsoft-com:office:word" xmlns:w="http://schemas.openxmlformats.org/wordprocessingml/2006/main" xmlns:w14="http://schemas.microsoft.com/office/word/2010/wordml" xmlns:w15="http://schemas.microsoft.com/office/word/2012/wordml" xmlns:w16cex="http://schemas.microsoft.com/office/word/2018/wordml/cex" xmlns:w16cid="http://schemas.microsoft.com/office/word/2016/wordml/cid" xmlns:w16="http://schemas.microsoft.com/office/word/2018/wordml" xmlns:w16du="http://schemas.microsoft.com/office/word/2023/wordml/word16du" xmlns:w16sdtdh="http://schemas.microsoft.com/office/word/2020/wordml/sdtdatahash" xmlns:w16sdtfl="http://schemas.microsoft.com/office/word/2024/wordml/sdtformatlock" xmlns:w16se="http://schemas.microsoft.com/office/word/2015/wordml/symex" xmlns:wpg="http://schemas.microsoft.com/office/word/2010/wordprocessingGroup" xmlns:wpi="http://schemas.microsoft.com/office/word/2010/wordprocessingInk" xmlns:wne="http://schemas.microsoft.com/office/word/2006/wordml" xmlns:wps="http://schemas.microsoft.com/office/word/2010/wordprocessingShape" mc:Ignorable="w14 w15 w16se w16cid w16 w16cex w16sdtdh w16sdtfl w16du wp14">
   <w:abstractNum w:abstractNumId="0" w15:restartNumberingAfterBreak="0">
-    <w:nsid w:val="79E52A6A"/>
+    <w:nsid w:val="3CBF2247"/>
     <w:multiLevelType w:val="hybridMultilevel"/>
-    <w:tmpl w:val="89C6D4C4"/>
-    <w:lvl w:ilvl="0" w:tplc="E4B0CEF2">
+    <w:tmpl w:val="1B2CB948"/>
+    <w:lvl w:ilvl="0" w:tplc="944A52CC">
       <w:start w:val="1"/>
       <w:numFmt w:val="bullet"/>
       <w:lvlText w:val="●"/>
@@ -1406,7 +1920,7 @@
         <w:ind w:left="720" w:hanging="360"/>
       </w:pPr>
     </w:lvl>
-    <w:lvl w:ilvl="1" w:tplc="D380979C" w:tentative="1">
+    <w:lvl w:ilvl="1" w:tplc="F21E325A" w:tentative="1">
       <w:start w:val="1"/>
       <w:numFmt w:val="bullet"/>
       <w:lvlText w:val="○"/>
@@ -1415,7 +1929,7 @@
         <w:ind w:left="1440" w:hanging="360"/>
       </w:pPr>
     </w:lvl>
-    <w:lvl w:ilvl="2" w:tplc="BB94A0C4" w:tentative="1">
+    <w:lvl w:ilvl="2" w:tplc="1E5CF04E" w:tentative="1">
       <w:start w:val="1"/>
       <w:numFmt w:val="bullet"/>
       <w:lvlText w:val="■"/>
@@ -1424,7 +1938,7 @@
         <w:ind w:left="2160" w:hanging="360"/>
       </w:pPr>
     </w:lvl>
-    <w:lvl w:ilvl="3" w:tplc="0C346740" w:tentative="1">
+    <w:lvl w:ilvl="3" w:tplc="7B84DA5A" w:tentative="1">
       <w:start w:val="1"/>
       <w:numFmt w:val="bullet"/>
       <w:lvlText w:val="●"/>
@@ -1433,7 +1947,7 @@
         <w:ind w:left="2880" w:hanging="360"/>
       </w:pPr>
     </w:lvl>
-    <w:lvl w:ilvl="4" w:tplc="692678F0" w:tentative="1">
+    <w:lvl w:ilvl="4" w:tplc="2B20C402" w:tentative="1">
       <w:start w:val="1"/>
       <w:numFmt w:val="bullet"/>
       <w:lvlText w:val="○"/>
@@ -1442,7 +1956,7 @@
         <w:ind w:left="3600" w:hanging="360"/>
       </w:pPr>
     </w:lvl>
-    <w:lvl w:ilvl="5" w:tplc="07B64E98" w:tentative="1">
+    <w:lvl w:ilvl="5" w:tplc="F2FE89B6" w:tentative="1">
       <w:start w:val="1"/>
       <w:numFmt w:val="bullet"/>
       <w:lvlText w:val="■"/>
@@ -1451,7 +1965,7 @@
         <w:ind w:left="4320" w:hanging="360"/>
       </w:pPr>
     </w:lvl>
-    <w:lvl w:ilvl="6" w:tplc="80F807EA" w:tentative="1">
+    <w:lvl w:ilvl="6" w:tplc="81865A6C" w:tentative="1">
       <w:start w:val="1"/>
       <w:numFmt w:val="bullet"/>
       <w:lvlText w:val="●"/>
@@ -1460,7 +1974,7 @@
         <w:ind w:left="5040" w:hanging="360"/>
       </w:pPr>
     </w:lvl>
-    <w:lvl w:ilvl="7" w:tplc="F6D4B54C" w:tentative="1">
+    <w:lvl w:ilvl="7" w:tplc="42008682" w:tentative="1">
       <w:start w:val="1"/>
       <w:numFmt w:val="bullet"/>
       <w:lvlText w:val="●"/>
@@ -1469,7 +1983,7 @@
         <w:ind w:left="5760" w:hanging="360"/>
       </w:pPr>
     </w:lvl>
-    <w:lvl w:ilvl="8" w:tplc="9CC6ECA8" w:tentative="1">
+    <w:lvl w:ilvl="8" w:tplc="D30E72F2" w:tentative="1">
       <w:start w:val="1"/>
       <w:numFmt w:val="bullet"/>
       <w:lvlText w:val="●"/>
@@ -1479,7 +1993,7 @@
       </w:pPr>
     </w:lvl>
   </w:abstractNum>
-  <w:num w:numId="1" w16cid:durableId="1190100165">
+  <w:num w:numId="1" w16cid:durableId="1965571575">
     <w:abstractNumId w:val="0"/>
     <w:lvlOverride w:ilvl="0">
       <w:startOverride w:val="1"/>

</xml_diff>

<commit_message>
Move the training doctor slide to the backups, show the ResNet monitoring and introduce the random forest in the talk
</commit_message>
<xml_diff>
--- a/presentation/oral_script.docx
+++ b/presentation/oral_script.docx
@@ -51,7 +51,7 @@
           <w:sz w:val="21"/>
           <w:szCs w:val="21"/>
         </w:rPr>
-        <w:t>About 1201 words: at a calm pace (about 130 words per minute), this is about 9 minutes. Without the 109 optional words, about 8 minutes. The rest of the 10 minutes is a safety margin for pauses, clicks and nerves.</w:t>
+        <w:t>About 1251 words: at a calm pace (about 130 words per minute), this is about 10 minutes. Without the 109 optional words, about 9 minutes. The rest of the 10 minutes is a safety margin for pauses, clicks and nerves.</w:t>
       </w:r>
     </w:p>
     <w:p>
@@ -281,7 +281,7 @@
           <w:sz w:val="20"/>
           <w:szCs w:val="20"/>
         </w:rPr>
-        <w:t>We saw that our split stops this cheating: we can trust our test. So now, step five: the final test of every model.</w:t>
+        <w:t>We saw that our split stops this cheating: we can trust our test. But to answer the director, we also need a challenger without any neural network. So now, step five: the final test of every model.</w:t>
       </w:r>
     </w:p>
     <w:p>
@@ -1196,7 +1196,7 @@
           <w:sz w:val="19"/>
           <w:szCs w:val="19"/>
         </w:rPr>
-        <w:t>5:30 to 6:20 · 50 s · 106 words</w:t>
+        <w:t>5:30 to 6:25 · 55 s · 120 words</w:t>
       </w:r>
     </w:p>
     <w:p>
@@ -1314,7 +1314,7 @@
           <w:sz w:val="25"/>
           <w:szCs w:val="25"/>
         </w:rPr>
-        <w:t xml:space="preserve">We saw that our split stops this cheating: we can trust our test. </w:t>
+        <w:t xml:space="preserve">We saw that our split stops this cheating: we can trust our test. But to answer the director, we also need a challenger without any neural network. </w:t>
       </w:r>
       <w:r>
         <w:rPr>
@@ -1347,19 +1347,31 @@
           <w:sz w:val="19"/>
           <w:szCs w:val="19"/>
         </w:rPr>
-        <w:t>6:20 to 7:25 · 65 s · 145 words</w:t>
-      </w:r>
-    </w:p>
-    <w:p>
-      <w:pPr>
-        <w:spacing w:after="160" w:line="320" w:lineRule="auto"/>
-      </w:pPr>
-      <w:r>
-        <w:rPr>
-          <w:sz w:val="25"/>
-          <w:szCs w:val="25"/>
-        </w:rPr>
-        <w:t xml:space="preserve">We opened the 220 test paintings only once, for every model, classical models included. </w:t>
+        <w:t>6:25 to 7:50 · 85 s · 181 words</w:t>
+      </w:r>
+    </w:p>
+    <w:p>
+      <w:pPr>
+        <w:spacing w:after="160" w:line="320" w:lineRule="auto"/>
+      </w:pPr>
+      <w:r>
+        <w:rPr>
+          <w:sz w:val="25"/>
+          <w:szCs w:val="25"/>
+        </w:rPr>
+        <w:t>Our classical challenger does not read pixels. We describe each painting with 102 hand-made numbers, its colours and the directions of its brush strokes, and train two classic models on them: a logistic regression, and a random forest, 500 small decision trees that vote.</w:t>
+      </w:r>
+    </w:p>
+    <w:p>
+      <w:pPr>
+        <w:spacing w:after="160" w:line="320" w:lineRule="auto"/>
+      </w:pPr>
+      <w:r>
+        <w:rPr>
+          <w:sz w:val="25"/>
+          <w:szCs w:val="25"/>
+        </w:rPr>
+        <w:t xml:space="preserve">Then we opened the 220 test paintings, only once, for every model. </w:t>
       </w:r>
       <w:r>
         <w:rPr>
@@ -1376,7 +1388,7 @@
           <w:sz w:val="25"/>
           <w:szCs w:val="25"/>
         </w:rPr>
-        <w:t xml:space="preserve"> The pretrained models are at the top, from 83 to 88 percent. The best classical model, a random forest on hand-made colour and texture features, reaches 67; our MLP 41.</w:t>
+        <w:t xml:space="preserve"> The pretrained models are at the top, from 83 to 88 percent. The best classical model, the random forest, reaches 67; our MLP 41.</w:t>
       </w:r>
     </w:p>
     <w:p>
@@ -1520,7 +1532,7 @@
           <w:sz w:val="19"/>
           <w:szCs w:val="19"/>
         </w:rPr>
-        <w:t>7:25 to 8:05 · 40 s · 87 words</w:t>
+        <w:t>7:50 to 8:30 · 40 s · 87 words</w:t>
       </w:r>
     </w:p>
     <w:p>
@@ -1659,7 +1671,7 @@
           <w:sz w:val="19"/>
           <w:szCs w:val="19"/>
         </w:rPr>
-        <w:t>8:05 to 9:05 · 60 s · 127 words</w:t>
+        <w:t>8:30 to 9:30 · 60 s · 127 words</w:t>
       </w:r>
     </w:p>
     <w:p>
@@ -1908,10 +1920,10 @@
 <file path=word/numbering.xml><?xml version="1.0" encoding="utf-8"?>
 <w:numbering xmlns:wpc="http://schemas.microsoft.com/office/word/2010/wordprocessingCanvas" xmlns:cx="http://schemas.microsoft.com/office/drawing/2014/chartex" xmlns:cx1="http://schemas.microsoft.com/office/drawing/2015/9/8/chartex" xmlns:cx2="http://schemas.microsoft.com/office/drawing/2015/10/21/chartex" xmlns:cx3="http://schemas.microsoft.com/office/drawing/2016/5/9/chartex" xmlns:cx4="http://schemas.microsoft.com/office/drawing/2016/5/10/chartex" xmlns:cx5="http://schemas.microsoft.com/office/drawing/2016/5/11/chartex" xmlns:cx6="http://schemas.microsoft.com/office/drawing/2016/5/12/chartex" xmlns:cx7="http://schemas.microsoft.com/office/drawing/2016/5/13/chartex" xmlns:cx8="http://schemas.microsoft.com/office/drawing/2016/5/14/chartex" xmlns:mc="http://schemas.openxmlformats.org/markup-compatibility/2006" xmlns:aink="http://schemas.microsoft.com/office/drawing/2016/ink" xmlns:am3d="http://schemas.microsoft.com/office/drawing/2017/model3d" xmlns:o="urn:schemas-microsoft-com:office:office" xmlns:oel="http://schemas.microsoft.com/office/2019/extlst" xmlns:r="http://schemas.openxmlformats.org/officeDocument/2006/relationships" xmlns:m="http://schemas.openxmlformats.org/officeDocument/2006/math" xmlns:v="urn:schemas-microsoft-com:vml" xmlns:wp14="http://schemas.microsoft.com/office/word/2010/wordprocessingDrawing" xmlns:wp="http://schemas.openxmlformats.org/drawingml/2006/wordprocessingDrawing" xmlns:w10="urn:schemas-microsoft-com:office:word" xmlns:w="http://schemas.openxmlformats.org/wordprocessingml/2006/main" xmlns:w14="http://schemas.microsoft.com/office/word/2010/wordml" xmlns:w15="http://schemas.microsoft.com/office/word/2012/wordml" xmlns:w16cex="http://schemas.microsoft.com/office/word/2018/wordml/cex" xmlns:w16cid="http://schemas.microsoft.com/office/word/2016/wordml/cid" xmlns:w16="http://schemas.microsoft.com/office/word/2018/wordml" xmlns:w16du="http://schemas.microsoft.com/office/word/2023/wordml/word16du" xmlns:w16sdtdh="http://schemas.microsoft.com/office/word/2020/wordml/sdtdatahash" xmlns:w16sdtfl="http://schemas.microsoft.com/office/word/2024/wordml/sdtformatlock" xmlns:w16se="http://schemas.microsoft.com/office/word/2015/wordml/symex" xmlns:wpg="http://schemas.microsoft.com/office/word/2010/wordprocessingGroup" xmlns:wpi="http://schemas.microsoft.com/office/word/2010/wordprocessingInk" xmlns:wne="http://schemas.microsoft.com/office/word/2006/wordml" xmlns:wps="http://schemas.microsoft.com/office/word/2010/wordprocessingShape" mc:Ignorable="w14 w15 w16se w16cid w16 w16cex w16sdtdh w16sdtfl w16du wp14">
   <w:abstractNum w:abstractNumId="0" w15:restartNumberingAfterBreak="0">
-    <w:nsid w:val="3CBF2247"/>
+    <w:nsid w:val="51AE34B6"/>
     <w:multiLevelType w:val="hybridMultilevel"/>
-    <w:tmpl w:val="1B2CB948"/>
-    <w:lvl w:ilvl="0" w:tplc="944A52CC">
+    <w:tmpl w:val="9CDE92BE"/>
+    <w:lvl w:ilvl="0" w:tplc="F60A94F0">
       <w:start w:val="1"/>
       <w:numFmt w:val="bullet"/>
       <w:lvlText w:val="●"/>
@@ -1920,7 +1932,7 @@
         <w:ind w:left="720" w:hanging="360"/>
       </w:pPr>
     </w:lvl>
-    <w:lvl w:ilvl="1" w:tplc="F21E325A" w:tentative="1">
+    <w:lvl w:ilvl="1" w:tplc="4746BB68" w:tentative="1">
       <w:start w:val="1"/>
       <w:numFmt w:val="bullet"/>
       <w:lvlText w:val="○"/>
@@ -1929,7 +1941,7 @@
         <w:ind w:left="1440" w:hanging="360"/>
       </w:pPr>
     </w:lvl>
-    <w:lvl w:ilvl="2" w:tplc="1E5CF04E" w:tentative="1">
+    <w:lvl w:ilvl="2" w:tplc="2946AF78" w:tentative="1">
       <w:start w:val="1"/>
       <w:numFmt w:val="bullet"/>
       <w:lvlText w:val="■"/>
@@ -1938,7 +1950,7 @@
         <w:ind w:left="2160" w:hanging="360"/>
       </w:pPr>
     </w:lvl>
-    <w:lvl w:ilvl="3" w:tplc="7B84DA5A" w:tentative="1">
+    <w:lvl w:ilvl="3" w:tplc="13F26F0A" w:tentative="1">
       <w:start w:val="1"/>
       <w:numFmt w:val="bullet"/>
       <w:lvlText w:val="●"/>
@@ -1947,7 +1959,7 @@
         <w:ind w:left="2880" w:hanging="360"/>
       </w:pPr>
     </w:lvl>
-    <w:lvl w:ilvl="4" w:tplc="2B20C402" w:tentative="1">
+    <w:lvl w:ilvl="4" w:tplc="462C7156" w:tentative="1">
       <w:start w:val="1"/>
       <w:numFmt w:val="bullet"/>
       <w:lvlText w:val="○"/>
@@ -1956,7 +1968,7 @@
         <w:ind w:left="3600" w:hanging="360"/>
       </w:pPr>
     </w:lvl>
-    <w:lvl w:ilvl="5" w:tplc="F2FE89B6" w:tentative="1">
+    <w:lvl w:ilvl="5" w:tplc="6E4841DC" w:tentative="1">
       <w:start w:val="1"/>
       <w:numFmt w:val="bullet"/>
       <w:lvlText w:val="■"/>
@@ -1965,7 +1977,7 @@
         <w:ind w:left="4320" w:hanging="360"/>
       </w:pPr>
     </w:lvl>
-    <w:lvl w:ilvl="6" w:tplc="81865A6C" w:tentative="1">
+    <w:lvl w:ilvl="6" w:tplc="ED54596A" w:tentative="1">
       <w:start w:val="1"/>
       <w:numFmt w:val="bullet"/>
       <w:lvlText w:val="●"/>
@@ -1974,7 +1986,7 @@
         <w:ind w:left="5040" w:hanging="360"/>
       </w:pPr>
     </w:lvl>
-    <w:lvl w:ilvl="7" w:tplc="42008682" w:tentative="1">
+    <w:lvl w:ilvl="7" w:tplc="8D4058B4" w:tentative="1">
       <w:start w:val="1"/>
       <w:numFmt w:val="bullet"/>
       <w:lvlText w:val="●"/>
@@ -1983,7 +1995,7 @@
         <w:ind w:left="5760" w:hanging="360"/>
       </w:pPr>
     </w:lvl>
-    <w:lvl w:ilvl="8" w:tplc="D30E72F2" w:tentative="1">
+    <w:lvl w:ilvl="8" w:tplc="4C42EB52" w:tentative="1">
       <w:start w:val="1"/>
       <w:numFmt w:val="bullet"/>
       <w:lvlText w:val="●"/>
@@ -1993,7 +2005,7 @@
       </w:pPr>
     </w:lvl>
   </w:abstractNum>
-  <w:num w:numId="1" w16cid:durableId="1965571575">
+  <w:num w:numId="1" w16cid:durableId="1598053816">
     <w:abstractNumId w:val="0"/>
     <w:lvlOverride w:ilvl="0">
       <w:startOverride w:val="1"/>

</xml_diff>

<commit_message>
Keep four models on the final test slide and move the painter slide to the backups
</commit_message>
<xml_diff>
--- a/presentation/oral_script.docx
+++ b/presentation/oral_script.docx
@@ -51,7 +51,7 @@
           <w:sz w:val="21"/>
           <w:szCs w:val="21"/>
         </w:rPr>
-        <w:t>About 1251 words: at a calm pace (about 130 words per minute), this is about 10 minutes. Without the 109 optional words, about 9 minutes. The rest of the 10 minutes is a safety margin for pauses, clicks and nerves.</w:t>
+        <w:t>About 1139 words: at a calm pace (about 130 words per minute), this is about 9 minutes. Without the 124 optional words, about 8 minutes. The rest of the 10 minutes is a safety margin for pauses, clicks and nerves.</w:t>
       </w:r>
     </w:p>
     <w:p>
@@ -119,7 +119,7 @@
           <w:sz w:val="21"/>
           <w:szCs w:val="21"/>
         </w:rPr>
-        <w:t>If you present with a teammate, a natural split is slides 1 to 5, then slides 6 to 10.</w:t>
+        <w:t>If you present with a teammate, a natural split is slides 1 to 5, then slides 6 to 9.</w:t>
       </w:r>
     </w:p>
     <w:p>
@@ -259,7 +259,7 @@
           <w:sz w:val="20"/>
           <w:szCs w:val="20"/>
         </w:rPr>
-        <w:t>We saw that ResNet18 reaches 88 percent. But a model this strong could cheat, by recognising the painter instead of the style. So now, we check if it cheats.</w:t>
+        <w:t>We saw that ResNet18 reaches 88 percent on validation. But to answer the director, we also need a challenger without any neural network. So now, step five: the final test of every model.</w:t>
       </w:r>
     </w:p>
     <w:p>
@@ -281,7 +281,7 @@
           <w:sz w:val="20"/>
           <w:szCs w:val="20"/>
         </w:rPr>
-        <w:t>We saw that our split stops this cheating: we can trust our test. But to answer the director, we also need a challenger without any neural network. So now, step five: the final test of every model.</w:t>
+        <w:t>We saw that the pretrained network is the most accurate. But accuracy is only half of the director's question. So now, step six: what does it cost on a kiosk?</w:t>
       </w:r>
     </w:p>
     <w:p>
@@ -297,28 +297,6 @@
           <w:szCs w:val="20"/>
         </w:rPr>
         <w:t xml:space="preserve">8 to 9:  </w:t>
-      </w:r>
-      <w:r>
-        <w:rPr>
-          <w:sz w:val="20"/>
-          <w:szCs w:val="20"/>
-        </w:rPr>
-        <w:t>We saw that the pretrained network is the most accurate. But accuracy is only half of the director's question. So now, step six: what does it cost on a kiosk?</w:t>
-      </w:r>
-    </w:p>
-    <w:p>
-      <w:pPr>
-        <w:spacing w:after="60"/>
-      </w:pPr>
-      <w:r>
-        <w:rPr>
-          <w:b/>
-          <w:bCs/>
-          <w:color w:val="1E6B45"/>
-          <w:sz w:val="20"/>
-          <w:szCs w:val="20"/>
-        </w:rPr>
-        <w:t xml:space="preserve">9 to 10:  </w:t>
       </w:r>
       <w:r>
         <w:rPr>
@@ -586,7 +564,7 @@
           <w:sz w:val="19"/>
           <w:szCs w:val="19"/>
         </w:rPr>
-        <w:t>1:25 to 2:20 · 55 s · 124 words</w:t>
+        <w:t>1:25 to 2:30 · 65 s · 139 words</w:t>
       </w:r>
     </w:p>
     <w:p>
@@ -665,7 +643,17 @@
           <w:sz w:val="25"/>
           <w:szCs w:val="25"/>
         </w:rPr>
-        <w:t xml:space="preserve"> With a random split, 23 of our 32 known painters would be in two piles, and a model could learn to recognise Monet instead of Impressionism. With our split: zero.</w:t>
+        <w:t xml:space="preserve"> With a random split, 23 of our 32 known painters would be in two piles, and a model could learn to recognise Monet instead of Impressionism. With our split: zero. </w:t>
+      </w:r>
+      <w:r>
+        <w:rPr>
+          <w:i/>
+          <w:iCs/>
+          <w:color w:val="8A8F9C"/>
+          <w:sz w:val="25"/>
+          <w:szCs w:val="25"/>
+        </w:rPr>
+        <w:t>(optional) We measured it: when the model has seen the painter, it scores 11 points higher.</w:t>
       </w:r>
     </w:p>
     <w:p>
@@ -737,7 +725,7 @@
           <w:sz w:val="19"/>
           <w:szCs w:val="19"/>
         </w:rPr>
-        <w:t>2:20 to 3:25 · 65 s · 146 words</w:t>
+        <w:t>2:30 to 3:35 · 65 s · 146 words</w:t>
       </w:r>
     </w:p>
     <w:p>
@@ -900,7 +888,7 @@
           <w:sz w:val="19"/>
           <w:szCs w:val="19"/>
         </w:rPr>
-        <w:t>3:25 to 4:25 · 60 s · 135 words</w:t>
+        <w:t>3:35 to 4:35 · 60 s · 135 words</w:t>
       </w:r>
     </w:p>
     <w:p>
@@ -1034,7 +1022,7 @@
           <w:sz w:val="19"/>
           <w:szCs w:val="19"/>
         </w:rPr>
-        <w:t>4:25 to 5:30 · 65 s · 140 words</w:t>
+        <w:t>4:35 to 5:40 · 65 s · 144 words</w:t>
       </w:r>
     </w:p>
     <w:p>
@@ -1161,17 +1149,17 @@
           <w:sz w:val="25"/>
           <w:szCs w:val="25"/>
         </w:rPr>
-        <w:t xml:space="preserve">We saw that ResNet18 reaches 88 percent. But a model this strong could cheat, by recognising the painter instead of the style. </w:t>
-      </w:r>
-      <w:r>
-        <w:rPr>
-          <w:b/>
-          <w:bCs/>
-          <w:color w:val="1E6B45"/>
-          <w:sz w:val="25"/>
-          <w:szCs w:val="25"/>
-        </w:rPr>
-        <w:t>So now, we check if it cheats.</w:t>
+        <w:t xml:space="preserve">We saw that ResNet18 reaches 88 percent on validation. But to answer the director, we also need a challenger without any neural network. </w:t>
+      </w:r>
+      <w:r>
+        <w:rPr>
+          <w:b/>
+          <w:bCs/>
+          <w:color w:val="1E6B45"/>
+          <w:sz w:val="25"/>
+          <w:szCs w:val="25"/>
+        </w:rPr>
+        <w:t>So now, step five: the final test of every model.</w:t>
       </w:r>
     </w:p>
     <w:p>
@@ -1182,7 +1170,7 @@
       </w:pPr>
       <w:r>
         <w:lastRenderedPageBreak/>
-        <w:t>Slide 7 · Seeing the painter inflates the score</w:t>
+        <w:t>Slide 7 · Final test: the pretrained network wins</w:t>
       </w:r>
     </w:p>
     <w:p>
@@ -1196,7 +1184,7 @@
           <w:sz w:val="19"/>
           <w:szCs w:val="19"/>
         </w:rPr>
-        <w:t>5:30 to 6:25 · 55 s · 120 words</w:t>
+        <w:t>5:40 to 7:00 · 80 s · 170 words</w:t>
       </w:r>
     </w:p>
     <w:p>
@@ -1208,13 +1196,20 @@
           <w:sz w:val="25"/>
           <w:szCs w:val="25"/>
         </w:rPr>
-        <w:t>Remember the painter rule of step one. To measure its effect, we scored the same images twice with cross-validation, and changed only one thing: whether the model had seen other paintings by the same painter.</w:t>
+        <w:t>Our classical challenger does not read pixels. We describe each painting with 102 hand-made numbers, its colours and the directions of its brush strokes, and train a random forest on them: 500 small decision trees that vote.</w:t>
       </w:r>
     </w:p>
     <w:p>
       <w:pPr>
         <w:spacing w:after="160" w:line="320" w:lineRule="auto"/>
       </w:pPr>
+      <w:r>
+        <w:rPr>
+          <w:sz w:val="25"/>
+          <w:szCs w:val="25"/>
+        </w:rPr>
+        <w:t xml:space="preserve">Then we opened the 220 test paintings, only once, for every model. </w:t>
+      </w:r>
       <w:r>
         <w:rPr>
           <w:i/>
@@ -1223,30 +1218,26 @@
           <w:sz w:val="21"/>
           <w:szCs w:val="21"/>
         </w:rPr>
-        <w:t>[point at the left bars]</w:t>
-      </w:r>
-      <w:r>
-        <w:rPr>
-          <w:sz w:val="25"/>
-          <w:szCs w:val="25"/>
-        </w:rPr>
-        <w:t xml:space="preserve"> On images by known painters: 83.7 percent when the painter was seen, 72.3 when not. </w:t>
-      </w:r>
-      <w:r>
-        <w:rPr>
-          <w:b/>
-          <w:bCs/>
-          <w:sz w:val="25"/>
-          <w:szCs w:val="25"/>
-        </w:rPr>
-        <w:t>11 points of flattery.</w:t>
-      </w:r>
-      <w:r>
-        <w:rPr>
-          <w:sz w:val="25"/>
-          <w:szCs w:val="25"/>
-        </w:rPr>
-        <w:t xml:space="preserve"> </w:t>
+        <w:t>[point at the top bars]</w:t>
+      </w:r>
+      <w:r>
+        <w:rPr>
+          <w:sz w:val="25"/>
+          <w:szCs w:val="25"/>
+        </w:rPr>
+        <w:t xml:space="preserve"> The pretrained models are at the top, from 83 to 88 percent. The random forest reaches 67; our MLP 41.</w:t>
+      </w:r>
+    </w:p>
+    <w:p>
+      <w:pPr>
+        <w:spacing w:after="160" w:line="320" w:lineRule="auto"/>
+      </w:pPr>
+      <w:r>
+        <w:rPr>
+          <w:sz w:val="25"/>
+          <w:szCs w:val="25"/>
+        </w:rPr>
+        <w:t xml:space="preserve">Is the gap real? </w:t>
       </w:r>
       <w:r>
         <w:rPr>
@@ -1256,14 +1247,23 @@
           <w:sz w:val="21"/>
           <w:szCs w:val="21"/>
         </w:rPr>
-        <w:t>[point at the right bars]</w:t>
-      </w:r>
-      <w:r>
-        <w:rPr>
-          <w:sz w:val="25"/>
-          <w:szCs w:val="25"/>
-        </w:rPr>
-        <w:t xml:space="preserve"> On the control group, the unknown painters, nothing changes.</w:t>
+        <w:t>[point at the blue card]</w:t>
+      </w:r>
+      <w:r>
+        <w:rPr>
+          <w:sz w:val="25"/>
+          <w:szCs w:val="25"/>
+        </w:rPr>
+        <w:t xml:space="preserve"> A paired bootstrap on the same test paintings gives our model a lead of </w:t>
+      </w:r>
+      <w:r>
+        <w:rPr>
+          <w:b/>
+          <w:bCs/>
+          <w:sz w:val="25"/>
+          <w:szCs w:val="25"/>
+        </w:rPr>
+        <w:t>16.4 points over the random forest, between 9 and 24 points: it is not luck.</w:t>
       </w:r>
     </w:p>
     <w:p>
@@ -1272,10 +1272,30 @@
       </w:pPr>
       <w:r>
         <w:rPr>
-          <w:sz w:val="25"/>
-          <w:szCs w:val="25"/>
-        </w:rPr>
-        <w:t>So the model partly recognises painters: a random split would have given the director a score that is too good.</w:t>
+          <w:i/>
+          <w:iCs/>
+          <w:color w:val="1C5FB0"/>
+          <w:sz w:val="21"/>
+          <w:szCs w:val="21"/>
+        </w:rPr>
+        <w:t>[point at the grey card]</w:t>
+      </w:r>
+      <w:r>
+        <w:rPr>
+          <w:sz w:val="25"/>
+          <w:szCs w:val="25"/>
+        </w:rPr>
+        <w:t xml:space="preserve"> </w:t>
+      </w:r>
+      <w:r>
+        <w:rPr>
+          <w:i/>
+          <w:iCs/>
+          <w:color w:val="8A8F9C"/>
+          <w:sz w:val="25"/>
+          <w:szCs w:val="25"/>
+        </w:rPr>
+        <w:t>(optional) One honest note: the fine-tuned model is first on the test, but it was second on validation. With 220 images, a score moves by about 5 points by chance, so we keep the model chosen before the test.</w:t>
       </w:r>
     </w:p>
     <w:p>
@@ -1314,17 +1334,17 @@
           <w:sz w:val="25"/>
           <w:szCs w:val="25"/>
         </w:rPr>
-        <w:t xml:space="preserve">We saw that our split stops this cheating: we can trust our test. But to answer the director, we also need a challenger without any neural network. </w:t>
-      </w:r>
-      <w:r>
-        <w:rPr>
-          <w:b/>
-          <w:bCs/>
-          <w:color w:val="1E6B45"/>
-          <w:sz w:val="25"/>
-          <w:szCs w:val="25"/>
-        </w:rPr>
-        <w:t>So now, step five: the final test of every model.</w:t>
+        <w:t xml:space="preserve">We saw that the pretrained network is the most accurate. But accuracy is only half of the director's question. </w:t>
+      </w:r>
+      <w:r>
+        <w:rPr>
+          <w:b/>
+          <w:bCs/>
+          <w:color w:val="1E6B45"/>
+          <w:sz w:val="25"/>
+          <w:szCs w:val="25"/>
+        </w:rPr>
+        <w:t>So now, step six: what does it cost on a kiosk?</w:t>
       </w:r>
     </w:p>
     <w:p>
@@ -1333,7 +1353,7 @@
         <w:keepNext/>
       </w:pPr>
       <w:r>
-        <w:t>Slide 8 · Final test: the pretrained network wins</w:t>
+        <w:t>Slide 8 · Fast and cheap enough for a kiosk</w:t>
       </w:r>
     </w:p>
     <w:p>
@@ -1347,7 +1367,7 @@
           <w:sz w:val="19"/>
           <w:szCs w:val="19"/>
         </w:rPr>
-        <w:t>6:25 to 7:50 · 85 s · 181 words</w:t>
+        <w:t>7:00 to 7:40 · 40 s · 87 words</w:t>
       </w:r>
     </w:p>
     <w:p>
@@ -1359,19 +1379,7 @@
           <w:sz w:val="25"/>
           <w:szCs w:val="25"/>
         </w:rPr>
-        <w:t>Our classical challenger does not read pixels. We describe each painting with 102 hand-made numbers, its colours and the directions of its brush strokes, and train two classic models on them: a logistic regression, and a random forest, 500 small decision trees that vote.</w:t>
-      </w:r>
-    </w:p>
-    <w:p>
-      <w:pPr>
-        <w:spacing w:after="160" w:line="320" w:lineRule="auto"/>
-      </w:pPr>
-      <w:r>
-        <w:rPr>
-          <w:sz w:val="25"/>
-          <w:szCs w:val="25"/>
-        </w:rPr>
-        <w:t xml:space="preserve">Then we opened the 220 test paintings, only once, for every model. </w:t>
+        <w:t xml:space="preserve">We timed one photo at a time, from the image to the answer. </w:t>
       </w:r>
       <w:r>
         <w:rPr>
@@ -1381,14 +1389,30 @@
           <w:sz w:val="21"/>
           <w:szCs w:val="21"/>
         </w:rPr>
-        <w:t>[point at the top bars]</w:t>
-      </w:r>
-      <w:r>
-        <w:rPr>
-          <w:sz w:val="25"/>
-          <w:szCs w:val="25"/>
-        </w:rPr>
-        <w:t xml:space="preserve"> The pretrained models are at the top, from 83 to 88 percent. The best classical model, the random forest, reaches 67; our MLP 41.</w:t>
+        <w:t>[point at the blue card]</w:t>
+      </w:r>
+      <w:r>
+        <w:rPr>
+          <w:sz w:val="25"/>
+          <w:szCs w:val="25"/>
+        </w:rPr>
+        <w:t xml:space="preserve"> The ResNet needs </w:t>
+      </w:r>
+      <w:r>
+        <w:rPr>
+          <w:b/>
+          <w:bCs/>
+          <w:sz w:val="25"/>
+          <w:szCs w:val="25"/>
+        </w:rPr>
+        <w:t>53 milliseconds on one CPU thread</w:t>
+      </w:r>
+      <w:r>
+        <w:rPr>
+          <w:sz w:val="25"/>
+          <w:szCs w:val="25"/>
+        </w:rPr>
+        <w:t>, 26 with four threads: faster than a blink. Even on a kiosk four times slower, it answers in a fifth of a second.</w:t>
       </w:r>
     </w:p>
     <w:p>
@@ -1400,55 +1424,7 @@
           <w:sz w:val="25"/>
           <w:szCs w:val="25"/>
         </w:rPr>
-        <w:t xml:space="preserve">Is the gap real? </w:t>
-      </w:r>
-      <w:r>
-        <w:rPr>
-          <w:i/>
-          <w:iCs/>
-          <w:color w:val="1C5FB0"/>
-          <w:sz w:val="21"/>
-          <w:szCs w:val="21"/>
-        </w:rPr>
-        <w:t>[point at the blue card]</w:t>
-      </w:r>
-      <w:r>
-        <w:rPr>
-          <w:sz w:val="25"/>
-          <w:szCs w:val="25"/>
-        </w:rPr>
-        <w:t xml:space="preserve"> A paired bootstrap on the same test paintings gives our model a lead of </w:t>
-      </w:r>
-      <w:r>
-        <w:rPr>
-          <w:b/>
-          <w:bCs/>
-          <w:sz w:val="25"/>
-          <w:szCs w:val="25"/>
-        </w:rPr>
-        <w:t>16.4 points over the random forest, between 9 and 24 points: it is not luck.</w:t>
-      </w:r>
-    </w:p>
-    <w:p>
-      <w:pPr>
-        <w:spacing w:after="160" w:line="320" w:lineRule="auto"/>
-      </w:pPr>
-      <w:r>
-        <w:rPr>
-          <w:i/>
-          <w:iCs/>
-          <w:color w:val="1C5FB0"/>
-          <w:sz w:val="21"/>
-          <w:szCs w:val="21"/>
-        </w:rPr>
-        <w:t>[point at the grey card]</w:t>
-      </w:r>
-      <w:r>
-        <w:rPr>
-          <w:sz w:val="25"/>
-          <w:szCs w:val="25"/>
-        </w:rPr>
-        <w:t xml:space="preserve"> </w:t>
+        <w:t xml:space="preserve">The model file is 45 megabytes. </w:t>
       </w:r>
       <w:r>
         <w:rPr>
@@ -1458,7 +1434,7 @@
           <w:sz w:val="25"/>
           <w:szCs w:val="25"/>
         </w:rPr>
-        <w:t>(optional) One honest note: the fine-tuned model is first on the test, but it was second on validation. With 220 images, a score moves by about 5 points by chance, so we keep the model chosen before the test.</w:t>
+        <w:t>(optional) And when the collection changes, we only recompute the features and retrain one layer, in seconds.</w:t>
       </w:r>
     </w:p>
     <w:p>
@@ -1497,17 +1473,17 @@
           <w:sz w:val="25"/>
           <w:szCs w:val="25"/>
         </w:rPr>
-        <w:t xml:space="preserve">We saw that the pretrained network is the most accurate. But accuracy is only half of the director's question. </w:t>
-      </w:r>
-      <w:r>
-        <w:rPr>
-          <w:b/>
-          <w:bCs/>
-          <w:color w:val="1E6B45"/>
-          <w:sz w:val="25"/>
-          <w:szCs w:val="25"/>
-        </w:rPr>
-        <w:t>So now, step six: what does it cost on a kiosk?</w:t>
+        <w:t xml:space="preserve">We saw that it is accurate, fast and cheap. </w:t>
+      </w:r>
+      <w:r>
+        <w:rPr>
+          <w:b/>
+          <w:bCs/>
+          <w:color w:val="1E6B45"/>
+          <w:sz w:val="25"/>
+          <w:szCs w:val="25"/>
+        </w:rPr>
+        <w:t>So now, we have everything we need to answer the director.</w:t>
       </w:r>
     </w:p>
     <w:p>
@@ -1518,7 +1494,7 @@
       </w:pPr>
       <w:r>
         <w:lastRenderedPageBreak/>
-        <w:t>Slide 9 · Fast and cheap enough for a kiosk</w:t>
+        <w:t>Slide 9 · Our choice: frozen ResNet18 + linear head</w:t>
       </w:r>
     </w:p>
     <w:p>
@@ -1532,146 +1508,7 @@
           <w:sz w:val="19"/>
           <w:szCs w:val="19"/>
         </w:rPr>
-        <w:t>7:50 to 8:30 · 40 s · 87 words</w:t>
-      </w:r>
-    </w:p>
-    <w:p>
-      <w:pPr>
-        <w:spacing w:after="160" w:line="320" w:lineRule="auto"/>
-      </w:pPr>
-      <w:r>
-        <w:rPr>
-          <w:sz w:val="25"/>
-          <w:szCs w:val="25"/>
-        </w:rPr>
-        <w:t xml:space="preserve">We timed one photo at a time, from the image to the answer. </w:t>
-      </w:r>
-      <w:r>
-        <w:rPr>
-          <w:i/>
-          <w:iCs/>
-          <w:color w:val="1C5FB0"/>
-          <w:sz w:val="21"/>
-          <w:szCs w:val="21"/>
-        </w:rPr>
-        <w:t>[point at the blue card]</w:t>
-      </w:r>
-      <w:r>
-        <w:rPr>
-          <w:sz w:val="25"/>
-          <w:szCs w:val="25"/>
-        </w:rPr>
-        <w:t xml:space="preserve"> The ResNet needs </w:t>
-      </w:r>
-      <w:r>
-        <w:rPr>
-          <w:b/>
-          <w:bCs/>
-          <w:sz w:val="25"/>
-          <w:szCs w:val="25"/>
-        </w:rPr>
-        <w:t>53 milliseconds on one CPU thread</w:t>
-      </w:r>
-      <w:r>
-        <w:rPr>
-          <w:sz w:val="25"/>
-          <w:szCs w:val="25"/>
-        </w:rPr>
-        <w:t>, 26 with four threads: faster than a blink. Even on a kiosk four times slower, it answers in a fifth of a second.</w:t>
-      </w:r>
-    </w:p>
-    <w:p>
-      <w:pPr>
-        <w:spacing w:after="160" w:line="320" w:lineRule="auto"/>
-      </w:pPr>
-      <w:r>
-        <w:rPr>
-          <w:sz w:val="25"/>
-          <w:szCs w:val="25"/>
-        </w:rPr>
-        <w:t xml:space="preserve">The model file is 45 megabytes. </w:t>
-      </w:r>
-      <w:r>
-        <w:rPr>
-          <w:i/>
-          <w:iCs/>
-          <w:color w:val="8A8F9C"/>
-          <w:sz w:val="25"/>
-          <w:szCs w:val="25"/>
-        </w:rPr>
-        <w:t>(optional) And when the collection changes, we only recompute the features and retrain one layer, in seconds.</w:t>
-      </w:r>
-    </w:p>
-    <w:p>
-      <w:pPr>
-        <w:keepNext/>
-        <w:pBdr>
-          <w:left w:val="single" w:sz="18" w:space="8" w:color="1E6B45"/>
-        </w:pBdr>
-        <w:shd w:val="clear" w:color="auto" w:fill="EAF5EE"/>
-        <w:spacing w:before="60"/>
-        <w:ind w:left="170" w:right="170"/>
-      </w:pPr>
-      <w:r>
-        <w:rPr>
-          <w:b/>
-          <w:bCs/>
-          <w:color w:val="1E6B45"/>
-          <w:sz w:val="17"/>
-          <w:szCs w:val="17"/>
-        </w:rPr>
-        <w:t>TRANSITION TO SLIDE 10</w:t>
-      </w:r>
-    </w:p>
-    <w:p>
-      <w:pPr>
-        <w:pBdr>
-          <w:left w:val="single" w:sz="18" w:space="8" w:color="1E6B45"/>
-        </w:pBdr>
-        <w:shd w:val="clear" w:color="auto" w:fill="EAF5EE"/>
-        <w:spacing w:after="200" w:line="320" w:lineRule="auto"/>
-        <w:ind w:left="170" w:right="170"/>
-      </w:pPr>
-      <w:r>
-        <w:rPr>
-          <w:color w:val="1E6B45"/>
-          <w:sz w:val="25"/>
-          <w:szCs w:val="25"/>
-        </w:rPr>
-        <w:t xml:space="preserve">We saw that it is accurate, fast and cheap. </w:t>
-      </w:r>
-      <w:r>
-        <w:rPr>
-          <w:b/>
-          <w:bCs/>
-          <w:color w:val="1E6B45"/>
-          <w:sz w:val="25"/>
-          <w:szCs w:val="25"/>
-        </w:rPr>
-        <w:t>So now, we have everything we need to answer the director.</w:t>
-      </w:r>
-    </w:p>
-    <w:p>
-      <w:pPr>
-        <w:pStyle w:val="Titre1"/>
-        <w:keepNext/>
-      </w:pPr>
-      <w:r>
-        <w:t>Slide 10 · Our choice: frozen ResNet18 + linear head</w:t>
-      </w:r>
-    </w:p>
-    <w:p>
-      <w:pPr>
-        <w:keepNext/>
-        <w:spacing w:after="160"/>
-      </w:pPr>
-      <w:r>
-        <w:rPr>
-          <w:color w:val="5F6473"/>
-          <w:sz w:val="19"/>
-          <w:szCs w:val="19"/>
-        </w:rPr>
-        <w:t>8:30 to 9:30 · 60 s · 127 words</w:t>
+        <w:t>7:40 to 8:40 · 60 s · 127 words</w:t>
       </w:r>
     </w:p>
     <w:p>
@@ -1920,10 +1757,10 @@
 <file path=word/numbering.xml><?xml version="1.0" encoding="utf-8"?>
 <w:numbering xmlns:wpc="http://schemas.microsoft.com/office/word/2010/wordprocessingCanvas" xmlns:cx="http://schemas.microsoft.com/office/drawing/2014/chartex" xmlns:cx1="http://schemas.microsoft.com/office/drawing/2015/9/8/chartex" xmlns:cx2="http://schemas.microsoft.com/office/drawing/2015/10/21/chartex" xmlns:cx3="http://schemas.microsoft.com/office/drawing/2016/5/9/chartex" xmlns:cx4="http://schemas.microsoft.com/office/drawing/2016/5/10/chartex" xmlns:cx5="http://schemas.microsoft.com/office/drawing/2016/5/11/chartex" xmlns:cx6="http://schemas.microsoft.com/office/drawing/2016/5/12/chartex" xmlns:cx7="http://schemas.microsoft.com/office/drawing/2016/5/13/chartex" xmlns:cx8="http://schemas.microsoft.com/office/drawing/2016/5/14/chartex" xmlns:mc="http://schemas.openxmlformats.org/markup-compatibility/2006" xmlns:aink="http://schemas.microsoft.com/office/drawing/2016/ink" xmlns:am3d="http://schemas.microsoft.com/office/drawing/2017/model3d" xmlns:o="urn:schemas-microsoft-com:office:office" xmlns:oel="http://schemas.microsoft.com/office/2019/extlst" xmlns:r="http://schemas.openxmlformats.org/officeDocument/2006/relationships" xmlns:m="http://schemas.openxmlformats.org/officeDocument/2006/math" xmlns:v="urn:schemas-microsoft-com:vml" xmlns:wp14="http://schemas.microsoft.com/office/word/2010/wordprocessingDrawing" xmlns:wp="http://schemas.openxmlformats.org/drawingml/2006/wordprocessingDrawing" xmlns:w10="urn:schemas-microsoft-com:office:word" xmlns:w="http://schemas.openxmlformats.org/wordprocessingml/2006/main" xmlns:w14="http://schemas.microsoft.com/office/word/2010/wordml" xmlns:w15="http://schemas.microsoft.com/office/word/2012/wordml" xmlns:w16cex="http://schemas.microsoft.com/office/word/2018/wordml/cex" xmlns:w16cid="http://schemas.microsoft.com/office/word/2016/wordml/cid" xmlns:w16="http://schemas.microsoft.com/office/word/2018/wordml" xmlns:w16du="http://schemas.microsoft.com/office/word/2023/wordml/word16du" xmlns:w16sdtdh="http://schemas.microsoft.com/office/word/2020/wordml/sdtdatahash" xmlns:w16sdtfl="http://schemas.microsoft.com/office/word/2024/wordml/sdtformatlock" xmlns:w16se="http://schemas.microsoft.com/office/word/2015/wordml/symex" xmlns:wpg="http://schemas.microsoft.com/office/word/2010/wordprocessingGroup" xmlns:wpi="http://schemas.microsoft.com/office/word/2010/wordprocessingInk" xmlns:wne="http://schemas.microsoft.com/office/word/2006/wordml" xmlns:wps="http://schemas.microsoft.com/office/word/2010/wordprocessingShape" mc:Ignorable="w14 w15 w16se w16cid w16 w16cex w16sdtdh w16sdtfl w16du wp14">
   <w:abstractNum w:abstractNumId="0" w15:restartNumberingAfterBreak="0">
-    <w:nsid w:val="51AE34B6"/>
+    <w:nsid w:val="39FF34E6"/>
     <w:multiLevelType w:val="hybridMultilevel"/>
-    <w:tmpl w:val="9CDE92BE"/>
-    <w:lvl w:ilvl="0" w:tplc="F60A94F0">
+    <w:tmpl w:val="FA7CEE1E"/>
+    <w:lvl w:ilvl="0" w:tplc="7B68A80E">
       <w:start w:val="1"/>
       <w:numFmt w:val="bullet"/>
       <w:lvlText w:val="●"/>
@@ -1932,7 +1769,7 @@
         <w:ind w:left="720" w:hanging="360"/>
       </w:pPr>
     </w:lvl>
-    <w:lvl w:ilvl="1" w:tplc="4746BB68" w:tentative="1">
+    <w:lvl w:ilvl="1" w:tplc="AFA6EFD2" w:tentative="1">
       <w:start w:val="1"/>
       <w:numFmt w:val="bullet"/>
       <w:lvlText w:val="○"/>
@@ -1941,7 +1778,7 @@
         <w:ind w:left="1440" w:hanging="360"/>
       </w:pPr>
     </w:lvl>
-    <w:lvl w:ilvl="2" w:tplc="2946AF78" w:tentative="1">
+    <w:lvl w:ilvl="2" w:tplc="DE20EB4C" w:tentative="1">
       <w:start w:val="1"/>
       <w:numFmt w:val="bullet"/>
       <w:lvlText w:val="■"/>
@@ -1950,7 +1787,7 @@
         <w:ind w:left="2160" w:hanging="360"/>
       </w:pPr>
     </w:lvl>
-    <w:lvl w:ilvl="3" w:tplc="13F26F0A" w:tentative="1">
+    <w:lvl w:ilvl="3" w:tplc="8ABA6CFC" w:tentative="1">
       <w:start w:val="1"/>
       <w:numFmt w:val="bullet"/>
       <w:lvlText w:val="●"/>
@@ -1959,7 +1796,7 @@
         <w:ind w:left="2880" w:hanging="360"/>
       </w:pPr>
     </w:lvl>
-    <w:lvl w:ilvl="4" w:tplc="462C7156" w:tentative="1">
+    <w:lvl w:ilvl="4" w:tplc="60B6A540" w:tentative="1">
       <w:start w:val="1"/>
       <w:numFmt w:val="bullet"/>
       <w:lvlText w:val="○"/>
@@ -1968,7 +1805,7 @@
         <w:ind w:left="3600" w:hanging="360"/>
       </w:pPr>
     </w:lvl>
-    <w:lvl w:ilvl="5" w:tplc="6E4841DC" w:tentative="1">
+    <w:lvl w:ilvl="5" w:tplc="2A6CE6D0" w:tentative="1">
       <w:start w:val="1"/>
       <w:numFmt w:val="bullet"/>
       <w:lvlText w:val="■"/>
@@ -1977,7 +1814,7 @@
         <w:ind w:left="4320" w:hanging="360"/>
       </w:pPr>
     </w:lvl>
-    <w:lvl w:ilvl="6" w:tplc="ED54596A" w:tentative="1">
+    <w:lvl w:ilvl="6" w:tplc="5882D2EE" w:tentative="1">
       <w:start w:val="1"/>
       <w:numFmt w:val="bullet"/>
       <w:lvlText w:val="●"/>
@@ -1986,7 +1823,7 @@
         <w:ind w:left="5040" w:hanging="360"/>
       </w:pPr>
     </w:lvl>
-    <w:lvl w:ilvl="7" w:tplc="8D4058B4" w:tentative="1">
+    <w:lvl w:ilvl="7" w:tplc="997215B6" w:tentative="1">
       <w:start w:val="1"/>
       <w:numFmt w:val="bullet"/>
       <w:lvlText w:val="●"/>
@@ -1995,7 +1832,7 @@
         <w:ind w:left="5760" w:hanging="360"/>
       </w:pPr>
     </w:lvl>
-    <w:lvl w:ilvl="8" w:tplc="4C42EB52" w:tentative="1">
+    <w:lvl w:ilvl="8" w:tplc="42C85FAA" w:tentative="1">
       <w:start w:val="1"/>
       <w:numFmt w:val="bullet"/>
       <w:lvlText w:val="●"/>
@@ -2005,7 +1842,7 @@
       </w:pPr>
     </w:lvl>
   </w:abstractNum>
-  <w:num w:numId="1" w16cid:durableId="1598053816">
+  <w:num w:numId="1" w16cid:durableId="445077520">
     <w:abstractNumId w:val="0"/>
     <w:lvlOverride w:ilvl="0">
       <w:startOverride w:val="1"/>

</xml_diff>

<commit_message>
Explain ResNet18 and the random forest with diagrams in the talk
</commit_message>
<xml_diff>
--- a/presentation/oral_script.docx
+++ b/presentation/oral_script.docx
@@ -51,7 +51,7 @@
           <w:sz w:val="21"/>
           <w:szCs w:val="21"/>
         </w:rPr>
-        <w:t>About 1139 words: at a calm pace (about 130 words per minute), this is about 9 minutes. Without the 124 optional words, about 8 minutes. The rest of the 10 minutes is a safety margin for pauses, clicks and nerves.</w:t>
+        <w:t>About 1243 words: at a calm pace (about 130 words per minute), this is about 10 minutes. Without the 70 optional words, about 9 minutes. The rest of the 10 minutes is a safety margin for pauses, clicks and nerves.</w:t>
       </w:r>
     </w:p>
     <w:p>
@@ -119,7 +119,7 @@
           <w:sz w:val="21"/>
           <w:szCs w:val="21"/>
         </w:rPr>
-        <w:t>If you present with a teammate, a natural split is slides 1 to 5, then slides 6 to 9.</w:t>
+        <w:t>If you present with a teammate, a natural split is slides 1 to 5, then slides 6 to 11.</w:t>
       </w:r>
     </w:p>
     <w:p>
@@ -259,7 +259,7 @@
           <w:sz w:val="20"/>
           <w:szCs w:val="20"/>
         </w:rPr>
-        <w:t>We saw that ResNet18 reaches 88 percent on validation. But to answer the director, we also need a challenger without any neural network. So now, step five: the final test of every model.</w:t>
+        <w:t>We saw how ResNet18 works. So now, let's see what it gives on our paintings.</w:t>
       </w:r>
     </w:p>
     <w:p>
@@ -281,7 +281,7 @@
           <w:sz w:val="20"/>
           <w:szCs w:val="20"/>
         </w:rPr>
-        <w:t>We saw that the pretrained network is the most accurate. But accuracy is only half of the director's question. So now, step six: what does it cost on a kiosk?</w:t>
+        <w:t>We saw that ResNet18 reaches 88 percent. But to answer the director, we also need a challenger without any neural network. So now, step five: we build this classical challenger, then we test every model.</w:t>
       </w:r>
     </w:p>
     <w:p>
@@ -297,6 +297,50 @@
           <w:szCs w:val="20"/>
         </w:rPr>
         <w:t xml:space="preserve">8 to 9:  </w:t>
+      </w:r>
+      <w:r>
+        <w:rPr>
+          <w:sz w:val="20"/>
+          <w:szCs w:val="20"/>
+        </w:rPr>
+        <w:t>We saw how our challenger works. So now, the final test: every model, on 220 paintings never seen before.</w:t>
+      </w:r>
+    </w:p>
+    <w:p>
+      <w:pPr>
+        <w:spacing w:after="60"/>
+      </w:pPr>
+      <w:r>
+        <w:rPr>
+          <w:b/>
+          <w:bCs/>
+          <w:color w:val="1E6B45"/>
+          <w:sz w:val="20"/>
+          <w:szCs w:val="20"/>
+        </w:rPr>
+        <w:t xml:space="preserve">9 to 10:  </w:t>
+      </w:r>
+      <w:r>
+        <w:rPr>
+          <w:sz w:val="20"/>
+          <w:szCs w:val="20"/>
+        </w:rPr>
+        <w:t>We saw that the pretrained network is the most accurate. But accuracy is only half of the director's question. So now, step six: what does it cost on a kiosk?</w:t>
+      </w:r>
+    </w:p>
+    <w:p>
+      <w:pPr>
+        <w:spacing w:after="60"/>
+      </w:pPr>
+      <w:r>
+        <w:rPr>
+          <w:b/>
+          <w:bCs/>
+          <w:color w:val="1E6B45"/>
+          <w:sz w:val="20"/>
+          <w:szCs w:val="20"/>
+        </w:rPr>
+        <w:t xml:space="preserve">10 to 11:  </w:t>
       </w:r>
       <w:r>
         <w:rPr>
@@ -328,19 +372,19 @@
           <w:sz w:val="19"/>
           <w:szCs w:val="19"/>
         </w:rPr>
-        <w:t>0:00 to 0:45 · 45 s · 102 words</w:t>
-      </w:r>
-    </w:p>
-    <w:p>
-      <w:pPr>
-        <w:spacing w:after="160" w:line="320" w:lineRule="auto"/>
-      </w:pPr>
-      <w:r>
-        <w:rPr>
-          <w:sz w:val="25"/>
-          <w:szCs w:val="25"/>
-        </w:rPr>
-        <w:t>Good morning. Imagine you point your phone at a painting in a museum, and a guide tells you its style. Our museum wants exactly this, on visitors' phones and on kiosks in the galleries.</w:t>
+        <w:t>0:00 to 0:45 · 45 s · 98 words</w:t>
+      </w:r>
+    </w:p>
+    <w:p>
+      <w:pPr>
+        <w:spacing w:after="160" w:line="320" w:lineRule="auto"/>
+      </w:pPr>
+      <w:r>
+        <w:rPr>
+          <w:sz w:val="25"/>
+          <w:szCs w:val="25"/>
+        </w:rPr>
+        <w:t>Good morning. Imagine you point your phone at a painting in a museum, and a guide tells you its style. Our museum wants exactly this, on kiosks in its galleries.</w:t>
       </w:r>
     </w:p>
     <w:p>
@@ -455,7 +499,7 @@
           <w:sz w:val="19"/>
           <w:szCs w:val="19"/>
         </w:rPr>
-        <w:t>0:45 to 1:25 · 40 s · 89 words</w:t>
+        <w:t>0:45 to 1:20 · 35 s · 80 words</w:t>
       </w:r>
     </w:p>
     <w:p>
@@ -477,7 +521,7 @@
           <w:sz w:val="25"/>
           <w:szCs w:val="25"/>
         </w:rPr>
-        <w:t xml:space="preserve"> Step one: the data, and a fair test. Step two: our own neural network. Step three: we monitor its training, diagnose what goes wrong and fix it. Step four: a pretrained convolutional network, ResNet18. Step five: a final test of every model, classical models included. Step six: the cost on a kiosk CPU.</w:t>
+        <w:t xml:space="preserve"> Step one: the data, and a fair test. Step two: our own neural network. Step three: we monitor its training and fix it. Step four: a pretrained ResNet18. Step five: a final test against a classical model. Step six: the cost on a kiosk.</w:t>
       </w:r>
     </w:p>
     <w:p>
@@ -564,29 +608,19 @@
           <w:sz w:val="19"/>
           <w:szCs w:val="19"/>
         </w:rPr>
-        <w:t>1:25 to 2:30 · 65 s · 139 words</w:t>
-      </w:r>
-    </w:p>
-    <w:p>
-      <w:pPr>
-        <w:spacing w:after="160" w:line="320" w:lineRule="auto"/>
-      </w:pPr>
-      <w:r>
-        <w:rPr>
-          <w:sz w:val="25"/>
-          <w:szCs w:val="25"/>
-        </w:rPr>
-        <w:t xml:space="preserve">We took 1 500 paintings from WikiArt, 300 per style. </w:t>
-      </w:r>
-      <w:r>
-        <w:rPr>
-          <w:i/>
-          <w:iCs/>
-          <w:color w:val="8A8F9C"/>
-          <w:sz w:val="25"/>
-          <w:szCs w:val="25"/>
-        </w:rPr>
-        <w:t>(optional) We used the course script with a fixed seed: anyone can download the same images.</w:t>
+        <w:t>1:20 to 2:15 · 55 s · 124 words</w:t>
+      </w:r>
+    </w:p>
+    <w:p>
+      <w:pPr>
+        <w:spacing w:after="160" w:line="320" w:lineRule="auto"/>
+      </w:pPr>
+      <w:r>
+        <w:rPr>
+          <w:sz w:val="25"/>
+          <w:szCs w:val="25"/>
+        </w:rPr>
+        <w:t>We took 1 500 paintings from WikiArt, 300 per style.</w:t>
       </w:r>
     </w:p>
     <w:p>
@@ -725,7 +759,7 @@
           <w:sz w:val="19"/>
           <w:szCs w:val="19"/>
         </w:rPr>
-        <w:t>2:30 to 3:35 · 65 s · 146 words</w:t>
+        <w:t>2:15 to 3:20 · 65 s · 137 words</w:t>
       </w:r>
     </w:p>
     <w:p>
@@ -789,23 +823,6 @@
           <w:szCs w:val="25"/>
         </w:rPr>
         <w:t xml:space="preserve"> The training accuracy goes to 99.7 percent, but the validation accuracy stays around 40 percent. </w:t>
-      </w:r>
-      <w:r>
-        <w:rPr>
-          <w:i/>
-          <w:iCs/>
-          <w:color w:val="8A8F9C"/>
-          <w:sz w:val="25"/>
-          <w:szCs w:val="25"/>
-        </w:rPr>
-        <w:t>(optional) And the validation loss goes up after epoch 3.</w:t>
-      </w:r>
-      <w:r>
-        <w:rPr>
-          <w:sz w:val="25"/>
-          <w:szCs w:val="25"/>
-        </w:rPr>
-        <w:t xml:space="preserve"> </w:t>
       </w:r>
       <w:r>
         <w:rPr>
@@ -888,7 +905,7 @@
           <w:sz w:val="19"/>
           <w:szCs w:val="19"/>
         </w:rPr>
-        <w:t>3:35 to 4:35 · 60 s · 135 words</w:t>
+        <w:t>3:20 to 4:20 · 60 s · 129 words</w:t>
       </w:r>
     </w:p>
     <w:p>
@@ -929,7 +946,7 @@
           <w:sz w:val="25"/>
           <w:szCs w:val="25"/>
         </w:rPr>
-        <w:t xml:space="preserve"> Alone, each tool helps a little. All together, weight decay, dropout, batch norm, flips and early stopping take the MLP from 38.8 to 45.5 percent, and the gap between train and validation from 0.61 to 0.12.</w:t>
+        <w:t xml:space="preserve"> All together, weight decay, dropout, batch norm, flips and early stopping take the MLP from 38.8 to 45.5 percent, and the gap between train and validation from 0.61 to 0.12.</w:t>
       </w:r>
     </w:p>
     <w:p>
@@ -1008,7 +1025,7 @@
         <w:keepNext/>
       </w:pPr>
       <w:r>
-        <w:t>Slide 6 · A pretrained ResNet18 sees shapes</w:t>
+        <w:t>Slide 6 · ResNet18: a network made for images</w:t>
       </w:r>
     </w:p>
     <w:p>
@@ -1022,32 +1039,25 @@
           <w:sz w:val="19"/>
           <w:szCs w:val="19"/>
         </w:rPr>
-        <w:t>4:35 to 5:40 · 65 s · 144 words</w:t>
-      </w:r>
-    </w:p>
-    <w:p>
-      <w:pPr>
-        <w:spacing w:after="160" w:line="320" w:lineRule="auto"/>
-      </w:pPr>
-      <w:r>
-        <w:rPr>
-          <w:sz w:val="25"/>
-          <w:szCs w:val="25"/>
-        </w:rPr>
-        <w:t>A convolutional network sees shapes. But with only 1 061 images, we cannot train one from zero. So we reuse ResNet18, already trained on 1.2 million ImageNet photos.</w:t>
-      </w:r>
-    </w:p>
-    <w:p>
-      <w:pPr>
-        <w:spacing w:after="160" w:line="320" w:lineRule="auto"/>
-      </w:pPr>
-      <w:r>
-        <w:rPr>
-          <w:sz w:val="25"/>
-          <w:szCs w:val="25"/>
-        </w:rPr>
-        <w:t xml:space="preserve">We freeze it: each painting becomes 512 numbers, and we train only one linear layer, 2 565 weights, in less than a second. </w:t>
-      </w:r>
+        <w:t>4:20 to 5:20 · 60 s · 132 words</w:t>
+      </w:r>
+    </w:p>
+    <w:p>
+      <w:pPr>
+        <w:spacing w:after="160" w:line="320" w:lineRule="auto"/>
+      </w:pPr>
+      <w:r>
+        <w:rPr>
+          <w:sz w:val="25"/>
+          <w:szCs w:val="25"/>
+        </w:rPr>
+        <w:t>There is a type of network made for images, which recognises shapes: the convolutional network. We used ResNet18, the smallest ResNet.</w:t>
+      </w:r>
+    </w:p>
+    <w:p>
+      <w:pPr>
+        <w:spacing w:after="160" w:line="320" w:lineRule="auto"/>
+      </w:pPr>
       <w:r>
         <w:rPr>
           <w:i/>
@@ -1056,36 +1066,27 @@
           <w:sz w:val="21"/>
           <w:szCs w:val="21"/>
         </w:rPr>
-        <w:t>[point at the blue bar]</w:t>
-      </w:r>
-      <w:r>
-        <w:rPr>
-          <w:sz w:val="25"/>
-          <w:szCs w:val="25"/>
-        </w:rPr>
-        <w:t xml:space="preserve"> </w:t>
-      </w:r>
-      <w:r>
-        <w:rPr>
-          <w:b/>
-          <w:bCs/>
-          <w:sz w:val="25"/>
-          <w:szCs w:val="25"/>
-        </w:rPr>
-        <w:t>Result: 88.1 percent on validation, almost twice our best MLP.</w:t>
-      </w:r>
-      <w:r>
-        <w:rPr>
-          <w:sz w:val="25"/>
-          <w:szCs w:val="25"/>
-        </w:rPr>
-        <w:t xml:space="preserve"> We also fine-tuned the last block: 8.4 million weights for 1 061 images. It overfits: 85.4 percent.</w:t>
-      </w:r>
-    </w:p>
-    <w:p>
-      <w:pPr>
-        <w:spacing w:after="160" w:line="320" w:lineRule="auto"/>
-      </w:pPr>
+        <w:t>[point at the dark box]</w:t>
+      </w:r>
+      <w:r>
+        <w:rPr>
+          <w:sz w:val="25"/>
+          <w:szCs w:val="25"/>
+        </w:rPr>
+        <w:t xml:space="preserve"> Its 18 layers slide small filters over the picture: the first layers find edges and colours, the next ones textures, the last ones shapes. Our MLP saw 12 288 separate pixels.</w:t>
+      </w:r>
+    </w:p>
+    <w:p>
+      <w:pPr>
+        <w:spacing w:after="160" w:line="320" w:lineRule="auto"/>
+      </w:pPr>
+      <w:r>
+        <w:rPr>
+          <w:sz w:val="25"/>
+          <w:szCs w:val="25"/>
+        </w:rPr>
+        <w:t xml:space="preserve">ResNet18 already learned all this on 1.2 million ImageNet photos. We only have 1 061 paintings, so we keep it as it is: it is frozen. </w:t>
+      </w:r>
       <w:r>
         <w:rPr>
           <w:i/>
@@ -1094,23 +1095,40 @@
           <w:sz w:val="21"/>
           <w:szCs w:val="21"/>
         </w:rPr>
-        <w:t>[point at the bottom card]</w:t>
-      </w:r>
-      <w:r>
-        <w:rPr>
-          <w:sz w:val="25"/>
-          <w:szCs w:val="25"/>
-        </w:rPr>
-        <w:t xml:space="preserve"> We monitored it like the MLP, with train and validation curves: the gap between them is only 0.09, against 0.61 for our first MLP. </w:t>
-      </w:r>
-      <w:r>
-        <w:rPr>
-          <w:b/>
-          <w:bCs/>
-          <w:sz w:val="25"/>
-          <w:szCs w:val="25"/>
-        </w:rPr>
-        <w:t>It learns the styles, not the paintings by heart.</w:t>
+        <w:t>[point at the 512 numbers]</w:t>
+      </w:r>
+      <w:r>
+        <w:rPr>
+          <w:sz w:val="25"/>
+          <w:szCs w:val="25"/>
+        </w:rPr>
+        <w:t xml:space="preserve"> It turns each painting into 512 numbers. </w:t>
+      </w:r>
+      <w:r>
+        <w:rPr>
+          <w:i/>
+          <w:iCs/>
+          <w:color w:val="1C5FB0"/>
+          <w:sz w:val="21"/>
+          <w:szCs w:val="21"/>
+        </w:rPr>
+        <w:t>[point at the blue box]</w:t>
+      </w:r>
+      <w:r>
+        <w:rPr>
+          <w:sz w:val="25"/>
+          <w:szCs w:val="25"/>
+        </w:rPr>
+        <w:t xml:space="preserve"> We train only the last layer, which turns these 512 numbers into our 5 styles: 2 565 weights. </w:t>
+      </w:r>
+      <w:r>
+        <w:rPr>
+          <w:b/>
+          <w:bCs/>
+          <w:sz w:val="25"/>
+          <w:szCs w:val="25"/>
+        </w:rPr>
+        <w:t>Like hiring an experienced art expert, and only teaching them our five style names.</w:t>
       </w:r>
     </w:p>
     <w:p>
@@ -1149,17 +1167,17 @@
           <w:sz w:val="25"/>
           <w:szCs w:val="25"/>
         </w:rPr>
-        <w:t xml:space="preserve">We saw that ResNet18 reaches 88 percent on validation. But to answer the director, we also need a challenger without any neural network. </w:t>
-      </w:r>
-      <w:r>
-        <w:rPr>
-          <w:b/>
-          <w:bCs/>
-          <w:color w:val="1E6B45"/>
-          <w:sz w:val="25"/>
-          <w:szCs w:val="25"/>
-        </w:rPr>
-        <w:t>So now, step five: the final test of every model.</w:t>
+        <w:t xml:space="preserve">We saw how ResNet18 works. </w:t>
+      </w:r>
+      <w:r>
+        <w:rPr>
+          <w:b/>
+          <w:bCs/>
+          <w:color w:val="1E6B45"/>
+          <w:sz w:val="25"/>
+          <w:szCs w:val="25"/>
+        </w:rPr>
+        <w:t>So now, let's see what it gives on our paintings.</w:t>
       </w:r>
     </w:p>
     <w:p>
@@ -1170,7 +1188,7 @@
       </w:pPr>
       <w:r>
         <w:lastRenderedPageBreak/>
-        <w:t>Slide 7 · Final test: the pretrained network wins</w:t>
+        <w:t>Slide 7 · A pretrained ResNet18 sees shapes</w:t>
       </w:r>
     </w:p>
     <w:p>
@@ -1184,32 +1202,13 @@
           <w:sz w:val="19"/>
           <w:szCs w:val="19"/>
         </w:rPr>
-        <w:t>5:40 to 7:00 · 80 s · 170 words</w:t>
-      </w:r>
-    </w:p>
-    <w:p>
-      <w:pPr>
-        <w:spacing w:after="160" w:line="320" w:lineRule="auto"/>
-      </w:pPr>
-      <w:r>
-        <w:rPr>
-          <w:sz w:val="25"/>
-          <w:szCs w:val="25"/>
-        </w:rPr>
-        <w:t>Our classical challenger does not read pixels. We describe each painting with 102 hand-made numbers, its colours and the directions of its brush strokes, and train a random forest on them: 500 small decision trees that vote.</w:t>
-      </w:r>
-    </w:p>
-    <w:p>
-      <w:pPr>
-        <w:spacing w:after="160" w:line="320" w:lineRule="auto"/>
-      </w:pPr>
-      <w:r>
-        <w:rPr>
-          <w:sz w:val="25"/>
-          <w:szCs w:val="25"/>
-        </w:rPr>
-        <w:t xml:space="preserve">Then we opened the 220 test paintings, only once, for every model. </w:t>
-      </w:r>
+        <w:t>5:20 to 6:15 · 55 s · 115 words</w:t>
+      </w:r>
+    </w:p>
+    <w:p>
+      <w:pPr>
+        <w:spacing w:after="160" w:line="320" w:lineRule="auto"/>
+      </w:pPr>
       <w:r>
         <w:rPr>
           <w:i/>
@@ -1218,26 +1217,30 @@
           <w:sz w:val="21"/>
           <w:szCs w:val="21"/>
         </w:rPr>
-        <w:t>[point at the top bars]</w:t>
-      </w:r>
-      <w:r>
-        <w:rPr>
-          <w:sz w:val="25"/>
-          <w:szCs w:val="25"/>
-        </w:rPr>
-        <w:t xml:space="preserve"> The pretrained models are at the top, from 83 to 88 percent. The random forest reaches 67; our MLP 41.</w:t>
-      </w:r>
-    </w:p>
-    <w:p>
-      <w:pPr>
-        <w:spacing w:after="160" w:line="320" w:lineRule="auto"/>
-      </w:pPr>
-      <w:r>
-        <w:rPr>
-          <w:sz w:val="25"/>
-          <w:szCs w:val="25"/>
-        </w:rPr>
-        <w:t xml:space="preserve">Is the gap real? </w:t>
+        <w:t>[point at the blue bar]</w:t>
+      </w:r>
+      <w:r>
+        <w:rPr>
+          <w:sz w:val="25"/>
+          <w:szCs w:val="25"/>
+        </w:rPr>
+        <w:t xml:space="preserve"> Training this last layer takes less than a second, and gives </w:t>
+      </w:r>
+      <w:r>
+        <w:rPr>
+          <w:b/>
+          <w:bCs/>
+          <w:sz w:val="25"/>
+          <w:szCs w:val="25"/>
+        </w:rPr>
+        <w:t>88.1 percent on validation, almost twice our best MLP.</w:t>
+      </w:r>
+      <w:r>
+        <w:rPr>
+          <w:sz w:val="25"/>
+          <w:szCs w:val="25"/>
+        </w:rPr>
+        <w:t xml:space="preserve"> </w:t>
       </w:r>
       <w:r>
         <w:rPr>
@@ -1247,23 +1250,26 @@
           <w:sz w:val="21"/>
           <w:szCs w:val="21"/>
         </w:rPr>
-        <w:t>[point at the blue card]</w:t>
-      </w:r>
-      <w:r>
-        <w:rPr>
-          <w:sz w:val="25"/>
-          <w:szCs w:val="25"/>
-        </w:rPr>
-        <w:t xml:space="preserve"> A paired bootstrap on the same test paintings gives our model a lead of </w:t>
-      </w:r>
-      <w:r>
-        <w:rPr>
-          <w:b/>
-          <w:bCs/>
-          <w:sz w:val="25"/>
-          <w:szCs w:val="25"/>
-        </w:rPr>
-        <w:t>16.4 points over the random forest, between 9 and 24 points: it is not luck.</w:t>
+        <w:t>[point at the top card]</w:t>
+      </w:r>
+      <w:r>
+        <w:rPr>
+          <w:sz w:val="25"/>
+          <w:szCs w:val="25"/>
+        </w:rPr>
+        <w:t xml:space="preserve"> And it does see shapes: it finds 71 percent of the Cubist paintings, against 7 for our MLP.</w:t>
+      </w:r>
+    </w:p>
+    <w:p>
+      <w:pPr>
+        <w:spacing w:after="160" w:line="320" w:lineRule="auto"/>
+      </w:pPr>
+      <w:r>
+        <w:rPr>
+          <w:sz w:val="25"/>
+          <w:szCs w:val="25"/>
+        </w:rPr>
+        <w:t>We also tried fine-tuning, letting its last block learn too: 8.4 million weights for 1 061 paintings. It overfits: 85.4 percent.</w:t>
       </w:r>
     </w:p>
     <w:p>
@@ -1278,24 +1284,14 @@
           <w:sz w:val="21"/>
           <w:szCs w:val="21"/>
         </w:rPr>
-        <w:t>[point at the grey card]</w:t>
-      </w:r>
-      <w:r>
-        <w:rPr>
-          <w:sz w:val="25"/>
-          <w:szCs w:val="25"/>
-        </w:rPr>
-        <w:t xml:space="preserve"> </w:t>
-      </w:r>
-      <w:r>
-        <w:rPr>
-          <w:i/>
-          <w:iCs/>
-          <w:color w:val="8A8F9C"/>
-          <w:sz w:val="25"/>
-          <w:szCs w:val="25"/>
-        </w:rPr>
-        <w:t>(optional) One honest note: the fine-tuned model is first on the test, but it was second on validation. With 220 images, a score moves by about 5 points by chance, so we keep the model chosen before the test.</w:t>
+        <w:t>[point at the bottom card]</w:t>
+      </w:r>
+      <w:r>
+        <w:rPr>
+          <w:sz w:val="25"/>
+          <w:szCs w:val="25"/>
+        </w:rPr>
+        <w:t xml:space="preserve"> We monitored it like the MLP: the gap between train and validation is only 0.09, against 0.61 for our first MLP.</w:t>
       </w:r>
     </w:p>
     <w:p>
@@ -1334,17 +1330,17 @@
           <w:sz w:val="25"/>
           <w:szCs w:val="25"/>
         </w:rPr>
-        <w:t xml:space="preserve">We saw that the pretrained network is the most accurate. But accuracy is only half of the director's question. </w:t>
-      </w:r>
-      <w:r>
-        <w:rPr>
-          <w:b/>
-          <w:bCs/>
-          <w:color w:val="1E6B45"/>
-          <w:sz w:val="25"/>
-          <w:szCs w:val="25"/>
-        </w:rPr>
-        <w:t>So now, step six: what does it cost on a kiosk?</w:t>
+        <w:t xml:space="preserve">We saw that ResNet18 reaches 88 percent. But to answer the director, we also need a challenger without any neural network. </w:t>
+      </w:r>
+      <w:r>
+        <w:rPr>
+          <w:b/>
+          <w:bCs/>
+          <w:color w:val="1E6B45"/>
+          <w:sz w:val="25"/>
+          <w:szCs w:val="25"/>
+        </w:rPr>
+        <w:t>So now, step five: we build this classical challenger, then we test every model.</w:t>
       </w:r>
     </w:p>
     <w:p>
@@ -1353,7 +1349,7 @@
         <w:keepNext/>
       </w:pPr>
       <w:r>
-        <w:t>Slide 8 · Fast and cheap enough for a kiosk</w:t>
+        <w:t>Slide 8 · Our classical challenger: a random forest</w:t>
       </w:r>
     </w:p>
     <w:p>
@@ -1367,19 +1363,19 @@
           <w:sz w:val="19"/>
           <w:szCs w:val="19"/>
         </w:rPr>
-        <w:t>7:00 to 7:40 · 40 s · 87 words</w:t>
-      </w:r>
-    </w:p>
-    <w:p>
-      <w:pPr>
-        <w:spacing w:after="160" w:line="320" w:lineRule="auto"/>
-      </w:pPr>
-      <w:r>
-        <w:rPr>
-          <w:sz w:val="25"/>
-          <w:szCs w:val="25"/>
-        </w:rPr>
-        <w:t xml:space="preserve">We timed one photo at a time, from the image to the answer. </w:t>
+        <w:t>6:15 to 7:05 · 50 s · 112 words</w:t>
+      </w:r>
+    </w:p>
+    <w:p>
+      <w:pPr>
+        <w:spacing w:after="160" w:line="320" w:lineRule="auto"/>
+      </w:pPr>
+      <w:r>
+        <w:rPr>
+          <w:sz w:val="25"/>
+          <w:szCs w:val="25"/>
+        </w:rPr>
+        <w:t xml:space="preserve">A classical model cannot read raw pixels well. So we first describe each painting with 102 hand-made numbers: </w:t>
       </w:r>
       <w:r>
         <w:rPr>
@@ -1389,52 +1385,67 @@
           <w:sz w:val="21"/>
           <w:szCs w:val="21"/>
         </w:rPr>
-        <w:t>[point at the blue card]</w:t>
-      </w:r>
-      <w:r>
-        <w:rPr>
-          <w:sz w:val="25"/>
-          <w:szCs w:val="25"/>
-        </w:rPr>
-        <w:t xml:space="preserve"> The ResNet needs </w:t>
-      </w:r>
-      <w:r>
-        <w:rPr>
-          <w:b/>
-          <w:bCs/>
-          <w:sz w:val="25"/>
-          <w:szCs w:val="25"/>
-        </w:rPr>
-        <w:t>53 milliseconds on one CPU thread</w:t>
-      </w:r>
-      <w:r>
-        <w:rPr>
-          <w:sz w:val="25"/>
-          <w:szCs w:val="25"/>
-        </w:rPr>
-        <w:t>, 26 with four threads: faster than a blink. Even on a kiosk four times slower, it answers in a fifth of a second.</w:t>
-      </w:r>
-    </w:p>
-    <w:p>
-      <w:pPr>
-        <w:spacing w:after="160" w:line="320" w:lineRule="auto"/>
-      </w:pPr>
-      <w:r>
-        <w:rPr>
-          <w:sz w:val="25"/>
-          <w:szCs w:val="25"/>
-        </w:rPr>
-        <w:t xml:space="preserve">The model file is 45 megabytes. </w:t>
-      </w:r>
+        <w:t>[point at the second box]</w:t>
+      </w:r>
+      <w:r>
+        <w:rPr>
+          <w:sz w:val="25"/>
+          <w:szCs w:val="25"/>
+        </w:rPr>
+        <w:t xml:space="preserve"> 82 for its colours, and 20 for the direction and strength of its brush strokes.</w:t>
+      </w:r>
+    </w:p>
+    <w:p>
+      <w:pPr>
+        <w:spacing w:after="160" w:line="320" w:lineRule="auto"/>
+      </w:pPr>
       <w:r>
         <w:rPr>
           <w:i/>
           <w:iCs/>
-          <w:color w:val="8A8F9C"/>
-          <w:sz w:val="25"/>
-          <w:szCs w:val="25"/>
-        </w:rPr>
-        <w:t>(optional) And when the collection changes, we only recompute the features and retrain one layer, in seconds.</w:t>
+          <w:color w:val="1C5FB0"/>
+          <w:sz w:val="21"/>
+          <w:szCs w:val="21"/>
+        </w:rPr>
+        <w:t>[point at the tree]</w:t>
+      </w:r>
+      <w:r>
+        <w:rPr>
+          <w:sz w:val="25"/>
+          <w:szCs w:val="25"/>
+        </w:rPr>
+        <w:t xml:space="preserve"> Then a random forest: 500 decision trees. Each tree asks yes or no questions on these numbers, like "many dark colours?", until it names a style. Each one learns from a random draw of the paintings, so they make different mistakes. </w:t>
+      </w:r>
+      <w:r>
+        <w:rPr>
+          <w:b/>
+          <w:bCs/>
+          <w:sz w:val="25"/>
+          <w:szCs w:val="25"/>
+        </w:rPr>
+        <w:t>They vote, and the vote cancels the mistakes.</w:t>
+      </w:r>
+    </w:p>
+    <w:p>
+      <w:pPr>
+        <w:spacing w:after="160" w:line="320" w:lineRule="auto"/>
+      </w:pPr>
+      <w:r>
+        <w:rPr>
+          <w:i/>
+          <w:iCs/>
+          <w:color w:val="1C5FB0"/>
+          <w:sz w:val="21"/>
+          <w:szCs w:val="21"/>
+        </w:rPr>
+        <w:t>[point at the right card]</w:t>
+      </w:r>
+      <w:r>
+        <w:rPr>
+          <w:sz w:val="25"/>
+          <w:szCs w:val="25"/>
+        </w:rPr>
+        <w:t xml:space="preserve"> Like every model, we chose its settings on validation: 63.5 percent.</w:t>
       </w:r>
     </w:p>
     <w:p>
@@ -1473,17 +1484,17 @@
           <w:sz w:val="25"/>
           <w:szCs w:val="25"/>
         </w:rPr>
-        <w:t xml:space="preserve">We saw that it is accurate, fast and cheap. </w:t>
-      </w:r>
-      <w:r>
-        <w:rPr>
-          <w:b/>
-          <w:bCs/>
-          <w:color w:val="1E6B45"/>
-          <w:sz w:val="25"/>
-          <w:szCs w:val="25"/>
-        </w:rPr>
-        <w:t>So now, we have everything we need to answer the director.</w:t>
+        <w:t xml:space="preserve">We saw how our challenger works. </w:t>
+      </w:r>
+      <w:r>
+        <w:rPr>
+          <w:b/>
+          <w:bCs/>
+          <w:color w:val="1E6B45"/>
+          <w:sz w:val="25"/>
+          <w:szCs w:val="25"/>
+        </w:rPr>
+        <w:t>So now, the final test: every model, on 220 paintings never seen before.</w:t>
       </w:r>
     </w:p>
     <w:p>
@@ -1494,7 +1505,7 @@
       </w:pPr>
       <w:r>
         <w:lastRenderedPageBreak/>
-        <w:t>Slide 9 · Our choice: frozen ResNet18 + linear head</w:t>
+        <w:t>Slide 9 · Final test: the pretrained network wins</w:t>
       </w:r>
     </w:p>
     <w:p>
@@ -1508,7 +1519,309 @@
           <w:sz w:val="19"/>
           <w:szCs w:val="19"/>
         </w:rPr>
-        <w:t>7:40 to 8:40 · 60 s · 127 words</w:t>
+        <w:t>7:05 to 8:00 · 55 s · 118 words</w:t>
+      </w:r>
+    </w:p>
+    <w:p>
+      <w:pPr>
+        <w:spacing w:after="160" w:line="320" w:lineRule="auto"/>
+      </w:pPr>
+      <w:r>
+        <w:rPr>
+          <w:sz w:val="25"/>
+          <w:szCs w:val="25"/>
+        </w:rPr>
+        <w:t xml:space="preserve">We opened the 220 test paintings only once, for every model. </w:t>
+      </w:r>
+      <w:r>
+        <w:rPr>
+          <w:i/>
+          <w:iCs/>
+          <w:color w:val="1C5FB0"/>
+          <w:sz w:val="21"/>
+          <w:szCs w:val="21"/>
+        </w:rPr>
+        <w:t>[point at the top bars]</w:t>
+      </w:r>
+      <w:r>
+        <w:rPr>
+          <w:sz w:val="25"/>
+          <w:szCs w:val="25"/>
+        </w:rPr>
+        <w:t xml:space="preserve"> The pretrained models are at the top, from 83 to 88 percent. The random forest reaches 67; our MLP 41.</w:t>
+      </w:r>
+    </w:p>
+    <w:p>
+      <w:pPr>
+        <w:spacing w:after="160" w:line="320" w:lineRule="auto"/>
+      </w:pPr>
+      <w:r>
+        <w:rPr>
+          <w:sz w:val="25"/>
+          <w:szCs w:val="25"/>
+        </w:rPr>
+        <w:t xml:space="preserve">Is the gap real? </w:t>
+      </w:r>
+      <w:r>
+        <w:rPr>
+          <w:i/>
+          <w:iCs/>
+          <w:color w:val="1C5FB0"/>
+          <w:sz w:val="21"/>
+          <w:szCs w:val="21"/>
+        </w:rPr>
+        <w:t>[point at the blue card]</w:t>
+      </w:r>
+      <w:r>
+        <w:rPr>
+          <w:sz w:val="25"/>
+          <w:szCs w:val="25"/>
+        </w:rPr>
+        <w:t xml:space="preserve"> A paired bootstrap on the same test paintings gives our model a lead of </w:t>
+      </w:r>
+      <w:r>
+        <w:rPr>
+          <w:b/>
+          <w:bCs/>
+          <w:sz w:val="25"/>
+          <w:szCs w:val="25"/>
+        </w:rPr>
+        <w:t>16.4 points over the random forest, between 9 and 24 points: it is not luck.</w:t>
+      </w:r>
+    </w:p>
+    <w:p>
+      <w:pPr>
+        <w:spacing w:after="160" w:line="320" w:lineRule="auto"/>
+      </w:pPr>
+      <w:r>
+        <w:rPr>
+          <w:i/>
+          <w:iCs/>
+          <w:color w:val="1C5FB0"/>
+          <w:sz w:val="21"/>
+          <w:szCs w:val="21"/>
+        </w:rPr>
+        <w:t>[point at the grey card]</w:t>
+      </w:r>
+      <w:r>
+        <w:rPr>
+          <w:sz w:val="25"/>
+          <w:szCs w:val="25"/>
+        </w:rPr>
+        <w:t xml:space="preserve"> </w:t>
+      </w:r>
+      <w:r>
+        <w:rPr>
+          <w:i/>
+          <w:iCs/>
+          <w:color w:val="8A8F9C"/>
+          <w:sz w:val="25"/>
+          <w:szCs w:val="25"/>
+        </w:rPr>
+        <w:t>(optional) One honest note: the fine-tuned model is first here, but it was second on validation, and we keep the model chosen before the test.</w:t>
+      </w:r>
+    </w:p>
+    <w:p>
+      <w:pPr>
+        <w:keepNext/>
+        <w:pBdr>
+          <w:left w:val="single" w:sz="18" w:space="8" w:color="1E6B45"/>
+        </w:pBdr>
+        <w:shd w:val="clear" w:color="auto" w:fill="EAF5EE"/>
+        <w:spacing w:before="60"/>
+        <w:ind w:left="170" w:right="170"/>
+      </w:pPr>
+      <w:r>
+        <w:rPr>
+          <w:b/>
+          <w:bCs/>
+          <w:color w:val="1E6B45"/>
+          <w:sz w:val="17"/>
+          <w:szCs w:val="17"/>
+        </w:rPr>
+        <w:t>TRANSITION TO SLIDE 10</w:t>
+      </w:r>
+    </w:p>
+    <w:p>
+      <w:pPr>
+        <w:pBdr>
+          <w:left w:val="single" w:sz="18" w:space="8" w:color="1E6B45"/>
+        </w:pBdr>
+        <w:shd w:val="clear" w:color="auto" w:fill="EAF5EE"/>
+        <w:spacing w:after="200" w:line="320" w:lineRule="auto"/>
+        <w:ind w:left="170" w:right="170"/>
+      </w:pPr>
+      <w:r>
+        <w:rPr>
+          <w:color w:val="1E6B45"/>
+          <w:sz w:val="25"/>
+          <w:szCs w:val="25"/>
+        </w:rPr>
+        <w:t xml:space="preserve">We saw that the pretrained network is the most accurate. But accuracy is only half of the director's question. </w:t>
+      </w:r>
+      <w:r>
+        <w:rPr>
+          <w:b/>
+          <w:bCs/>
+          <w:color w:val="1E6B45"/>
+          <w:sz w:val="25"/>
+          <w:szCs w:val="25"/>
+        </w:rPr>
+        <w:t>So now, step six: what does it cost on a kiosk?</w:t>
+      </w:r>
+    </w:p>
+    <w:p>
+      <w:pPr>
+        <w:pStyle w:val="Titre1"/>
+        <w:keepNext/>
+      </w:pPr>
+      <w:r>
+        <w:t>Slide 10 · Fast and cheap enough for a kiosk</w:t>
+      </w:r>
+    </w:p>
+    <w:p>
+      <w:pPr>
+        <w:keepNext/>
+        <w:spacing w:after="160"/>
+      </w:pPr>
+      <w:r>
+        <w:rPr>
+          <w:color w:val="5F6473"/>
+          <w:sz w:val="19"/>
+          <w:szCs w:val="19"/>
+        </w:rPr>
+        <w:t>8:00 to 8:35 · 35 s · 71 words</w:t>
+      </w:r>
+    </w:p>
+    <w:p>
+      <w:pPr>
+        <w:spacing w:after="160" w:line="320" w:lineRule="auto"/>
+      </w:pPr>
+      <w:r>
+        <w:rPr>
+          <w:sz w:val="25"/>
+          <w:szCs w:val="25"/>
+        </w:rPr>
+        <w:t xml:space="preserve">We timed one photo at a time, from the image to the answer. </w:t>
+      </w:r>
+      <w:r>
+        <w:rPr>
+          <w:i/>
+          <w:iCs/>
+          <w:color w:val="1C5FB0"/>
+          <w:sz w:val="21"/>
+          <w:szCs w:val="21"/>
+        </w:rPr>
+        <w:t>[point at the blue card]</w:t>
+      </w:r>
+      <w:r>
+        <w:rPr>
+          <w:sz w:val="25"/>
+          <w:szCs w:val="25"/>
+        </w:rPr>
+        <w:t xml:space="preserve"> The ResNet needs </w:t>
+      </w:r>
+      <w:r>
+        <w:rPr>
+          <w:b/>
+          <w:bCs/>
+          <w:sz w:val="25"/>
+          <w:szCs w:val="25"/>
+        </w:rPr>
+        <w:t>53 milliseconds on one CPU thread</w:t>
+      </w:r>
+      <w:r>
+        <w:rPr>
+          <w:sz w:val="25"/>
+          <w:szCs w:val="25"/>
+        </w:rPr>
+        <w:t>, 26 with four threads: faster than a blink. Even on a kiosk four times slower, it answers in a fifth of a second.</w:t>
+      </w:r>
+    </w:p>
+    <w:p>
+      <w:pPr>
+        <w:spacing w:after="160" w:line="320" w:lineRule="auto"/>
+      </w:pPr>
+      <w:r>
+        <w:rPr>
+          <w:sz w:val="25"/>
+          <w:szCs w:val="25"/>
+        </w:rPr>
+        <w:t>The model file is 45 megabytes.</w:t>
+      </w:r>
+    </w:p>
+    <w:p>
+      <w:pPr>
+        <w:keepNext/>
+        <w:pBdr>
+          <w:left w:val="single" w:sz="18" w:space="8" w:color="1E6B45"/>
+        </w:pBdr>
+        <w:shd w:val="clear" w:color="auto" w:fill="EAF5EE"/>
+        <w:spacing w:before="60"/>
+        <w:ind w:left="170" w:right="170"/>
+      </w:pPr>
+      <w:r>
+        <w:rPr>
+          <w:b/>
+          <w:bCs/>
+          <w:color w:val="1E6B45"/>
+          <w:sz w:val="17"/>
+          <w:szCs w:val="17"/>
+        </w:rPr>
+        <w:t>TRANSITION TO SLIDE 11</w:t>
+      </w:r>
+    </w:p>
+    <w:p>
+      <w:pPr>
+        <w:pBdr>
+          <w:left w:val="single" w:sz="18" w:space="8" w:color="1E6B45"/>
+        </w:pBdr>
+        <w:shd w:val="clear" w:color="auto" w:fill="EAF5EE"/>
+        <w:spacing w:after="200" w:line="320" w:lineRule="auto"/>
+        <w:ind w:left="170" w:right="170"/>
+      </w:pPr>
+      <w:r>
+        <w:rPr>
+          <w:color w:val="1E6B45"/>
+          <w:sz w:val="25"/>
+          <w:szCs w:val="25"/>
+        </w:rPr>
+        <w:t xml:space="preserve">We saw that it is accurate, fast and cheap. </w:t>
+      </w:r>
+      <w:r>
+        <w:rPr>
+          <w:b/>
+          <w:bCs/>
+          <w:color w:val="1E6B45"/>
+          <w:sz w:val="25"/>
+          <w:szCs w:val="25"/>
+        </w:rPr>
+        <w:t>So now, we have everything we need to answer the director.</w:t>
+      </w:r>
+    </w:p>
+    <w:p>
+      <w:pPr>
+        <w:pStyle w:val="Titre1"/>
+        <w:keepNext/>
+        <w:pageBreakBefore/>
+      </w:pPr>
+      <w:r>
+        <w:lastRenderedPageBreak/>
+        <w:t>Slide 11 · Our choice: frozen ResNet18 + linear head</w:t>
+      </w:r>
+    </w:p>
+    <w:p>
+      <w:pPr>
+        <w:keepNext/>
+        <w:spacing w:after="160"/>
+      </w:pPr>
+      <w:r>
+        <w:rPr>
+          <w:color w:val="5F6473"/>
+          <w:sz w:val="19"/>
+          <w:szCs w:val="19"/>
+        </w:rPr>
+        <w:t>8:35 to 9:35 · 60 s · 127 words</w:t>
       </w:r>
     </w:p>
     <w:p>
@@ -1757,10 +2070,10 @@
 <file path=word/numbering.xml><?xml version="1.0" encoding="utf-8"?>
 <w:numbering xmlns:wpc="http://schemas.microsoft.com/office/word/2010/wordprocessingCanvas" xmlns:cx="http://schemas.microsoft.com/office/drawing/2014/chartex" xmlns:cx1="http://schemas.microsoft.com/office/drawing/2015/9/8/chartex" xmlns:cx2="http://schemas.microsoft.com/office/drawing/2015/10/21/chartex" xmlns:cx3="http://schemas.microsoft.com/office/drawing/2016/5/9/chartex" xmlns:cx4="http://schemas.microsoft.com/office/drawing/2016/5/10/chartex" xmlns:cx5="http://schemas.microsoft.com/office/drawing/2016/5/11/chartex" xmlns:cx6="http://schemas.microsoft.com/office/drawing/2016/5/12/chartex" xmlns:cx7="http://schemas.microsoft.com/office/drawing/2016/5/13/chartex" xmlns:cx8="http://schemas.microsoft.com/office/drawing/2016/5/14/chartex" xmlns:mc="http://schemas.openxmlformats.org/markup-compatibility/2006" xmlns:aink="http://schemas.microsoft.com/office/drawing/2016/ink" xmlns:am3d="http://schemas.microsoft.com/office/drawing/2017/model3d" xmlns:o="urn:schemas-microsoft-com:office:office" xmlns:oel="http://schemas.microsoft.com/office/2019/extlst" xmlns:r="http://schemas.openxmlformats.org/officeDocument/2006/relationships" xmlns:m="http://schemas.openxmlformats.org/officeDocument/2006/math" xmlns:v="urn:schemas-microsoft-com:vml" xmlns:wp14="http://schemas.microsoft.com/office/word/2010/wordprocessingDrawing" xmlns:wp="http://schemas.openxmlformats.org/drawingml/2006/wordprocessingDrawing" xmlns:w10="urn:schemas-microsoft-com:office:word" xmlns:w="http://schemas.openxmlformats.org/wordprocessingml/2006/main" xmlns:w14="http://schemas.microsoft.com/office/word/2010/wordml" xmlns:w15="http://schemas.microsoft.com/office/word/2012/wordml" xmlns:w16cex="http://schemas.microsoft.com/office/word/2018/wordml/cex" xmlns:w16cid="http://schemas.microsoft.com/office/word/2016/wordml/cid" xmlns:w16="http://schemas.microsoft.com/office/word/2018/wordml" xmlns:w16du="http://schemas.microsoft.com/office/word/2023/wordml/word16du" xmlns:w16sdtdh="http://schemas.microsoft.com/office/word/2020/wordml/sdtdatahash" xmlns:w16sdtfl="http://schemas.microsoft.com/office/word/2024/wordml/sdtformatlock" xmlns:w16se="http://schemas.microsoft.com/office/word/2015/wordml/symex" xmlns:wpg="http://schemas.microsoft.com/office/word/2010/wordprocessingGroup" xmlns:wpi="http://schemas.microsoft.com/office/word/2010/wordprocessingInk" xmlns:wne="http://schemas.microsoft.com/office/word/2006/wordml" xmlns:wps="http://schemas.microsoft.com/office/word/2010/wordprocessingShape" mc:Ignorable="w14 w15 w16se w16cid w16 w16cex w16sdtdh w16sdtfl w16du wp14">
   <w:abstractNum w:abstractNumId="0" w15:restartNumberingAfterBreak="0">
-    <w:nsid w:val="39FF34E6"/>
+    <w:nsid w:val="261A6295"/>
     <w:multiLevelType w:val="hybridMultilevel"/>
-    <w:tmpl w:val="FA7CEE1E"/>
-    <w:lvl w:ilvl="0" w:tplc="7B68A80E">
+    <w:tmpl w:val="A914F7BA"/>
+    <w:lvl w:ilvl="0" w:tplc="1E3EB154">
       <w:start w:val="1"/>
       <w:numFmt w:val="bullet"/>
       <w:lvlText w:val="●"/>
@@ -1769,7 +2082,7 @@
         <w:ind w:left="720" w:hanging="360"/>
       </w:pPr>
     </w:lvl>
-    <w:lvl w:ilvl="1" w:tplc="AFA6EFD2" w:tentative="1">
+    <w:lvl w:ilvl="1" w:tplc="5EA669E0" w:tentative="1">
       <w:start w:val="1"/>
       <w:numFmt w:val="bullet"/>
       <w:lvlText w:val="○"/>
@@ -1778,7 +2091,7 @@
         <w:ind w:left="1440" w:hanging="360"/>
       </w:pPr>
     </w:lvl>
-    <w:lvl w:ilvl="2" w:tplc="DE20EB4C" w:tentative="1">
+    <w:lvl w:ilvl="2" w:tplc="2B68C370" w:tentative="1">
       <w:start w:val="1"/>
       <w:numFmt w:val="bullet"/>
       <w:lvlText w:val="■"/>
@@ -1787,7 +2100,7 @@
         <w:ind w:left="2160" w:hanging="360"/>
       </w:pPr>
     </w:lvl>
-    <w:lvl w:ilvl="3" w:tplc="8ABA6CFC" w:tentative="1">
+    <w:lvl w:ilvl="3" w:tplc="50CC0D0E" w:tentative="1">
       <w:start w:val="1"/>
       <w:numFmt w:val="bullet"/>
       <w:lvlText w:val="●"/>
@@ -1796,7 +2109,7 @@
         <w:ind w:left="2880" w:hanging="360"/>
       </w:pPr>
     </w:lvl>
-    <w:lvl w:ilvl="4" w:tplc="60B6A540" w:tentative="1">
+    <w:lvl w:ilvl="4" w:tplc="1B969628" w:tentative="1">
       <w:start w:val="1"/>
       <w:numFmt w:val="bullet"/>
       <w:lvlText w:val="○"/>
@@ -1805,7 +2118,7 @@
         <w:ind w:left="3600" w:hanging="360"/>
       </w:pPr>
     </w:lvl>
-    <w:lvl w:ilvl="5" w:tplc="2A6CE6D0" w:tentative="1">
+    <w:lvl w:ilvl="5" w:tplc="F29A80B6" w:tentative="1">
       <w:start w:val="1"/>
       <w:numFmt w:val="bullet"/>
       <w:lvlText w:val="■"/>
@@ -1814,7 +2127,7 @@
         <w:ind w:left="4320" w:hanging="360"/>
       </w:pPr>
     </w:lvl>
-    <w:lvl w:ilvl="6" w:tplc="5882D2EE" w:tentative="1">
+    <w:lvl w:ilvl="6" w:tplc="2774F8D2" w:tentative="1">
       <w:start w:val="1"/>
       <w:numFmt w:val="bullet"/>
       <w:lvlText w:val="●"/>
@@ -1823,7 +2136,7 @@
         <w:ind w:left="5040" w:hanging="360"/>
       </w:pPr>
     </w:lvl>
-    <w:lvl w:ilvl="7" w:tplc="997215B6" w:tentative="1">
+    <w:lvl w:ilvl="7" w:tplc="396C428E" w:tentative="1">
       <w:start w:val="1"/>
       <w:numFmt w:val="bullet"/>
       <w:lvlText w:val="●"/>
@@ -1832,7 +2145,7 @@
         <w:ind w:left="5760" w:hanging="360"/>
       </w:pPr>
     </w:lvl>
-    <w:lvl w:ilvl="8" w:tplc="42C85FAA" w:tentative="1">
+    <w:lvl w:ilvl="8" w:tplc="A9CECB5E" w:tentative="1">
       <w:start w:val="1"/>
       <w:numFmt w:val="bullet"/>
       <w:lvlText w:val="●"/>
@@ -1842,7 +2155,7 @@
       </w:pPr>
     </w:lvl>
   </w:abstractNum>
-  <w:num w:numId="1" w16cid:durableId="445077520">
+  <w:num w:numId="1" w16cid:durableId="1171599767">
     <w:abstractNumId w:val="0"/>
     <w:lvlOverride w:ilvl="0">
       <w:startOverride w:val="1"/>

</xml_diff>

<commit_message>
Explain fine-tuning and the new last layer of ResNet18 in the talk
</commit_message>
<xml_diff>
--- a/presentation/oral_script.docx
+++ b/presentation/oral_script.docx
@@ -51,7 +51,7 @@
           <w:sz w:val="21"/>
           <w:szCs w:val="21"/>
         </w:rPr>
-        <w:t>About 1243 words: at a calm pace (about 130 words per minute), this is about 10 minutes. Without the 70 optional words, about 9 minutes. The rest of the 10 minutes is a safety margin for pauses, clicks and nerves.</w:t>
+        <w:t>About 1269 words: at a calm pace (about 130 words per minute), this is about 10 minutes. Without the 68 optional words, about 9 minutes. The rest of the 10 minutes is a safety margin for pauses, clicks and nerves.</w:t>
       </w:r>
     </w:p>
     <w:p>
@@ -1039,7 +1039,7 @@
           <w:sz w:val="19"/>
           <w:szCs w:val="19"/>
         </w:rPr>
-        <w:t>4:20 to 5:20 · 60 s · 132 words</w:t>
+        <w:t>4:20 to 5:25 · 65 s · 142 words</w:t>
       </w:r>
     </w:p>
     <w:p>
@@ -1119,7 +1119,7 @@
           <w:sz w:val="25"/>
           <w:szCs w:val="25"/>
         </w:rPr>
-        <w:t xml:space="preserve"> We train only the last layer, which turns these 512 numbers into our 5 styles: 2 565 weights. </w:t>
+        <w:t xml:space="preserve"> We remove its last layer, made for ImageNet, and add our own: from these 512 numbers to our 5 styles, 2 565 weights, the only ones we train. </w:t>
       </w:r>
       <w:r>
         <w:rPr>
@@ -1202,7 +1202,7 @@
           <w:sz w:val="19"/>
           <w:szCs w:val="19"/>
         </w:rPr>
-        <w:t>5:20 to 6:15 · 55 s · 115 words</w:t>
+        <w:t>5:25 to 6:30 · 65 s · 145 words</w:t>
       </w:r>
     </w:p>
     <w:p>
@@ -1269,7 +1269,17 @@
           <w:sz w:val="25"/>
           <w:szCs w:val="25"/>
         </w:rPr>
-        <w:t>We also tried fine-tuning, letting its last block learn too: 8.4 million weights for 1 061 paintings. It overfits: 85.4 percent.</w:t>
+        <w:t xml:space="preserve">We also tried fine-tuning: we unfreeze the last block of ResNet18, so that it also learns from our paintings, 8.4 million weights instead of 2 565. It was less convincing than keeping it frozen: 85.4 percent instead of 88.1. </w:t>
+      </w:r>
+      <w:r>
+        <w:rPr>
+          <w:i/>
+          <w:iCs/>
+          <w:color w:val="8A8F9C"/>
+          <w:sz w:val="25"/>
+          <w:szCs w:val="25"/>
+        </w:rPr>
+        <w:t>(optional) With only 1 061 paintings, it starts to learn them by heart.</w:t>
       </w:r>
     </w:p>
     <w:p>
@@ -1363,7 +1373,7 @@
           <w:sz w:val="19"/>
           <w:szCs w:val="19"/>
         </w:rPr>
-        <w:t>6:15 to 7:05 · 50 s · 112 words</w:t>
+        <w:t>6:30 to 7:20 · 50 s · 112 words</w:t>
       </w:r>
     </w:p>
     <w:p>
@@ -1519,7 +1529,7 @@
           <w:sz w:val="19"/>
           <w:szCs w:val="19"/>
         </w:rPr>
-        <w:t>7:05 to 8:00 · 55 s · 118 words</w:t>
+        <w:t>7:20 to 8:15 · 55 s · 118 words</w:t>
       </w:r>
     </w:p>
     <w:p>
@@ -1690,7 +1700,7 @@
           <w:sz w:val="19"/>
           <w:szCs w:val="19"/>
         </w:rPr>
-        <w:t>8:00 to 8:35 · 35 s · 71 words</w:t>
+        <w:t>8:15 to 8:50 · 35 s · 71 words</w:t>
       </w:r>
     </w:p>
     <w:p>
@@ -1821,7 +1831,7 @@
           <w:sz w:val="19"/>
           <w:szCs w:val="19"/>
         </w:rPr>
-        <w:t>8:35 to 9:35 · 60 s · 127 words</w:t>
+        <w:t>8:50 to 9:40 · 50 s · 113 words</w:t>
       </w:r>
     </w:p>
     <w:p>
@@ -1902,23 +1912,6 @@
           <w:szCs w:val="21"/>
         </w:rPr>
         <w:t>[point at the second column]</w:t>
-      </w:r>
-      <w:r>
-        <w:rPr>
-          <w:sz w:val="25"/>
-          <w:szCs w:val="25"/>
-        </w:rPr>
-        <w:t xml:space="preserve"> </w:t>
-      </w:r>
-      <w:r>
-        <w:rPr>
-          <w:i/>
-          <w:iCs/>
-          <w:color w:val="8A8F9C"/>
-          <w:sz w:val="25"/>
-          <w:szCs w:val="25"/>
-        </w:rPr>
-        <w:t>(optional) We do not recommend our MLP, a classical model alone, or fine-tuning for now.</w:t>
       </w:r>
       <w:r>
         <w:rPr>
@@ -2070,10 +2063,10 @@
 <file path=word/numbering.xml><?xml version="1.0" encoding="utf-8"?>
 <w:numbering xmlns:wpc="http://schemas.microsoft.com/office/word/2010/wordprocessingCanvas" xmlns:cx="http://schemas.microsoft.com/office/drawing/2014/chartex" xmlns:cx1="http://schemas.microsoft.com/office/drawing/2015/9/8/chartex" xmlns:cx2="http://schemas.microsoft.com/office/drawing/2015/10/21/chartex" xmlns:cx3="http://schemas.microsoft.com/office/drawing/2016/5/9/chartex" xmlns:cx4="http://schemas.microsoft.com/office/drawing/2016/5/10/chartex" xmlns:cx5="http://schemas.microsoft.com/office/drawing/2016/5/11/chartex" xmlns:cx6="http://schemas.microsoft.com/office/drawing/2016/5/12/chartex" xmlns:cx7="http://schemas.microsoft.com/office/drawing/2016/5/13/chartex" xmlns:cx8="http://schemas.microsoft.com/office/drawing/2016/5/14/chartex" xmlns:mc="http://schemas.openxmlformats.org/markup-compatibility/2006" xmlns:aink="http://schemas.microsoft.com/office/drawing/2016/ink" xmlns:am3d="http://schemas.microsoft.com/office/drawing/2017/model3d" xmlns:o="urn:schemas-microsoft-com:office:office" xmlns:oel="http://schemas.microsoft.com/office/2019/extlst" xmlns:r="http://schemas.openxmlformats.org/officeDocument/2006/relationships" xmlns:m="http://schemas.openxmlformats.org/officeDocument/2006/math" xmlns:v="urn:schemas-microsoft-com:vml" xmlns:wp14="http://schemas.microsoft.com/office/word/2010/wordprocessingDrawing" xmlns:wp="http://schemas.openxmlformats.org/drawingml/2006/wordprocessingDrawing" xmlns:w10="urn:schemas-microsoft-com:office:word" xmlns:w="http://schemas.openxmlformats.org/wordprocessingml/2006/main" xmlns:w14="http://schemas.microsoft.com/office/word/2010/wordml" xmlns:w15="http://schemas.microsoft.com/office/word/2012/wordml" xmlns:w16cex="http://schemas.microsoft.com/office/word/2018/wordml/cex" xmlns:w16cid="http://schemas.microsoft.com/office/word/2016/wordml/cid" xmlns:w16="http://schemas.microsoft.com/office/word/2018/wordml" xmlns:w16du="http://schemas.microsoft.com/office/word/2023/wordml/word16du" xmlns:w16sdtdh="http://schemas.microsoft.com/office/word/2020/wordml/sdtdatahash" xmlns:w16sdtfl="http://schemas.microsoft.com/office/word/2024/wordml/sdtformatlock" xmlns:w16se="http://schemas.microsoft.com/office/word/2015/wordml/symex" xmlns:wpg="http://schemas.microsoft.com/office/word/2010/wordprocessingGroup" xmlns:wpi="http://schemas.microsoft.com/office/word/2010/wordprocessingInk" xmlns:wne="http://schemas.microsoft.com/office/word/2006/wordml" xmlns:wps="http://schemas.microsoft.com/office/word/2010/wordprocessingShape" mc:Ignorable="w14 w15 w16se w16cid w16 w16cex w16sdtdh w16sdtfl w16du wp14">
   <w:abstractNum w:abstractNumId="0" w15:restartNumberingAfterBreak="0">
-    <w:nsid w:val="261A6295"/>
+    <w:nsid w:val="5BE414E2"/>
     <w:multiLevelType w:val="hybridMultilevel"/>
-    <w:tmpl w:val="A914F7BA"/>
-    <w:lvl w:ilvl="0" w:tplc="1E3EB154">
+    <w:tmpl w:val="E7E24CF0"/>
+    <w:lvl w:ilvl="0" w:tplc="E51CEC6A">
       <w:start w:val="1"/>
       <w:numFmt w:val="bullet"/>
       <w:lvlText w:val="●"/>
@@ -2082,7 +2075,7 @@
         <w:ind w:left="720" w:hanging="360"/>
       </w:pPr>
     </w:lvl>
-    <w:lvl w:ilvl="1" w:tplc="5EA669E0" w:tentative="1">
+    <w:lvl w:ilvl="1" w:tplc="58CE3124" w:tentative="1">
       <w:start w:val="1"/>
       <w:numFmt w:val="bullet"/>
       <w:lvlText w:val="○"/>
@@ -2091,7 +2084,7 @@
         <w:ind w:left="1440" w:hanging="360"/>
       </w:pPr>
     </w:lvl>
-    <w:lvl w:ilvl="2" w:tplc="2B68C370" w:tentative="1">
+    <w:lvl w:ilvl="2" w:tplc="79F8C474" w:tentative="1">
       <w:start w:val="1"/>
       <w:numFmt w:val="bullet"/>
       <w:lvlText w:val="■"/>
@@ -2100,7 +2093,7 @@
         <w:ind w:left="2160" w:hanging="360"/>
       </w:pPr>
     </w:lvl>
-    <w:lvl w:ilvl="3" w:tplc="50CC0D0E" w:tentative="1">
+    <w:lvl w:ilvl="3" w:tplc="23FAAFDC" w:tentative="1">
       <w:start w:val="1"/>
       <w:numFmt w:val="bullet"/>
       <w:lvlText w:val="●"/>
@@ -2109,7 +2102,7 @@
         <w:ind w:left="2880" w:hanging="360"/>
       </w:pPr>
     </w:lvl>
-    <w:lvl w:ilvl="4" w:tplc="1B969628" w:tentative="1">
+    <w:lvl w:ilvl="4" w:tplc="02665D08" w:tentative="1">
       <w:start w:val="1"/>
       <w:numFmt w:val="bullet"/>
       <w:lvlText w:val="○"/>
@@ -2118,7 +2111,7 @@
         <w:ind w:left="3600" w:hanging="360"/>
       </w:pPr>
     </w:lvl>
-    <w:lvl w:ilvl="5" w:tplc="F29A80B6" w:tentative="1">
+    <w:lvl w:ilvl="5" w:tplc="95E29C6C" w:tentative="1">
       <w:start w:val="1"/>
       <w:numFmt w:val="bullet"/>
       <w:lvlText w:val="■"/>
@@ -2127,7 +2120,7 @@
         <w:ind w:left="4320" w:hanging="360"/>
       </w:pPr>
     </w:lvl>
-    <w:lvl w:ilvl="6" w:tplc="2774F8D2" w:tentative="1">
+    <w:lvl w:ilvl="6" w:tplc="8B0E0E6A" w:tentative="1">
       <w:start w:val="1"/>
       <w:numFmt w:val="bullet"/>
       <w:lvlText w:val="●"/>
@@ -2136,7 +2129,7 @@
         <w:ind w:left="5040" w:hanging="360"/>
       </w:pPr>
     </w:lvl>
-    <w:lvl w:ilvl="7" w:tplc="396C428E" w:tentative="1">
+    <w:lvl w:ilvl="7" w:tplc="6AE8AA54" w:tentative="1">
       <w:start w:val="1"/>
       <w:numFmt w:val="bullet"/>
       <w:lvlText w:val="●"/>
@@ -2145,7 +2138,7 @@
         <w:ind w:left="5760" w:hanging="360"/>
       </w:pPr>
     </w:lvl>
-    <w:lvl w:ilvl="8" w:tplc="A9CECB5E" w:tentative="1">
+    <w:lvl w:ilvl="8" w:tplc="C608B9CC" w:tentative="1">
       <w:start w:val="1"/>
       <w:numFmt w:val="bullet"/>
       <w:lvlText w:val="●"/>
@@ -2155,7 +2148,7 @@
       </w:pPr>
     </w:lvl>
   </w:abstractNum>
-  <w:num w:numId="1" w16cid:durableId="1171599767">
+  <w:num w:numId="1" w16cid:durableId="361060089">
     <w:abstractNumId w:val="0"/>
     <w:lvlOverride w:ilvl="0">
       <w:startOverride w:val="1"/>

</xml_diff>

<commit_message>
Explain fine-tuning in the talk and keep two columns on the recommendation slide
</commit_message>
<xml_diff>
--- a/presentation/oral_script.docx
+++ b/presentation/oral_script.docx
@@ -1889,7 +1889,7 @@
           <w:sz w:val="21"/>
           <w:szCs w:val="21"/>
         </w:rPr>
-        <w:t>[point at the first column]</w:t>
+        <w:t>[point at the left column]</w:t>
       </w:r>
       <w:r>
         <w:rPr>
@@ -1911,24 +1911,7 @@
           <w:sz w:val="21"/>
           <w:szCs w:val="21"/>
         </w:rPr>
-        <w:t>[point at the second column]</w:t>
-      </w:r>
-      <w:r>
-        <w:rPr>
-          <w:sz w:val="25"/>
-          <w:szCs w:val="25"/>
-        </w:rPr>
-        <w:t xml:space="preserve"> </w:t>
-      </w:r>
-      <w:r>
-        <w:rPr>
-          <w:i/>
-          <w:iCs/>
-          <w:color w:val="1C5FB0"/>
-          <w:sz w:val="21"/>
-          <w:szCs w:val="21"/>
-        </w:rPr>
-        <w:t>[point at the third column]</w:t>
+        <w:t>[point at the right column]</w:t>
       </w:r>
       <w:r>
         <w:rPr>
@@ -2063,10 +2046,10 @@
 <file path=word/numbering.xml><?xml version="1.0" encoding="utf-8"?>
 <w:numbering xmlns:wpc="http://schemas.microsoft.com/office/word/2010/wordprocessingCanvas" xmlns:cx="http://schemas.microsoft.com/office/drawing/2014/chartex" xmlns:cx1="http://schemas.microsoft.com/office/drawing/2015/9/8/chartex" xmlns:cx2="http://schemas.microsoft.com/office/drawing/2015/10/21/chartex" xmlns:cx3="http://schemas.microsoft.com/office/drawing/2016/5/9/chartex" xmlns:cx4="http://schemas.microsoft.com/office/drawing/2016/5/10/chartex" xmlns:cx5="http://schemas.microsoft.com/office/drawing/2016/5/11/chartex" xmlns:cx6="http://schemas.microsoft.com/office/drawing/2016/5/12/chartex" xmlns:cx7="http://schemas.microsoft.com/office/drawing/2016/5/13/chartex" xmlns:cx8="http://schemas.microsoft.com/office/drawing/2016/5/14/chartex" xmlns:mc="http://schemas.openxmlformats.org/markup-compatibility/2006" xmlns:aink="http://schemas.microsoft.com/office/drawing/2016/ink" xmlns:am3d="http://schemas.microsoft.com/office/drawing/2017/model3d" xmlns:o="urn:schemas-microsoft-com:office:office" xmlns:oel="http://schemas.microsoft.com/office/2019/extlst" xmlns:r="http://schemas.openxmlformats.org/officeDocument/2006/relationships" xmlns:m="http://schemas.openxmlformats.org/officeDocument/2006/math" xmlns:v="urn:schemas-microsoft-com:vml" xmlns:wp14="http://schemas.microsoft.com/office/word/2010/wordprocessingDrawing" xmlns:wp="http://schemas.openxmlformats.org/drawingml/2006/wordprocessingDrawing" xmlns:w10="urn:schemas-microsoft-com:office:word" xmlns:w="http://schemas.openxmlformats.org/wordprocessingml/2006/main" xmlns:w14="http://schemas.microsoft.com/office/word/2010/wordml" xmlns:w15="http://schemas.microsoft.com/office/word/2012/wordml" xmlns:w16cex="http://schemas.microsoft.com/office/word/2018/wordml/cex" xmlns:w16cid="http://schemas.microsoft.com/office/word/2016/wordml/cid" xmlns:w16="http://schemas.microsoft.com/office/word/2018/wordml" xmlns:w16du="http://schemas.microsoft.com/office/word/2023/wordml/word16du" xmlns:w16sdtdh="http://schemas.microsoft.com/office/word/2020/wordml/sdtdatahash" xmlns:w16sdtfl="http://schemas.microsoft.com/office/word/2024/wordml/sdtformatlock" xmlns:w16se="http://schemas.microsoft.com/office/word/2015/wordml/symex" xmlns:wpg="http://schemas.microsoft.com/office/word/2010/wordprocessingGroup" xmlns:wpi="http://schemas.microsoft.com/office/word/2010/wordprocessingInk" xmlns:wne="http://schemas.microsoft.com/office/word/2006/wordml" xmlns:wps="http://schemas.microsoft.com/office/word/2010/wordprocessingShape" mc:Ignorable="w14 w15 w16se w16cid w16 w16cex w16sdtdh w16sdtfl w16du wp14">
   <w:abstractNum w:abstractNumId="0" w15:restartNumberingAfterBreak="0">
-    <w:nsid w:val="5BE414E2"/>
+    <w:nsid w:val="57757284"/>
     <w:multiLevelType w:val="hybridMultilevel"/>
-    <w:tmpl w:val="E7E24CF0"/>
-    <w:lvl w:ilvl="0" w:tplc="E51CEC6A">
+    <w:tmpl w:val="8BB63686"/>
+    <w:lvl w:ilvl="0" w:tplc="253E0C44">
       <w:start w:val="1"/>
       <w:numFmt w:val="bullet"/>
       <w:lvlText w:val="●"/>
@@ -2075,7 +2058,7 @@
         <w:ind w:left="720" w:hanging="360"/>
       </w:pPr>
     </w:lvl>
-    <w:lvl w:ilvl="1" w:tplc="58CE3124" w:tentative="1">
+    <w:lvl w:ilvl="1" w:tplc="FF144A82" w:tentative="1">
       <w:start w:val="1"/>
       <w:numFmt w:val="bullet"/>
       <w:lvlText w:val="○"/>
@@ -2084,7 +2067,7 @@
         <w:ind w:left="1440" w:hanging="360"/>
       </w:pPr>
     </w:lvl>
-    <w:lvl w:ilvl="2" w:tplc="79F8C474" w:tentative="1">
+    <w:lvl w:ilvl="2" w:tplc="DF5ED472" w:tentative="1">
       <w:start w:val="1"/>
       <w:numFmt w:val="bullet"/>
       <w:lvlText w:val="■"/>
@@ -2093,7 +2076,7 @@
         <w:ind w:left="2160" w:hanging="360"/>
       </w:pPr>
     </w:lvl>
-    <w:lvl w:ilvl="3" w:tplc="23FAAFDC" w:tentative="1">
+    <w:lvl w:ilvl="3" w:tplc="9C8A0432" w:tentative="1">
       <w:start w:val="1"/>
       <w:numFmt w:val="bullet"/>
       <w:lvlText w:val="●"/>
@@ -2102,7 +2085,7 @@
         <w:ind w:left="2880" w:hanging="360"/>
       </w:pPr>
     </w:lvl>
-    <w:lvl w:ilvl="4" w:tplc="02665D08" w:tentative="1">
+    <w:lvl w:ilvl="4" w:tplc="4836A180" w:tentative="1">
       <w:start w:val="1"/>
       <w:numFmt w:val="bullet"/>
       <w:lvlText w:val="○"/>
@@ -2111,7 +2094,7 @@
         <w:ind w:left="3600" w:hanging="360"/>
       </w:pPr>
     </w:lvl>
-    <w:lvl w:ilvl="5" w:tplc="95E29C6C" w:tentative="1">
+    <w:lvl w:ilvl="5" w:tplc="1DAEE55E" w:tentative="1">
       <w:start w:val="1"/>
       <w:numFmt w:val="bullet"/>
       <w:lvlText w:val="■"/>
@@ -2120,7 +2103,7 @@
         <w:ind w:left="4320" w:hanging="360"/>
       </w:pPr>
     </w:lvl>
-    <w:lvl w:ilvl="6" w:tplc="8B0E0E6A" w:tentative="1">
+    <w:lvl w:ilvl="6" w:tplc="E90ADFDE" w:tentative="1">
       <w:start w:val="1"/>
       <w:numFmt w:val="bullet"/>
       <w:lvlText w:val="●"/>
@@ -2129,7 +2112,7 @@
         <w:ind w:left="5040" w:hanging="360"/>
       </w:pPr>
     </w:lvl>
-    <w:lvl w:ilvl="7" w:tplc="6AE8AA54" w:tentative="1">
+    <w:lvl w:ilvl="7" w:tplc="C584F3BC" w:tentative="1">
       <w:start w:val="1"/>
       <w:numFmt w:val="bullet"/>
       <w:lvlText w:val="●"/>
@@ -2138,7 +2121,7 @@
         <w:ind w:left="5760" w:hanging="360"/>
       </w:pPr>
     </w:lvl>
-    <w:lvl w:ilvl="8" w:tplc="C608B9CC" w:tentative="1">
+    <w:lvl w:ilvl="8" w:tplc="37BA37C0" w:tentative="1">
       <w:start w:val="1"/>
       <w:numFmt w:val="bullet"/>
       <w:lvlText w:val="●"/>
@@ -2148,7 +2131,7 @@
       </w:pPr>
     </w:lvl>
   </w:abstractNum>
-  <w:num w:numId="1" w16cid:durableId="361060089">
+  <w:num w:numId="1" w16cid:durableId="1201088930">
     <w:abstractNumId w:val="0"/>
     <w:lvlOverride w:ilvl="0">
       <w:startOverride w:val="1"/>

</xml_diff>

<commit_message>
Add a backup slide that shows the inside of ResNet18 and its linear head
</commit_message>
<xml_diff>
--- a/presentation/oral_script.docx
+++ b/presentation/oral_script.docx
@@ -1,6 +1,6 @@
 
 <file path=word/document.xml><?xml version="1.0" encoding="utf-8"?>
-<w:document xmlns:wpc="http://schemas.microsoft.com/office/word/2010/wordprocessingCanvas" xmlns:cx="http://schemas.microsoft.com/office/drawing/2014/chartex" xmlns:cx1="http://schemas.microsoft.com/office/drawing/2015/9/8/chartex" xmlns:cx2="http://schemas.microsoft.com/office/drawing/2015/10/21/chartex" xmlns:cx3="http://schemas.microsoft.com/office/drawing/2016/5/9/chartex" xmlns:cx4="http://schemas.microsoft.com/office/drawing/2016/5/10/chartex" xmlns:cx5="http://schemas.microsoft.com/office/drawing/2016/5/11/chartex" xmlns:cx6="http://schemas.microsoft.com/office/drawing/2016/5/12/chartex" xmlns:cx7="http://schemas.microsoft.com/office/drawing/2016/5/13/chartex" xmlns:cx8="http://schemas.microsoft.com/office/drawing/2016/5/14/chartex" xmlns:mc="http://schemas.openxmlformats.org/markup-compatibility/2006" xmlns:aink="http://schemas.microsoft.com/office/drawing/2016/ink" xmlns:am3d="http://schemas.microsoft.com/office/drawing/2017/model3d" xmlns:o="urn:schemas-microsoft-com:office:office" xmlns:oel="http://schemas.microsoft.com/office/2019/extlst" xmlns:r="http://schemas.openxmlformats.org/officeDocument/2006/relationships" xmlns:m="http://schemas.openxmlformats.org/officeDocument/2006/math" xmlns:v="urn:schemas-microsoft-com:vml" xmlns:wp14="http://schemas.microsoft.com/office/word/2010/wordprocessingDrawing" xmlns:wp="http://schemas.openxmlformats.org/drawingml/2006/wordprocessingDrawing" xmlns:w10="urn:schemas-microsoft-com:office:word" xmlns:w="http://schemas.openxmlformats.org/wordprocessingml/2006/main" xmlns:w14="http://schemas.microsoft.com/office/word/2010/wordml" xmlns:w15="http://schemas.microsoft.com/office/word/2012/wordml" xmlns:w16cex="http://schemas.microsoft.com/office/word/2018/wordml/cex" xmlns:w16cid="http://schemas.microsoft.com/office/word/2016/wordml/cid" xmlns:w16="http://schemas.microsoft.com/office/word/2018/wordml" xmlns:w16du="http://schemas.microsoft.com/office/word/2023/wordml/word16du" xmlns:w16sdtdh="http://schemas.microsoft.com/office/word/2020/wordml/sdtdatahash" xmlns:w16sdtfl="http://schemas.microsoft.com/office/word/2024/wordml/sdtformatlock" xmlns:w16se="http://schemas.microsoft.com/office/word/2015/wordml/symex" xmlns:wpg="http://schemas.microsoft.com/office/word/2010/wordprocessingGroup" xmlns:wpi="http://schemas.microsoft.com/office/word/2010/wordprocessingInk" xmlns:wne="http://schemas.microsoft.com/office/word/2006/wordml" xmlns:wps="http://schemas.microsoft.com/office/word/2010/wordprocessingShape" mc:Ignorable="w14 w15 w16se w16cid w16 w16cex w16sdtdh w16sdtfl w16du wp14">
+<w:document xmlns:wpc="http://schemas.microsoft.com/office/word/2010/wordprocessingCanvas" xmlns:mc="http://schemas.openxmlformats.org/markup-compatibility/2006" xmlns:o="urn:schemas-microsoft-com:office:office" xmlns:r="http://schemas.openxmlformats.org/officeDocument/2006/relationships" xmlns:m="http://schemas.openxmlformats.org/officeDocument/2006/math" xmlns:v="urn:schemas-microsoft-com:vml" xmlns:wp14="http://schemas.microsoft.com/office/word/2010/wordprocessingDrawing" xmlns:wp="http://schemas.openxmlformats.org/drawingml/2006/wordprocessingDrawing" xmlns:w10="urn:schemas-microsoft-com:office:word" xmlns:w="http://schemas.openxmlformats.org/wordprocessingml/2006/main" xmlns:w14="http://schemas.microsoft.com/office/word/2010/wordml" xmlns:w15="http://schemas.microsoft.com/office/word/2012/wordml" xmlns:wpg="http://schemas.microsoft.com/office/word/2010/wordprocessingGroup" xmlns:wpi="http://schemas.microsoft.com/office/word/2010/wordprocessingInk" xmlns:wne="http://schemas.microsoft.com/office/word/2006/wordml" xmlns:wps="http://schemas.microsoft.com/office/word/2010/wordprocessingShape" xmlns:cx="http://schemas.microsoft.com/office/drawing/2014/chartex" xmlns:cx1="http://schemas.microsoft.com/office/drawing/2015/9/8/chartex" xmlns:cx2="http://schemas.microsoft.com/office/drawing/2015/10/21/chartex" xmlns:cx3="http://schemas.microsoft.com/office/drawing/2016/5/9/chartex" xmlns:cx4="http://schemas.microsoft.com/office/drawing/2016/5/10/chartex" xmlns:cx5="http://schemas.microsoft.com/office/drawing/2016/5/11/chartex" xmlns:cx6="http://schemas.microsoft.com/office/drawing/2016/5/12/chartex" xmlns:cx7="http://schemas.microsoft.com/office/drawing/2016/5/13/chartex" xmlns:cx8="http://schemas.microsoft.com/office/drawing/2016/5/14/chartex" xmlns:aink="http://schemas.microsoft.com/office/drawing/2016/ink" xmlns:am3d="http://schemas.microsoft.com/office/drawing/2017/model3d" xmlns:w16cex="http://schemas.microsoft.com/office/word/2018/wordml/cex" xmlns:w16cid="http://schemas.microsoft.com/office/word/2016/wordml/cid" xmlns:w16="http://schemas.microsoft.com/office/word/2018/wordml" xmlns:w16sdtdh="http://schemas.microsoft.com/office/word/2020/wordml/sdtdatahash" xmlns:w16se="http://schemas.microsoft.com/office/word/2015/wordml/symex" mc:Ignorable="w14 w15 wp14">
   <w:body>
     <w:p>
       <w:pPr>
@@ -8,14 +8,14 @@
       </w:pPr>
       <w:r>
         <w:rPr>
-          <w:rFonts w:ascii="Cambria" w:eastAsia="Cambria" w:hAnsi="Cambria" w:cs="Cambria"/>
+          <w:rFonts w:ascii="Cambria" w:cs="Cambria" w:eastAsia="Cambria" w:hAnsi="Cambria"/>
           <w:b/>
           <w:bCs/>
           <w:color w:val="1C2433"/>
           <w:sz w:val="44"/>
           <w:szCs w:val="44"/>
         </w:rPr>
-        <w:t>Oral script: the 10-minute defence</w:t>
+        <w:t xml:space="preserve">Oral script: the 10-minute defence</w:t>
       </w:r>
     </w:p>
     <w:p>
@@ -26,20 +26,20 @@
         <w:rPr>
           <w:color w:val="5F6473"/>
         </w:rPr>
-        <w:t>Museum Guide project, MSA-DATB09-03. One section per slide, to read aloud.</w:t>
-      </w:r>
-    </w:p>
-    <w:p>
-      <w:pPr>
-        <w:pStyle w:val="Titre2"/>
-      </w:pPr>
-      <w:r>
-        <w:t>How to use it</w:t>
-      </w:r>
-    </w:p>
-    <w:p>
-      <w:pPr>
-        <w:pStyle w:val="Paragraphedeliste"/>
+        <w:t xml:space="preserve">Museum Guide project, MSA-DATB09-03. One section per slide, to read aloud.</w:t>
+      </w:r>
+    </w:p>
+    <w:p>
+      <w:pPr>
+        <w:pStyle w:val="Heading2"/>
+      </w:pPr>
+      <w:r>
+        <w:t xml:space="preserve">How to use it</w:t>
+      </w:r>
+    </w:p>
+    <w:p>
+      <w:pPr>
+        <w:pStyle w:val="ListParagraph"/>
         <w:numPr>
           <w:ilvl w:val="0"/>
           <w:numId w:val="1"/>
@@ -51,12 +51,12 @@
           <w:sz w:val="21"/>
           <w:szCs w:val="21"/>
         </w:rPr>
-        <w:t>About 1269 words: at a calm pace (about 130 words per minute), this is about 10 minutes. Without the 68 optional words, about 9 minutes. The rest of the 10 minutes is a safety margin for pauses, clicks and nerves.</w:t>
-      </w:r>
-    </w:p>
-    <w:p>
-      <w:pPr>
-        <w:pStyle w:val="Paragraphedeliste"/>
+        <w:t xml:space="preserve">About 1269 words: at a calm pace (about 130 words per minute), this is about 10 minutes. Without the 68 optional words, about 9 minutes. The rest of the 10 minutes is a safety margin for pauses, clicks and nerves.</w:t>
+      </w:r>
+    </w:p>
+    <w:p>
+      <w:pPr>
+        <w:pStyle w:val="ListParagraph"/>
         <w:numPr>
           <w:ilvl w:val="0"/>
           <w:numId w:val="1"/>
@@ -68,12 +68,12 @@
           <w:sz w:val="21"/>
           <w:szCs w:val="21"/>
         </w:rPr>
-        <w:t>Every slide ends with a green TRANSITION box, always built the same way: "We saw that... So now...". Say it while you click to the next slide, and never skip it, even when you are late: it turns the six steps into one story.</w:t>
-      </w:r>
-    </w:p>
-    <w:p>
-      <w:pPr>
-        <w:pStyle w:val="Paragraphedeliste"/>
+        <w:t xml:space="preserve">Every slide ends with a green TRANSITION box, always built the same way: "We saw that... So now...". Say it while you click to the next slide, and never skip it, even when you are late: it turns the six steps into one story.</w:t>
+      </w:r>
+    </w:p>
+    <w:p>
+      <w:pPr>
+        <w:pStyle w:val="ListParagraph"/>
         <w:numPr>
           <w:ilvl w:val="0"/>
           <w:numId w:val="1"/>
@@ -85,12 +85,12 @@
           <w:sz w:val="21"/>
           <w:szCs w:val="21"/>
         </w:rPr>
-        <w:t>Read it aloud 3 times, with the slides, and time yourself once. Speak slowly; pause after each bold sentence: it is the one the jury must remember.</w:t>
-      </w:r>
-    </w:p>
-    <w:p>
-      <w:pPr>
-        <w:pStyle w:val="Paragraphedeliste"/>
+        <w:t xml:space="preserve">Read it aloud 3 times, with the slides, and time yourself once. Speak slowly; pause after each bold sentence: it is the one the jury must remember.</w:t>
+      </w:r>
+    </w:p>
+    <w:p>
+      <w:pPr>
+        <w:pStyle w:val="ListParagraph"/>
         <w:numPr>
           <w:ilvl w:val="0"/>
           <w:numId w:val="1"/>
@@ -102,12 +102,12 @@
           <w:sz w:val="21"/>
           <w:szCs w:val="21"/>
         </w:rPr>
-        <w:t>Blue text in brackets is a stage cue (where to point); do not read it. Grey sentences marked (optional) can be skipped if you are late.</w:t>
-      </w:r>
-    </w:p>
-    <w:p>
-      <w:pPr>
-        <w:pStyle w:val="Paragraphedeliste"/>
+        <w:t xml:space="preserve">Blue text in brackets is a stage cue (where to point); do not read it. Grey sentences marked (optional) can be skipped if you are late.</w:t>
+      </w:r>
+    </w:p>
+    <w:p>
+      <w:pPr>
+        <w:pStyle w:val="ListParagraph"/>
         <w:numPr>
           <w:ilvl w:val="0"/>
           <w:numId w:val="1"/>
@@ -119,15 +119,15 @@
           <w:sz w:val="21"/>
           <w:szCs w:val="21"/>
         </w:rPr>
-        <w:t>If you present with a teammate, a natural split is slides 1 to 5, then slides 6 to 11.</w:t>
-      </w:r>
-    </w:p>
-    <w:p>
-      <w:pPr>
-        <w:pStyle w:val="Titre2"/>
-      </w:pPr>
-      <w:r>
-        <w:t>The story, transition by transition</w:t>
+        <w:t xml:space="preserve">If you present with a teammate, a natural split is slides 1 to 5, then slides 6 to 11.</w:t>
+      </w:r>
+    </w:p>
+    <w:p>
+      <w:pPr>
+        <w:pStyle w:val="Heading2"/>
+      </w:pPr>
+      <w:r>
+        <w:t xml:space="preserve">The story, transition by transition</w:t>
       </w:r>
     </w:p>
     <w:p>
@@ -149,7 +149,7 @@
           <w:sz w:val="20"/>
           <w:szCs w:val="20"/>
         </w:rPr>
-        <w:t>To answer it, we did not jump straight to a model. So now, here is our path: six steps.</w:t>
+        <w:t xml:space="preserve">To answer it, we did not jump straight to a model. So now, here is our path: six steps.</w:t>
       </w:r>
     </w:p>
     <w:p>
@@ -171,7 +171,7 @@
           <w:sz w:val="20"/>
           <w:szCs w:val="20"/>
         </w:rPr>
-        <w:t>So now, let's start with step one: the data, and how we made the test fair.</w:t>
+        <w:t xml:space="preserve">So now, let's start with step one: the data, and how we made the test fair.</w:t>
       </w:r>
     </w:p>
     <w:p>
@@ -193,7 +193,7 @@
           <w:sz w:val="20"/>
           <w:szCs w:val="20"/>
         </w:rPr>
-        <w:t>We saw that our data is ready and our test is fair. So now, step two: we can build our first model.</w:t>
+        <w:t xml:space="preserve">We saw that our data is ready and our test is fair. So now, step two: we can build our first model.</w:t>
       </w:r>
     </w:p>
     <w:p>
@@ -215,7 +215,7 @@
           <w:sz w:val="20"/>
           <w:szCs w:val="20"/>
         </w:rPr>
-        <w:t>We saw that our MLP is overfitting. So now, step three: we try to fix this overfitting.</w:t>
+        <w:t xml:space="preserve">We saw that our MLP is overfitting. So now, step three: we try to fix this overfitting.</w:t>
       </w:r>
     </w:p>
     <w:p>
@@ -237,7 +237,7 @@
           <w:sz w:val="20"/>
           <w:szCs w:val="20"/>
         </w:rPr>
-        <w:t>We saw that the overfitting is under control. But our MLP still sees colours, not shapes. So now, step four: we need a network that sees shapes.</w:t>
+        <w:t xml:space="preserve">We saw that the overfitting is under control. But our MLP still sees colours, not shapes. So now, step four: we need a network that sees shapes.</w:t>
       </w:r>
     </w:p>
     <w:p>
@@ -259,7 +259,7 @@
           <w:sz w:val="20"/>
           <w:szCs w:val="20"/>
         </w:rPr>
-        <w:t>We saw how ResNet18 works. So now, let's see what it gives on our paintings.</w:t>
+        <w:t xml:space="preserve">We saw how ResNet18 works. So now, let's see what it gives on our paintings.</w:t>
       </w:r>
     </w:p>
     <w:p>
@@ -281,7 +281,7 @@
           <w:sz w:val="20"/>
           <w:szCs w:val="20"/>
         </w:rPr>
-        <w:t>We saw that ResNet18 reaches 88 percent. But to answer the director, we also need a challenger without any neural network. So now, step five: we build this classical challenger, then we test every model.</w:t>
+        <w:t xml:space="preserve">We saw that ResNet18 reaches 88 percent. But to answer the director, we also need a challenger without any neural network. So now, step five: we build this classical challenger, then we test every model.</w:t>
       </w:r>
     </w:p>
     <w:p>
@@ -303,7 +303,7 @@
           <w:sz w:val="20"/>
           <w:szCs w:val="20"/>
         </w:rPr>
-        <w:t>We saw how our challenger works. So now, the final test: every model, on 220 paintings never seen before.</w:t>
+        <w:t xml:space="preserve">We saw how our challenger works. So now, the final test: every model, on 220 paintings never seen before.</w:t>
       </w:r>
     </w:p>
     <w:p>
@@ -325,7 +325,7 @@
           <w:sz w:val="20"/>
           <w:szCs w:val="20"/>
         </w:rPr>
-        <w:t>We saw that the pretrained network is the most accurate. But accuracy is only half of the director's question. So now, step six: what does it cost on a kiosk?</w:t>
+        <w:t xml:space="preserve">We saw that the pretrained network is the most accurate. But accuracy is only half of the director's question. So now, step six: what does it cost on a kiosk?</w:t>
       </w:r>
     </w:p>
     <w:p>
@@ -347,18 +347,17 @@
           <w:sz w:val="20"/>
           <w:szCs w:val="20"/>
         </w:rPr>
-        <w:t>We saw that it is accurate, fast and cheap. So now, we have everything we need to answer the director.</w:t>
-      </w:r>
-    </w:p>
-    <w:p>
-      <w:pPr>
-        <w:pStyle w:val="Titre1"/>
+        <w:t xml:space="preserve">We saw that it is accurate, fast and cheap. So now, we have everything we need to answer the director.</w:t>
+      </w:r>
+    </w:p>
+    <w:p>
+      <w:pPr>
+        <w:pStyle w:val="Heading1"/>
         <w:keepNext/>
         <w:pageBreakBefore/>
       </w:pPr>
       <w:r>
-        <w:lastRenderedPageBreak/>
-        <w:t>Slide 1 · Is a neural network worth it on a museum kiosk?</w:t>
+        <w:t xml:space="preserve">Slide 1 · Is a neural network worth it on a museum kiosk?</w:t>
       </w:r>
     </w:p>
     <w:p>
@@ -372,24 +371,24 @@
           <w:sz w:val="19"/>
           <w:szCs w:val="19"/>
         </w:rPr>
-        <w:t>0:00 to 0:45 · 45 s · 98 words</w:t>
-      </w:r>
-    </w:p>
-    <w:p>
-      <w:pPr>
-        <w:spacing w:after="160" w:line="320" w:lineRule="auto"/>
-      </w:pPr>
-      <w:r>
-        <w:rPr>
-          <w:sz w:val="25"/>
-          <w:szCs w:val="25"/>
-        </w:rPr>
-        <w:t>Good morning. Imagine you point your phone at a painting in a museum, and a guide tells you its style. Our museum wants exactly this, on kiosks in its galleries.</w:t>
-      </w:r>
-    </w:p>
-    <w:p>
-      <w:pPr>
-        <w:spacing w:after="160" w:line="320" w:lineRule="auto"/>
+        <w:t xml:space="preserve">0:00 to 0:45 · 45 s · 98 words</w:t>
+      </w:r>
+    </w:p>
+    <w:p>
+      <w:pPr>
+        <w:spacing w:after="160" w:line="320"/>
+      </w:pPr>
+      <w:r>
+        <w:rPr>
+          <w:sz w:val="25"/>
+          <w:szCs w:val="25"/>
+        </w:rPr>
+        <w:t xml:space="preserve">Good morning. Imagine you point your phone at a painting in a museum, and a guide tells you its style. Our museum wants exactly this, on kiosks in its galleries.</w:t>
+      </w:r>
+    </w:p>
+    <w:p>
+      <w:pPr>
+        <w:spacing w:after="160" w:line="320"/>
       </w:pPr>
       <w:r>
         <w:rPr>
@@ -406,12 +405,12 @@
           <w:sz w:val="21"/>
           <w:szCs w:val="21"/>
         </w:rPr>
-        <w:t>[point at the five paintings]</w:t>
-      </w:r>
-    </w:p>
-    <w:p>
-      <w:pPr>
-        <w:spacing w:after="160" w:line="320" w:lineRule="auto"/>
+        <w:t xml:space="preserve">[point at the five paintings]</w:t>
+      </w:r>
+    </w:p>
+    <w:p>
+      <w:pPr>
+        <w:spacing w:after="160" w:line="320"/>
       </w:pPr>
       <w:r>
         <w:rPr>
@@ -427,17 +426,17 @@
           <w:sz w:val="25"/>
           <w:szCs w:val="25"/>
         </w:rPr>
-        <w:t>is a neural network worth it in production, or would a simpler classical model do the job?</w:t>
+        <w:t xml:space="preserve">is a neural network worth it in production, or would a simpler classical model do the job?</w:t>
       </w:r>
     </w:p>
     <w:p>
       <w:pPr>
         <w:keepNext/>
         <w:pBdr>
-          <w:left w:val="single" w:sz="18" w:space="8" w:color="1E6B45"/>
+          <w:left w:val="single" w:color="1E6B45" w:sz="18" w:space="8"/>
         </w:pBdr>
-        <w:shd w:val="clear" w:color="auto" w:fill="EAF5EE"/>
-        <w:spacing w:before="60"/>
+        <w:shd w:fill="EAF5EE" w:color="auto" w:val="clear"/>
+        <w:spacing w:after="0" w:before="60"/>
         <w:ind w:left="170" w:right="170"/>
       </w:pPr>
       <w:r>
@@ -448,16 +447,16 @@
           <w:sz w:val="17"/>
           <w:szCs w:val="17"/>
         </w:rPr>
-        <w:t>TRANSITION TO SLIDE 2</w:t>
+        <w:t xml:space="preserve">TRANSITION TO SLIDE 2</w:t>
       </w:r>
     </w:p>
     <w:p>
       <w:pPr>
         <w:pBdr>
-          <w:left w:val="single" w:sz="18" w:space="8" w:color="1E6B45"/>
+          <w:left w:val="single" w:color="1E6B45" w:sz="18" w:space="8"/>
         </w:pBdr>
-        <w:shd w:val="clear" w:color="auto" w:fill="EAF5EE"/>
-        <w:spacing w:after="200" w:line="320" w:lineRule="auto"/>
+        <w:shd w:fill="EAF5EE" w:color="auto" w:val="clear"/>
+        <w:spacing w:after="200" w:line="320"/>
         <w:ind w:left="170" w:right="170"/>
       </w:pPr>
       <w:r>
@@ -476,16 +475,16 @@
           <w:sz w:val="25"/>
           <w:szCs w:val="25"/>
         </w:rPr>
-        <w:t>So now, here is our path: six steps.</w:t>
-      </w:r>
-    </w:p>
-    <w:p>
-      <w:pPr>
-        <w:pStyle w:val="Titre1"/>
-        <w:keepNext/>
-      </w:pPr>
-      <w:r>
-        <w:t>Slide 2 · Six steps to answer the director</w:t>
+        <w:t xml:space="preserve">So now, here is our path: six steps.</w:t>
+      </w:r>
+    </w:p>
+    <w:p>
+      <w:pPr>
+        <w:pStyle w:val="Heading1"/>
+        <w:keepNext/>
+      </w:pPr>
+      <w:r>
+        <w:t xml:space="preserve">Slide 2 · Six steps to answer the director</w:t>
       </w:r>
     </w:p>
     <w:p>
@@ -499,12 +498,12 @@
           <w:sz w:val="19"/>
           <w:szCs w:val="19"/>
         </w:rPr>
-        <w:t>0:45 to 1:20 · 35 s · 80 words</w:t>
-      </w:r>
-    </w:p>
-    <w:p>
-      <w:pPr>
-        <w:spacing w:after="160" w:line="320" w:lineRule="auto"/>
+        <w:t xml:space="preserve">0:45 to 1:20 · 35 s · 80 words</w:t>
+      </w:r>
+    </w:p>
+    <w:p>
+      <w:pPr>
+        <w:spacing w:after="160" w:line="320"/>
       </w:pPr>
       <w:r>
         <w:rPr>
@@ -514,7 +513,7 @@
           <w:sz w:val="21"/>
           <w:szCs w:val="21"/>
         </w:rPr>
-        <w:t>[point at the six steps, one by one]</w:t>
+        <w:t xml:space="preserve">[point at the six steps, one by one]</w:t>
       </w:r>
       <w:r>
         <w:rPr>
@@ -526,7 +525,7 @@
     </w:p>
     <w:p>
       <w:pPr>
-        <w:spacing w:after="160" w:line="320" w:lineRule="auto"/>
+        <w:spacing w:after="160" w:line="320"/>
       </w:pPr>
       <w:r>
         <w:rPr>
@@ -542,17 +541,17 @@
           <w:sz w:val="25"/>
           <w:szCs w:val="25"/>
         </w:rPr>
-        <w:t>At the end of these six steps, we will have our answer.</w:t>
+        <w:t xml:space="preserve">At the end of these six steps, we will have our answer.</w:t>
       </w:r>
     </w:p>
     <w:p>
       <w:pPr>
         <w:keepNext/>
         <w:pBdr>
-          <w:left w:val="single" w:sz="18" w:space="8" w:color="1E6B45"/>
+          <w:left w:val="single" w:color="1E6B45" w:sz="18" w:space="8"/>
         </w:pBdr>
-        <w:shd w:val="clear" w:color="auto" w:fill="EAF5EE"/>
-        <w:spacing w:before="60"/>
+        <w:shd w:fill="EAF5EE" w:color="auto" w:val="clear"/>
+        <w:spacing w:after="0" w:before="60"/>
         <w:ind w:left="170" w:right="170"/>
       </w:pPr>
       <w:r>
@@ -563,16 +562,16 @@
           <w:sz w:val="17"/>
           <w:szCs w:val="17"/>
         </w:rPr>
-        <w:t>TRANSITION TO SLIDE 3</w:t>
+        <w:t xml:space="preserve">TRANSITION TO SLIDE 3</w:t>
       </w:r>
     </w:p>
     <w:p>
       <w:pPr>
         <w:pBdr>
-          <w:left w:val="single" w:sz="18" w:space="8" w:color="1E6B45"/>
+          <w:left w:val="single" w:color="1E6B45" w:sz="18" w:space="8"/>
         </w:pBdr>
-        <w:shd w:val="clear" w:color="auto" w:fill="EAF5EE"/>
-        <w:spacing w:after="200" w:line="320" w:lineRule="auto"/>
+        <w:shd w:fill="EAF5EE" w:color="auto" w:val="clear"/>
+        <w:spacing w:after="200" w:line="320"/>
         <w:ind w:left="170" w:right="170"/>
       </w:pPr>
       <w:r>
@@ -583,18 +582,17 @@
           <w:sz w:val="25"/>
           <w:szCs w:val="25"/>
         </w:rPr>
-        <w:t>So now, let's start with step one: the data, and how we made the test fair.</w:t>
-      </w:r>
-    </w:p>
-    <w:p>
-      <w:pPr>
-        <w:pStyle w:val="Titre1"/>
+        <w:t xml:space="preserve">So now, let's start with step one: the data, and how we made the test fair.</w:t>
+      </w:r>
+    </w:p>
+    <w:p>
+      <w:pPr>
+        <w:pStyle w:val="Heading1"/>
         <w:keepNext/>
         <w:pageBreakBefore/>
       </w:pPr>
       <w:r>
-        <w:lastRenderedPageBreak/>
-        <w:t>Slide 3 · A fair test: one painter, one part</w:t>
+        <w:t xml:space="preserve">Slide 3 · A fair test: one painter, one part</w:t>
       </w:r>
     </w:p>
     <w:p>
@@ -608,36 +606,36 @@
           <w:sz w:val="19"/>
           <w:szCs w:val="19"/>
         </w:rPr>
-        <w:t>1:20 to 2:15 · 55 s · 124 words</w:t>
-      </w:r>
-    </w:p>
-    <w:p>
-      <w:pPr>
-        <w:spacing w:after="160" w:line="320" w:lineRule="auto"/>
-      </w:pPr>
-      <w:r>
-        <w:rPr>
-          <w:sz w:val="25"/>
-          <w:szCs w:val="25"/>
-        </w:rPr>
-        <w:t>We took 1 500 paintings from WikiArt, 300 per style.</w:t>
-      </w:r>
-    </w:p>
-    <w:p>
-      <w:pPr>
-        <w:spacing w:after="160" w:line="320" w:lineRule="auto"/>
-      </w:pPr>
-      <w:r>
-        <w:rPr>
-          <w:sz w:val="25"/>
-          <w:szCs w:val="25"/>
-        </w:rPr>
-        <w:t>We cut them into three piles: 1 061 to train, 219 to validate, that is, to choose our settings, and 220 to test, used only once, at the very end.</w:t>
-      </w:r>
-    </w:p>
-    <w:p>
-      <w:pPr>
-        <w:spacing w:after="160" w:line="320" w:lineRule="auto"/>
+        <w:t xml:space="preserve">1:20 to 2:15 · 55 s · 124 words</w:t>
+      </w:r>
+    </w:p>
+    <w:p>
+      <w:pPr>
+        <w:spacing w:after="160" w:line="320"/>
+      </w:pPr>
+      <w:r>
+        <w:rPr>
+          <w:sz w:val="25"/>
+          <w:szCs w:val="25"/>
+        </w:rPr>
+        <w:t xml:space="preserve">We took 1 500 paintings from WikiArt, 300 per style.</w:t>
+      </w:r>
+    </w:p>
+    <w:p>
+      <w:pPr>
+        <w:spacing w:after="160" w:line="320"/>
+      </w:pPr>
+      <w:r>
+        <w:rPr>
+          <w:sz w:val="25"/>
+          <w:szCs w:val="25"/>
+        </w:rPr>
+        <w:t xml:space="preserve">We cut them into three piles: 1 061 to train, 219 to validate, that is, to choose our settings, and 220 to test, used only once, at the very end.</w:t>
+      </w:r>
+    </w:p>
+    <w:p>
+      <w:pPr>
+        <w:spacing w:after="160" w:line="320"/>
       </w:pPr>
       <w:r>
         <w:rPr>
@@ -653,7 +651,7 @@
           <w:sz w:val="25"/>
           <w:szCs w:val="25"/>
         </w:rPr>
-        <w:t>all the paintings of a known painter go to the same pile.</w:t>
+        <w:t xml:space="preserve">all the paintings of a known painter go to the same pile.</w:t>
       </w:r>
       <w:r>
         <w:rPr>
@@ -670,7 +668,7 @@
           <w:sz w:val="21"/>
           <w:szCs w:val="21"/>
         </w:rPr>
-        <w:t>[point at the zero]</w:t>
+        <w:t xml:space="preserve">[point at the zero]</w:t>
       </w:r>
       <w:r>
         <w:rPr>
@@ -687,17 +685,17 @@
           <w:sz w:val="25"/>
           <w:szCs w:val="25"/>
         </w:rPr>
-        <w:t>(optional) We measured it: when the model has seen the painter, it scores 11 points higher.</w:t>
+        <w:t xml:space="preserve">(optional) We measured it: when the model has seen the painter, it scores 11 points higher.</w:t>
       </w:r>
     </w:p>
     <w:p>
       <w:pPr>
         <w:keepNext/>
         <w:pBdr>
-          <w:left w:val="single" w:sz="18" w:space="8" w:color="1E6B45"/>
+          <w:left w:val="single" w:color="1E6B45" w:sz="18" w:space="8"/>
         </w:pBdr>
-        <w:shd w:val="clear" w:color="auto" w:fill="EAF5EE"/>
-        <w:spacing w:before="60"/>
+        <w:shd w:fill="EAF5EE" w:color="auto" w:val="clear"/>
+        <w:spacing w:after="0" w:before="60"/>
         <w:ind w:left="170" w:right="170"/>
       </w:pPr>
       <w:r>
@@ -708,16 +706,16 @@
           <w:sz w:val="17"/>
           <w:szCs w:val="17"/>
         </w:rPr>
-        <w:t>TRANSITION TO SLIDE 4</w:t>
+        <w:t xml:space="preserve">TRANSITION TO SLIDE 4</w:t>
       </w:r>
     </w:p>
     <w:p>
       <w:pPr>
         <w:pBdr>
-          <w:left w:val="single" w:sz="18" w:space="8" w:color="1E6B45"/>
+          <w:left w:val="single" w:color="1E6B45" w:sz="18" w:space="8"/>
         </w:pBdr>
-        <w:shd w:val="clear" w:color="auto" w:fill="EAF5EE"/>
-        <w:spacing w:after="200" w:line="320" w:lineRule="auto"/>
+        <w:shd w:fill="EAF5EE" w:color="auto" w:val="clear"/>
+        <w:spacing w:after="200" w:line="320"/>
         <w:ind w:left="170" w:right="170"/>
       </w:pPr>
       <w:r>
@@ -736,16 +734,16 @@
           <w:sz w:val="25"/>
           <w:szCs w:val="25"/>
         </w:rPr>
-        <w:t>So now, step two: we can build our first model.</w:t>
-      </w:r>
-    </w:p>
-    <w:p>
-      <w:pPr>
-        <w:pStyle w:val="Titre1"/>
-        <w:keepNext/>
-      </w:pPr>
-      <w:r>
-        <w:t>Slide 4 · Our MLP learns the paintings by heart</w:t>
+        <w:t xml:space="preserve">So now, step two: we can build our first model.</w:t>
+      </w:r>
+    </w:p>
+    <w:p>
+      <w:pPr>
+        <w:pStyle w:val="Heading1"/>
+        <w:keepNext/>
+      </w:pPr>
+      <w:r>
+        <w:t xml:space="preserve">Slide 4 · Our MLP learns the paintings by heart</w:t>
       </w:r>
     </w:p>
     <w:p>
@@ -759,12 +757,12 @@
           <w:sz w:val="19"/>
           <w:szCs w:val="19"/>
         </w:rPr>
-        <w:t>2:15 to 3:20 · 65 s · 137 words</w:t>
-      </w:r>
-    </w:p>
-    <w:p>
-      <w:pPr>
-        <w:spacing w:after="160" w:line="320" w:lineRule="auto"/>
+        <w:t xml:space="preserve">2:15 to 3:20 · 65 s · 137 words</w:t>
+      </w:r>
+    </w:p>
+    <w:p>
+      <w:pPr>
+        <w:spacing w:after="160" w:line="320"/>
       </w:pPr>
       <w:r>
         <w:rPr>
@@ -781,24 +779,24 @@
           <w:sz w:val="25"/>
           <w:szCs w:val="25"/>
         </w:rPr>
-        <w:t>(optional) It reads the pixels of a 64 by 64 image: 12 288 inputs and 6.4 million parameters.</w:t>
-      </w:r>
-    </w:p>
-    <w:p>
-      <w:pPr>
-        <w:spacing w:after="160" w:line="320" w:lineRule="auto"/>
-      </w:pPr>
-      <w:r>
-        <w:rPr>
-          <w:sz w:val="25"/>
-          <w:szCs w:val="25"/>
-        </w:rPr>
-        <w:t>Before trusting it, we ran two checks. First, a model that knows nothing should have a loss of ln 5, about 1.61. Ours started at 1.99, too confident, so we made its last layer smaller and got 1.59. Second, it must be able to learn one small batch by heart: it does, 100 percent.</w:t>
-      </w:r>
-    </w:p>
-    <w:p>
-      <w:pPr>
-        <w:spacing w:after="160" w:line="320" w:lineRule="auto"/>
+        <w:t xml:space="preserve">(optional) It reads the pixels of a 64 by 64 image: 12 288 inputs and 6.4 million parameters.</w:t>
+      </w:r>
+    </w:p>
+    <w:p>
+      <w:pPr>
+        <w:spacing w:after="160" w:line="320"/>
+      </w:pPr>
+      <w:r>
+        <w:rPr>
+          <w:sz w:val="25"/>
+          <w:szCs w:val="25"/>
+        </w:rPr>
+        <w:t xml:space="preserve">Before trusting it, we ran two checks. First, a model that knows nothing should have a loss of ln 5, about 1.61. Ours started at 1.99, too confident, so we made its last layer smaller and got 1.59. Second, it must be able to learn one small batch by heart: it does, 100 percent.</w:t>
+      </w:r>
+    </w:p>
+    <w:p>
+      <w:pPr>
+        <w:spacing w:after="160" w:line="320"/>
       </w:pPr>
       <w:r>
         <w:rPr>
@@ -815,7 +813,7 @@
           <w:sz w:val="21"/>
           <w:szCs w:val="21"/>
         </w:rPr>
-        <w:t>[point at the curves]</w:t>
+        <w:t xml:space="preserve">[point at the curves]</w:t>
       </w:r>
       <w:r>
         <w:rPr>
@@ -831,17 +829,17 @@
           <w:sz w:val="25"/>
           <w:szCs w:val="25"/>
         </w:rPr>
-        <w:t>This is overfitting: the network learns the paintings by heart.</w:t>
+        <w:t xml:space="preserve">This is overfitting: the network learns the paintings by heart.</w:t>
       </w:r>
     </w:p>
     <w:p>
       <w:pPr>
         <w:keepNext/>
         <w:pBdr>
-          <w:left w:val="single" w:sz="18" w:space="8" w:color="1E6B45"/>
+          <w:left w:val="single" w:color="1E6B45" w:sz="18" w:space="8"/>
         </w:pBdr>
-        <w:shd w:val="clear" w:color="auto" w:fill="EAF5EE"/>
-        <w:spacing w:before="60"/>
+        <w:shd w:fill="EAF5EE" w:color="auto" w:val="clear"/>
+        <w:spacing w:after="0" w:before="60"/>
         <w:ind w:left="170" w:right="170"/>
       </w:pPr>
       <w:r>
@@ -852,16 +850,16 @@
           <w:sz w:val="17"/>
           <w:szCs w:val="17"/>
         </w:rPr>
-        <w:t>TRANSITION TO SLIDE 5</w:t>
+        <w:t xml:space="preserve">TRANSITION TO SLIDE 5</w:t>
       </w:r>
     </w:p>
     <w:p>
       <w:pPr>
         <w:pBdr>
-          <w:left w:val="single" w:sz="18" w:space="8" w:color="1E6B45"/>
+          <w:left w:val="single" w:color="1E6B45" w:sz="18" w:space="8"/>
         </w:pBdr>
-        <w:shd w:val="clear" w:color="auto" w:fill="EAF5EE"/>
-        <w:spacing w:after="200" w:line="320" w:lineRule="auto"/>
+        <w:shd w:fill="EAF5EE" w:color="auto" w:val="clear"/>
+        <w:spacing w:after="200" w:line="320"/>
         <w:ind w:left="170" w:right="170"/>
       </w:pPr>
       <w:r>
@@ -880,18 +878,17 @@
           <w:sz w:val="25"/>
           <w:szCs w:val="25"/>
         </w:rPr>
-        <w:t>So now, step three: we try to fix this overfitting.</w:t>
-      </w:r>
-    </w:p>
-    <w:p>
-      <w:pPr>
-        <w:pStyle w:val="Titre1"/>
+        <w:t xml:space="preserve">So now, step three: we try to fix this overfitting.</w:t>
+      </w:r>
+    </w:p>
+    <w:p>
+      <w:pPr>
+        <w:pStyle w:val="Heading1"/>
         <w:keepNext/>
         <w:pageBreakBefore/>
       </w:pPr>
       <w:r>
-        <w:lastRenderedPageBreak/>
-        <w:t>Slide 5 · Healthy training, but the MLP overfits</w:t>
+        <w:t xml:space="preserve">Slide 5 · Healthy training, but the MLP overfits</w:t>
       </w:r>
     </w:p>
     <w:p>
@@ -905,24 +902,24 @@
           <w:sz w:val="19"/>
           <w:szCs w:val="19"/>
         </w:rPr>
-        <w:t>3:20 to 4:20 · 60 s · 129 words</w:t>
-      </w:r>
-    </w:p>
-    <w:p>
-      <w:pPr>
-        <w:spacing w:after="160" w:line="320" w:lineRule="auto"/>
-      </w:pPr>
-      <w:r>
-        <w:rPr>
-          <w:sz w:val="25"/>
-          <w:szCs w:val="25"/>
-        </w:rPr>
-        <w:t>Before fixing it, we looked inside the network to check that the training itself was healthy: the gradient reaches every layer and only 4 percent of the neurons are dead. So the problem really is overfitting.</w:t>
-      </w:r>
-    </w:p>
-    <w:p>
-      <w:pPr>
-        <w:spacing w:after="160" w:line="320" w:lineRule="auto"/>
+        <w:t xml:space="preserve">3:20 to 4:20 · 60 s · 129 words</w:t>
+      </w:r>
+    </w:p>
+    <w:p>
+      <w:pPr>
+        <w:spacing w:after="160" w:line="320"/>
+      </w:pPr>
+      <w:r>
+        <w:rPr>
+          <w:sz w:val="25"/>
+          <w:szCs w:val="25"/>
+        </w:rPr>
+        <w:t xml:space="preserve">Before fixing it, we looked inside the network to check that the training itself was healthy: the gradient reaches every layer and only 4 percent of the neurons are dead. So the problem really is overfitting.</w:t>
+      </w:r>
+    </w:p>
+    <w:p>
+      <w:pPr>
+        <w:spacing w:after="160" w:line="320"/>
       </w:pPr>
       <w:r>
         <w:rPr>
@@ -939,7 +936,7 @@
           <w:sz w:val="21"/>
           <w:szCs w:val="21"/>
         </w:rPr>
-        <w:t>[point at the chart]</w:t>
+        <w:t xml:space="preserve">[point at the chart]</w:t>
       </w:r>
       <w:r>
         <w:rPr>
@@ -951,7 +948,7 @@
     </w:p>
     <w:p>
       <w:pPr>
-        <w:spacing w:after="160" w:line="320" w:lineRule="auto"/>
+        <w:spacing w:after="160" w:line="320"/>
       </w:pPr>
       <w:r>
         <w:rPr>
@@ -967,17 +964,17 @@
           <w:sz w:val="25"/>
           <w:szCs w:val="25"/>
         </w:rPr>
-        <w:t>the MLP finds only 7 percent of the Cubist paintings. It sees colours, not shapes.</w:t>
+        <w:t xml:space="preserve">the MLP finds only 7 percent of the Cubist paintings. It sees colours, not shapes.</w:t>
       </w:r>
     </w:p>
     <w:p>
       <w:pPr>
         <w:keepNext/>
         <w:pBdr>
-          <w:left w:val="single" w:sz="18" w:space="8" w:color="1E6B45"/>
+          <w:left w:val="single" w:color="1E6B45" w:sz="18" w:space="8"/>
         </w:pBdr>
-        <w:shd w:val="clear" w:color="auto" w:fill="EAF5EE"/>
-        <w:spacing w:before="60"/>
+        <w:shd w:fill="EAF5EE" w:color="auto" w:val="clear"/>
+        <w:spacing w:after="0" w:before="60"/>
         <w:ind w:left="170" w:right="170"/>
       </w:pPr>
       <w:r>
@@ -988,16 +985,16 @@
           <w:sz w:val="17"/>
           <w:szCs w:val="17"/>
         </w:rPr>
-        <w:t>TRANSITION TO SLIDE 6</w:t>
+        <w:t xml:space="preserve">TRANSITION TO SLIDE 6</w:t>
       </w:r>
     </w:p>
     <w:p>
       <w:pPr>
         <w:pBdr>
-          <w:left w:val="single" w:sz="18" w:space="8" w:color="1E6B45"/>
+          <w:left w:val="single" w:color="1E6B45" w:sz="18" w:space="8"/>
         </w:pBdr>
-        <w:shd w:val="clear" w:color="auto" w:fill="EAF5EE"/>
-        <w:spacing w:after="200" w:line="320" w:lineRule="auto"/>
+        <w:shd w:fill="EAF5EE" w:color="auto" w:val="clear"/>
+        <w:spacing w:after="200" w:line="320"/>
         <w:ind w:left="170" w:right="170"/>
       </w:pPr>
       <w:r>
@@ -1016,16 +1013,16 @@
           <w:sz w:val="25"/>
           <w:szCs w:val="25"/>
         </w:rPr>
-        <w:t>So now, step four: we need a network that sees shapes.</w:t>
-      </w:r>
-    </w:p>
-    <w:p>
-      <w:pPr>
-        <w:pStyle w:val="Titre1"/>
-        <w:keepNext/>
-      </w:pPr>
-      <w:r>
-        <w:t>Slide 6 · ResNet18: a network made for images</w:t>
+        <w:t xml:space="preserve">So now, step four: we need a network that sees shapes.</w:t>
+      </w:r>
+    </w:p>
+    <w:p>
+      <w:pPr>
+        <w:pStyle w:val="Heading1"/>
+        <w:keepNext/>
+      </w:pPr>
+      <w:r>
+        <w:t xml:space="preserve">Slide 6 · ResNet18: a network made for images</w:t>
       </w:r>
     </w:p>
     <w:p>
@@ -1039,24 +1036,24 @@
           <w:sz w:val="19"/>
           <w:szCs w:val="19"/>
         </w:rPr>
-        <w:t>4:20 to 5:25 · 65 s · 142 words</w:t>
-      </w:r>
-    </w:p>
-    <w:p>
-      <w:pPr>
-        <w:spacing w:after="160" w:line="320" w:lineRule="auto"/>
-      </w:pPr>
-      <w:r>
-        <w:rPr>
-          <w:sz w:val="25"/>
-          <w:szCs w:val="25"/>
-        </w:rPr>
-        <w:t>There is a type of network made for images, which recognises shapes: the convolutional network. We used ResNet18, the smallest ResNet.</w:t>
-      </w:r>
-    </w:p>
-    <w:p>
-      <w:pPr>
-        <w:spacing w:after="160" w:line="320" w:lineRule="auto"/>
+        <w:t xml:space="preserve">4:20 to 5:25 · 65 s · 142 words</w:t>
+      </w:r>
+    </w:p>
+    <w:p>
+      <w:pPr>
+        <w:spacing w:after="160" w:line="320"/>
+      </w:pPr>
+      <w:r>
+        <w:rPr>
+          <w:sz w:val="25"/>
+          <w:szCs w:val="25"/>
+        </w:rPr>
+        <w:t xml:space="preserve">There is a type of network made for images, which recognises shapes: the convolutional network. We used ResNet18, the smallest ResNet.</w:t>
+      </w:r>
+    </w:p>
+    <w:p>
+      <w:pPr>
+        <w:spacing w:after="160" w:line="320"/>
       </w:pPr>
       <w:r>
         <w:rPr>
@@ -1066,7 +1063,7 @@
           <w:sz w:val="21"/>
           <w:szCs w:val="21"/>
         </w:rPr>
-        <w:t>[point at the dark box]</w:t>
+        <w:t xml:space="preserve">[point at the dark box]</w:t>
       </w:r>
       <w:r>
         <w:rPr>
@@ -1078,7 +1075,7 @@
     </w:p>
     <w:p>
       <w:pPr>
-        <w:spacing w:after="160" w:line="320" w:lineRule="auto"/>
+        <w:spacing w:after="160" w:line="320"/>
       </w:pPr>
       <w:r>
         <w:rPr>
@@ -1095,7 +1092,7 @@
           <w:sz w:val="21"/>
           <w:szCs w:val="21"/>
         </w:rPr>
-        <w:t>[point at the 512 numbers]</w:t>
+        <w:t xml:space="preserve">[point at the 512 numbers]</w:t>
       </w:r>
       <w:r>
         <w:rPr>
@@ -1112,7 +1109,7 @@
           <w:sz w:val="21"/>
           <w:szCs w:val="21"/>
         </w:rPr>
-        <w:t>[point at the blue box]</w:t>
+        <w:t xml:space="preserve">[point at the blue box]</w:t>
       </w:r>
       <w:r>
         <w:rPr>
@@ -1128,17 +1125,17 @@
           <w:sz w:val="25"/>
           <w:szCs w:val="25"/>
         </w:rPr>
-        <w:t>Like hiring an experienced art expert, and only teaching them our five style names.</w:t>
+        <w:t xml:space="preserve">Like hiring an experienced art expert, and only teaching them our five style names.</w:t>
       </w:r>
     </w:p>
     <w:p>
       <w:pPr>
         <w:keepNext/>
         <w:pBdr>
-          <w:left w:val="single" w:sz="18" w:space="8" w:color="1E6B45"/>
+          <w:left w:val="single" w:color="1E6B45" w:sz="18" w:space="8"/>
         </w:pBdr>
-        <w:shd w:val="clear" w:color="auto" w:fill="EAF5EE"/>
-        <w:spacing w:before="60"/>
+        <w:shd w:fill="EAF5EE" w:color="auto" w:val="clear"/>
+        <w:spacing w:after="0" w:before="60"/>
         <w:ind w:left="170" w:right="170"/>
       </w:pPr>
       <w:r>
@@ -1149,16 +1146,16 @@
           <w:sz w:val="17"/>
           <w:szCs w:val="17"/>
         </w:rPr>
-        <w:t>TRANSITION TO SLIDE 7</w:t>
+        <w:t xml:space="preserve">TRANSITION TO SLIDE 7</w:t>
       </w:r>
     </w:p>
     <w:p>
       <w:pPr>
         <w:pBdr>
-          <w:left w:val="single" w:sz="18" w:space="8" w:color="1E6B45"/>
+          <w:left w:val="single" w:color="1E6B45" w:sz="18" w:space="8"/>
         </w:pBdr>
-        <w:shd w:val="clear" w:color="auto" w:fill="EAF5EE"/>
-        <w:spacing w:after="200" w:line="320" w:lineRule="auto"/>
+        <w:shd w:fill="EAF5EE" w:color="auto" w:val="clear"/>
+        <w:spacing w:after="200" w:line="320"/>
         <w:ind w:left="170" w:right="170"/>
       </w:pPr>
       <w:r>
@@ -1177,18 +1174,17 @@
           <w:sz w:val="25"/>
           <w:szCs w:val="25"/>
         </w:rPr>
-        <w:t>So now, let's see what it gives on our paintings.</w:t>
-      </w:r>
-    </w:p>
-    <w:p>
-      <w:pPr>
-        <w:pStyle w:val="Titre1"/>
+        <w:t xml:space="preserve">So now, let's see what it gives on our paintings.</w:t>
+      </w:r>
+    </w:p>
+    <w:p>
+      <w:pPr>
+        <w:pStyle w:val="Heading1"/>
         <w:keepNext/>
         <w:pageBreakBefore/>
       </w:pPr>
       <w:r>
-        <w:lastRenderedPageBreak/>
-        <w:t>Slide 7 · A pretrained ResNet18 sees shapes</w:t>
+        <w:t xml:space="preserve">Slide 7 · A pretrained ResNet18 sees shapes</w:t>
       </w:r>
     </w:p>
     <w:p>
@@ -1202,12 +1198,12 @@
           <w:sz w:val="19"/>
           <w:szCs w:val="19"/>
         </w:rPr>
-        <w:t>5:25 to 6:30 · 65 s · 145 words</w:t>
-      </w:r>
-    </w:p>
-    <w:p>
-      <w:pPr>
-        <w:spacing w:after="160" w:line="320" w:lineRule="auto"/>
+        <w:t xml:space="preserve">5:25 to 6:30 · 65 s · 145 words</w:t>
+      </w:r>
+    </w:p>
+    <w:p>
+      <w:pPr>
+        <w:spacing w:after="160" w:line="320"/>
       </w:pPr>
       <w:r>
         <w:rPr>
@@ -1217,7 +1213,7 @@
           <w:sz w:val="21"/>
           <w:szCs w:val="21"/>
         </w:rPr>
-        <w:t>[point at the blue bar]</w:t>
+        <w:t xml:space="preserve">[point at the blue bar]</w:t>
       </w:r>
       <w:r>
         <w:rPr>
@@ -1233,7 +1229,7 @@
           <w:sz w:val="25"/>
           <w:szCs w:val="25"/>
         </w:rPr>
-        <w:t>88.1 percent on validation, almost twice our best MLP.</w:t>
+        <w:t xml:space="preserve">88.1 percent on validation, almost twice our best MLP.</w:t>
       </w:r>
       <w:r>
         <w:rPr>
@@ -1250,7 +1246,7 @@
           <w:sz w:val="21"/>
           <w:szCs w:val="21"/>
         </w:rPr>
-        <w:t>[point at the top card]</w:t>
+        <w:t xml:space="preserve">[point at the top card]</w:t>
       </w:r>
       <w:r>
         <w:rPr>
@@ -1262,7 +1258,7 @@
     </w:p>
     <w:p>
       <w:pPr>
-        <w:spacing w:after="160" w:line="320" w:lineRule="auto"/>
+        <w:spacing w:after="160" w:line="320"/>
       </w:pPr>
       <w:r>
         <w:rPr>
@@ -1279,12 +1275,12 @@
           <w:sz w:val="25"/>
           <w:szCs w:val="25"/>
         </w:rPr>
-        <w:t>(optional) With only 1 061 paintings, it starts to learn them by heart.</w:t>
-      </w:r>
-    </w:p>
-    <w:p>
-      <w:pPr>
-        <w:spacing w:after="160" w:line="320" w:lineRule="auto"/>
+        <w:t xml:space="preserve">(optional) With only 1 061 paintings, it starts to learn them by heart.</w:t>
+      </w:r>
+    </w:p>
+    <w:p>
+      <w:pPr>
+        <w:spacing w:after="160" w:line="320"/>
       </w:pPr>
       <w:r>
         <w:rPr>
@@ -1294,7 +1290,7 @@
           <w:sz w:val="21"/>
           <w:szCs w:val="21"/>
         </w:rPr>
-        <w:t>[point at the bottom card]</w:t>
+        <w:t xml:space="preserve">[point at the bottom card]</w:t>
       </w:r>
       <w:r>
         <w:rPr>
@@ -1308,10 +1304,10 @@
       <w:pPr>
         <w:keepNext/>
         <w:pBdr>
-          <w:left w:val="single" w:sz="18" w:space="8" w:color="1E6B45"/>
+          <w:left w:val="single" w:color="1E6B45" w:sz="18" w:space="8"/>
         </w:pBdr>
-        <w:shd w:val="clear" w:color="auto" w:fill="EAF5EE"/>
-        <w:spacing w:before="60"/>
+        <w:shd w:fill="EAF5EE" w:color="auto" w:val="clear"/>
+        <w:spacing w:after="0" w:before="60"/>
         <w:ind w:left="170" w:right="170"/>
       </w:pPr>
       <w:r>
@@ -1322,16 +1318,16 @@
           <w:sz w:val="17"/>
           <w:szCs w:val="17"/>
         </w:rPr>
-        <w:t>TRANSITION TO SLIDE 8</w:t>
+        <w:t xml:space="preserve">TRANSITION TO SLIDE 8</w:t>
       </w:r>
     </w:p>
     <w:p>
       <w:pPr>
         <w:pBdr>
-          <w:left w:val="single" w:sz="18" w:space="8" w:color="1E6B45"/>
+          <w:left w:val="single" w:color="1E6B45" w:sz="18" w:space="8"/>
         </w:pBdr>
-        <w:shd w:val="clear" w:color="auto" w:fill="EAF5EE"/>
-        <w:spacing w:after="200" w:line="320" w:lineRule="auto"/>
+        <w:shd w:fill="EAF5EE" w:color="auto" w:val="clear"/>
+        <w:spacing w:after="200" w:line="320"/>
         <w:ind w:left="170" w:right="170"/>
       </w:pPr>
       <w:r>
@@ -1350,16 +1346,16 @@
           <w:sz w:val="25"/>
           <w:szCs w:val="25"/>
         </w:rPr>
-        <w:t>So now, step five: we build this classical challenger, then we test every model.</w:t>
-      </w:r>
-    </w:p>
-    <w:p>
-      <w:pPr>
-        <w:pStyle w:val="Titre1"/>
-        <w:keepNext/>
-      </w:pPr>
-      <w:r>
-        <w:t>Slide 8 · Our classical challenger: a random forest</w:t>
+        <w:t xml:space="preserve">So now, step five: we build this classical challenger, then we test every model.</w:t>
+      </w:r>
+    </w:p>
+    <w:p>
+      <w:pPr>
+        <w:pStyle w:val="Heading1"/>
+        <w:keepNext/>
+      </w:pPr>
+      <w:r>
+        <w:t xml:space="preserve">Slide 8 · Our classical challenger: a random forest</w:t>
       </w:r>
     </w:p>
     <w:p>
@@ -1373,12 +1369,12 @@
           <w:sz w:val="19"/>
           <w:szCs w:val="19"/>
         </w:rPr>
-        <w:t>6:30 to 7:20 · 50 s · 112 words</w:t>
-      </w:r>
-    </w:p>
-    <w:p>
-      <w:pPr>
-        <w:spacing w:after="160" w:line="320" w:lineRule="auto"/>
+        <w:t xml:space="preserve">6:30 to 7:20 · 50 s · 112 words</w:t>
+      </w:r>
+    </w:p>
+    <w:p>
+      <w:pPr>
+        <w:spacing w:after="160" w:line="320"/>
       </w:pPr>
       <w:r>
         <w:rPr>
@@ -1395,7 +1391,7 @@
           <w:sz w:val="21"/>
           <w:szCs w:val="21"/>
         </w:rPr>
-        <w:t>[point at the second box]</w:t>
+        <w:t xml:space="preserve">[point at the second box]</w:t>
       </w:r>
       <w:r>
         <w:rPr>
@@ -1407,7 +1403,7 @@
     </w:p>
     <w:p>
       <w:pPr>
-        <w:spacing w:after="160" w:line="320" w:lineRule="auto"/>
+        <w:spacing w:after="160" w:line="320"/>
       </w:pPr>
       <w:r>
         <w:rPr>
@@ -1417,7 +1413,7 @@
           <w:sz w:val="21"/>
           <w:szCs w:val="21"/>
         </w:rPr>
-        <w:t>[point at the tree]</w:t>
+        <w:t xml:space="preserve">[point at the tree]</w:t>
       </w:r>
       <w:r>
         <w:rPr>
@@ -1433,12 +1429,12 @@
           <w:sz w:val="25"/>
           <w:szCs w:val="25"/>
         </w:rPr>
-        <w:t>They vote, and the vote cancels the mistakes.</w:t>
-      </w:r>
-    </w:p>
-    <w:p>
-      <w:pPr>
-        <w:spacing w:after="160" w:line="320" w:lineRule="auto"/>
+        <w:t xml:space="preserve">They vote, and the vote cancels the mistakes.</w:t>
+      </w:r>
+    </w:p>
+    <w:p>
+      <w:pPr>
+        <w:spacing w:after="160" w:line="320"/>
       </w:pPr>
       <w:r>
         <w:rPr>
@@ -1448,7 +1444,7 @@
           <w:sz w:val="21"/>
           <w:szCs w:val="21"/>
         </w:rPr>
-        <w:t>[point at the right card]</w:t>
+        <w:t xml:space="preserve">[point at the right card]</w:t>
       </w:r>
       <w:r>
         <w:rPr>
@@ -1462,10 +1458,10 @@
       <w:pPr>
         <w:keepNext/>
         <w:pBdr>
-          <w:left w:val="single" w:sz="18" w:space="8" w:color="1E6B45"/>
+          <w:left w:val="single" w:color="1E6B45" w:sz="18" w:space="8"/>
         </w:pBdr>
-        <w:shd w:val="clear" w:color="auto" w:fill="EAF5EE"/>
-        <w:spacing w:before="60"/>
+        <w:shd w:fill="EAF5EE" w:color="auto" w:val="clear"/>
+        <w:spacing w:after="0" w:before="60"/>
         <w:ind w:left="170" w:right="170"/>
       </w:pPr>
       <w:r>
@@ -1476,16 +1472,16 @@
           <w:sz w:val="17"/>
           <w:szCs w:val="17"/>
         </w:rPr>
-        <w:t>TRANSITION TO SLIDE 9</w:t>
+        <w:t xml:space="preserve">TRANSITION TO SLIDE 9</w:t>
       </w:r>
     </w:p>
     <w:p>
       <w:pPr>
         <w:pBdr>
-          <w:left w:val="single" w:sz="18" w:space="8" w:color="1E6B45"/>
+          <w:left w:val="single" w:color="1E6B45" w:sz="18" w:space="8"/>
         </w:pBdr>
-        <w:shd w:val="clear" w:color="auto" w:fill="EAF5EE"/>
-        <w:spacing w:after="200" w:line="320" w:lineRule="auto"/>
+        <w:shd w:fill="EAF5EE" w:color="auto" w:val="clear"/>
+        <w:spacing w:after="200" w:line="320"/>
         <w:ind w:left="170" w:right="170"/>
       </w:pPr>
       <w:r>
@@ -1504,18 +1500,17 @@
           <w:sz w:val="25"/>
           <w:szCs w:val="25"/>
         </w:rPr>
-        <w:t>So now, the final test: every model, on 220 paintings never seen before.</w:t>
-      </w:r>
-    </w:p>
-    <w:p>
-      <w:pPr>
-        <w:pStyle w:val="Titre1"/>
+        <w:t xml:space="preserve">So now, the final test: every model, on 220 paintings never seen before.</w:t>
+      </w:r>
+    </w:p>
+    <w:p>
+      <w:pPr>
+        <w:pStyle w:val="Heading1"/>
         <w:keepNext/>
         <w:pageBreakBefore/>
       </w:pPr>
       <w:r>
-        <w:lastRenderedPageBreak/>
-        <w:t>Slide 9 · Final test: the pretrained network wins</w:t>
+        <w:t xml:space="preserve">Slide 9 · Final test: the pretrained network wins</w:t>
       </w:r>
     </w:p>
     <w:p>
@@ -1529,12 +1524,12 @@
           <w:sz w:val="19"/>
           <w:szCs w:val="19"/>
         </w:rPr>
-        <w:t>7:20 to 8:15 · 55 s · 118 words</w:t>
-      </w:r>
-    </w:p>
-    <w:p>
-      <w:pPr>
-        <w:spacing w:after="160" w:line="320" w:lineRule="auto"/>
+        <w:t xml:space="preserve">7:20 to 8:15 · 55 s · 118 words</w:t>
+      </w:r>
+    </w:p>
+    <w:p>
+      <w:pPr>
+        <w:spacing w:after="160" w:line="320"/>
       </w:pPr>
       <w:r>
         <w:rPr>
@@ -1551,7 +1546,7 @@
           <w:sz w:val="21"/>
           <w:szCs w:val="21"/>
         </w:rPr>
-        <w:t>[point at the top bars]</w:t>
+        <w:t xml:space="preserve">[point at the top bars]</w:t>
       </w:r>
       <w:r>
         <w:rPr>
@@ -1563,7 +1558,7 @@
     </w:p>
     <w:p>
       <w:pPr>
-        <w:spacing w:after="160" w:line="320" w:lineRule="auto"/>
+        <w:spacing w:after="160" w:line="320"/>
       </w:pPr>
       <w:r>
         <w:rPr>
@@ -1580,7 +1575,7 @@
           <w:sz w:val="21"/>
           <w:szCs w:val="21"/>
         </w:rPr>
-        <w:t>[point at the blue card]</w:t>
+        <w:t xml:space="preserve">[point at the blue card]</w:t>
       </w:r>
       <w:r>
         <w:rPr>
@@ -1596,12 +1591,12 @@
           <w:sz w:val="25"/>
           <w:szCs w:val="25"/>
         </w:rPr>
-        <w:t>16.4 points over the random forest, between 9 and 24 points: it is not luck.</w:t>
-      </w:r>
-    </w:p>
-    <w:p>
-      <w:pPr>
-        <w:spacing w:after="160" w:line="320" w:lineRule="auto"/>
+        <w:t xml:space="preserve">16.4 points over the random forest, between 9 and 24 points: it is not luck.</w:t>
+      </w:r>
+    </w:p>
+    <w:p>
+      <w:pPr>
+        <w:spacing w:after="160" w:line="320"/>
       </w:pPr>
       <w:r>
         <w:rPr>
@@ -1611,7 +1606,7 @@
           <w:sz w:val="21"/>
           <w:szCs w:val="21"/>
         </w:rPr>
-        <w:t>[point at the grey card]</w:t>
+        <w:t xml:space="preserve">[point at the grey card]</w:t>
       </w:r>
       <w:r>
         <w:rPr>
@@ -1628,17 +1623,17 @@
           <w:sz w:val="25"/>
           <w:szCs w:val="25"/>
         </w:rPr>
-        <w:t>(optional) One honest note: the fine-tuned model is first here, but it was second on validation, and we keep the model chosen before the test.</w:t>
+        <w:t xml:space="preserve">(optional) One honest note: the fine-tuned model is first here, but it was second on validation, and we keep the model chosen before the test.</w:t>
       </w:r>
     </w:p>
     <w:p>
       <w:pPr>
         <w:keepNext/>
         <w:pBdr>
-          <w:left w:val="single" w:sz="18" w:space="8" w:color="1E6B45"/>
+          <w:left w:val="single" w:color="1E6B45" w:sz="18" w:space="8"/>
         </w:pBdr>
-        <w:shd w:val="clear" w:color="auto" w:fill="EAF5EE"/>
-        <w:spacing w:before="60"/>
+        <w:shd w:fill="EAF5EE" w:color="auto" w:val="clear"/>
+        <w:spacing w:after="0" w:before="60"/>
         <w:ind w:left="170" w:right="170"/>
       </w:pPr>
       <w:r>
@@ -1649,16 +1644,16 @@
           <w:sz w:val="17"/>
           <w:szCs w:val="17"/>
         </w:rPr>
-        <w:t>TRANSITION TO SLIDE 10</w:t>
+        <w:t xml:space="preserve">TRANSITION TO SLIDE 10</w:t>
       </w:r>
     </w:p>
     <w:p>
       <w:pPr>
         <w:pBdr>
-          <w:left w:val="single" w:sz="18" w:space="8" w:color="1E6B45"/>
+          <w:left w:val="single" w:color="1E6B45" w:sz="18" w:space="8"/>
         </w:pBdr>
-        <w:shd w:val="clear" w:color="auto" w:fill="EAF5EE"/>
-        <w:spacing w:after="200" w:line="320" w:lineRule="auto"/>
+        <w:shd w:fill="EAF5EE" w:color="auto" w:val="clear"/>
+        <w:spacing w:after="200" w:line="320"/>
         <w:ind w:left="170" w:right="170"/>
       </w:pPr>
       <w:r>
@@ -1677,16 +1672,16 @@
           <w:sz w:val="25"/>
           <w:szCs w:val="25"/>
         </w:rPr>
-        <w:t>So now, step six: what does it cost on a kiosk?</w:t>
-      </w:r>
-    </w:p>
-    <w:p>
-      <w:pPr>
-        <w:pStyle w:val="Titre1"/>
-        <w:keepNext/>
-      </w:pPr>
-      <w:r>
-        <w:t>Slide 10 · Fast and cheap enough for a kiosk</w:t>
+        <w:t xml:space="preserve">So now, step six: what does it cost on a kiosk?</w:t>
+      </w:r>
+    </w:p>
+    <w:p>
+      <w:pPr>
+        <w:pStyle w:val="Heading1"/>
+        <w:keepNext/>
+      </w:pPr>
+      <w:r>
+        <w:t xml:space="preserve">Slide 10 · Fast and cheap enough for a kiosk</w:t>
       </w:r>
     </w:p>
     <w:p>
@@ -1700,12 +1695,12 @@
           <w:sz w:val="19"/>
           <w:szCs w:val="19"/>
         </w:rPr>
-        <w:t>8:15 to 8:50 · 35 s · 71 words</w:t>
-      </w:r>
-    </w:p>
-    <w:p>
-      <w:pPr>
-        <w:spacing w:after="160" w:line="320" w:lineRule="auto"/>
+        <w:t xml:space="preserve">8:15 to 8:50 · 35 s · 71 words</w:t>
+      </w:r>
+    </w:p>
+    <w:p>
+      <w:pPr>
+        <w:spacing w:after="160" w:line="320"/>
       </w:pPr>
       <w:r>
         <w:rPr>
@@ -1722,7 +1717,7 @@
           <w:sz w:val="21"/>
           <w:szCs w:val="21"/>
         </w:rPr>
-        <w:t>[point at the blue card]</w:t>
+        <w:t xml:space="preserve">[point at the blue card]</w:t>
       </w:r>
       <w:r>
         <w:rPr>
@@ -1738,36 +1733,36 @@
           <w:sz w:val="25"/>
           <w:szCs w:val="25"/>
         </w:rPr>
-        <w:t>53 milliseconds on one CPU thread</w:t>
-      </w:r>
-      <w:r>
-        <w:rPr>
-          <w:sz w:val="25"/>
-          <w:szCs w:val="25"/>
-        </w:rPr>
-        <w:t>, 26 with four threads: faster than a blink. Even on a kiosk four times slower, it answers in a fifth of a second.</w:t>
-      </w:r>
-    </w:p>
-    <w:p>
-      <w:pPr>
-        <w:spacing w:after="160" w:line="320" w:lineRule="auto"/>
-      </w:pPr>
-      <w:r>
-        <w:rPr>
-          <w:sz w:val="25"/>
-          <w:szCs w:val="25"/>
-        </w:rPr>
-        <w:t>The model file is 45 megabytes.</w:t>
+        <w:t xml:space="preserve">53 milliseconds on one CPU thread</w:t>
+      </w:r>
+      <w:r>
+        <w:rPr>
+          <w:sz w:val="25"/>
+          <w:szCs w:val="25"/>
+        </w:rPr>
+        <w:t xml:space="preserve">, 26 with four threads: faster than a blink. Even on a kiosk four times slower, it answers in a fifth of a second.</w:t>
+      </w:r>
+    </w:p>
+    <w:p>
+      <w:pPr>
+        <w:spacing w:after="160" w:line="320"/>
+      </w:pPr>
+      <w:r>
+        <w:rPr>
+          <w:sz w:val="25"/>
+          <w:szCs w:val="25"/>
+        </w:rPr>
+        <w:t xml:space="preserve">The model file is 45 megabytes.</w:t>
       </w:r>
     </w:p>
     <w:p>
       <w:pPr>
         <w:keepNext/>
         <w:pBdr>
-          <w:left w:val="single" w:sz="18" w:space="8" w:color="1E6B45"/>
+          <w:left w:val="single" w:color="1E6B45" w:sz="18" w:space="8"/>
         </w:pBdr>
-        <w:shd w:val="clear" w:color="auto" w:fill="EAF5EE"/>
-        <w:spacing w:before="60"/>
+        <w:shd w:fill="EAF5EE" w:color="auto" w:val="clear"/>
+        <w:spacing w:after="0" w:before="60"/>
         <w:ind w:left="170" w:right="170"/>
       </w:pPr>
       <w:r>
@@ -1778,16 +1773,16 @@
           <w:sz w:val="17"/>
           <w:szCs w:val="17"/>
         </w:rPr>
-        <w:t>TRANSITION TO SLIDE 11</w:t>
+        <w:t xml:space="preserve">TRANSITION TO SLIDE 11</w:t>
       </w:r>
     </w:p>
     <w:p>
       <w:pPr>
         <w:pBdr>
-          <w:left w:val="single" w:sz="18" w:space="8" w:color="1E6B45"/>
+          <w:left w:val="single" w:color="1E6B45" w:sz="18" w:space="8"/>
         </w:pBdr>
-        <w:shd w:val="clear" w:color="auto" w:fill="EAF5EE"/>
-        <w:spacing w:after="200" w:line="320" w:lineRule="auto"/>
+        <w:shd w:fill="EAF5EE" w:color="auto" w:val="clear"/>
+        <w:spacing w:after="200" w:line="320"/>
         <w:ind w:left="170" w:right="170"/>
       </w:pPr>
       <w:r>
@@ -1806,18 +1801,17 @@
           <w:sz w:val="25"/>
           <w:szCs w:val="25"/>
         </w:rPr>
-        <w:t>So now, we have everything we need to answer the director.</w:t>
-      </w:r>
-    </w:p>
-    <w:p>
-      <w:pPr>
-        <w:pStyle w:val="Titre1"/>
+        <w:t xml:space="preserve">So now, we have everything we need to answer the director.</w:t>
+      </w:r>
+    </w:p>
+    <w:p>
+      <w:pPr>
+        <w:pStyle w:val="Heading1"/>
         <w:keepNext/>
         <w:pageBreakBefore/>
       </w:pPr>
       <w:r>
-        <w:lastRenderedPageBreak/>
-        <w:t>Slide 11 · Our choice: frozen ResNet18 + linear head</w:t>
+        <w:t xml:space="preserve">Slide 11 · Our choice: frozen ResNet18 + linear head</w:t>
       </w:r>
     </w:p>
     <w:p>
@@ -1831,12 +1825,12 @@
           <w:sz w:val="19"/>
           <w:szCs w:val="19"/>
         </w:rPr>
-        <w:t>8:50 to 9:40 · 50 s · 113 words</w:t>
-      </w:r>
-    </w:p>
-    <w:p>
-      <w:pPr>
-        <w:spacing w:after="160" w:line="320" w:lineRule="auto"/>
+        <w:t xml:space="preserve">8:50 to 9:40 · 50 s · 113 words</w:t>
+      </w:r>
+    </w:p>
+    <w:p>
+      <w:pPr>
+        <w:spacing w:after="160" w:line="320"/>
       </w:pPr>
       <w:r>
         <w:rPr>
@@ -1846,7 +1840,7 @@
           <w:sz w:val="21"/>
           <w:szCs w:val="21"/>
         </w:rPr>
-        <w:t>[point at the line under the title]</w:t>
+        <w:t xml:space="preserve">[point at the line under the title]</w:t>
       </w:r>
       <w:r>
         <w:rPr>
@@ -1858,7 +1852,7 @@
     </w:p>
     <w:p>
       <w:pPr>
-        <w:spacing w:after="160" w:line="320" w:lineRule="auto"/>
+        <w:spacing w:after="160" w:line="320"/>
       </w:pPr>
       <w:r>
         <w:rPr>
@@ -1874,12 +1868,12 @@
           <w:sz w:val="25"/>
           <w:szCs w:val="25"/>
         </w:rPr>
-        <w:t>We recommend a frozen ResNet18 with a linear head.</w:t>
-      </w:r>
-    </w:p>
-    <w:p>
-      <w:pPr>
-        <w:spacing w:after="160" w:line="320" w:lineRule="auto"/>
+        <w:t xml:space="preserve">We recommend a frozen ResNet18 with a linear head.</w:t>
+      </w:r>
+    </w:p>
+    <w:p>
+      <w:pPr>
+        <w:spacing w:after="160" w:line="320"/>
       </w:pPr>
       <w:r>
         <w:rPr>
@@ -1889,7 +1883,7 @@
           <w:sz w:val="21"/>
           <w:szCs w:val="21"/>
         </w:rPr>
-        <w:t>[point at the left column]</w:t>
+        <w:t xml:space="preserve">[point at the left column]</w:t>
       </w:r>
       <w:r>
         <w:rPr>
@@ -1901,7 +1895,7 @@
     </w:p>
     <w:p>
       <w:pPr>
-        <w:spacing w:after="160" w:line="320" w:lineRule="auto"/>
+        <w:spacing w:after="160" w:line="320"/>
       </w:pPr>
       <w:r>
         <w:rPr>
@@ -1911,7 +1905,7 @@
           <w:sz w:val="21"/>
           <w:szCs w:val="21"/>
         </w:rPr>
-        <w:t>[point at the right column]</w:t>
+        <w:t xml:space="preserve">[point at the right column]</w:t>
       </w:r>
       <w:r>
         <w:rPr>
@@ -1923,23 +1917,23 @@
     </w:p>
     <w:p>
       <w:pPr>
-        <w:spacing w:after="160" w:line="320" w:lineRule="auto"/>
-      </w:pPr>
-      <w:r>
-        <w:rPr>
-          <w:b/>
-          <w:bCs/>
-          <w:sz w:val="25"/>
-          <w:szCs w:val="25"/>
-        </w:rPr>
-        <w:t>Thank you. We are happy to take your questions.</w:t>
+        <w:spacing w:after="160" w:line="320"/>
+      </w:pPr>
+      <w:r>
+        <w:rPr>
+          <w:b/>
+          <w:bCs/>
+          <w:sz w:val="25"/>
+          <w:szCs w:val="25"/>
+        </w:rPr>
+        <w:t xml:space="preserve">Thank you. We are happy to take your questions.</w:t>
       </w:r>
     </w:p>
     <w:sectPr>
-      <w:footerReference w:type="default" r:id="rId7"/>
-      <w:pgSz w:w="11906" w:h="16838"/>
+      <w:footerReference w:type="default" r:id="rId6"/>
+      <w:pgSz w:w="11906" w:h="16838" w:orient="portrait"/>
       <w:pgMar w:top="1134" w:right="1247" w:bottom="1134" w:left="1247" w:header="708" w:footer="708" w:gutter="0"/>
-      <w:cols w:space="720"/>
+      <w:pgNumType/>
       <w:docGrid w:linePitch="360"/>
     </w:sectPr>
   </w:body>
@@ -1947,9 +1941,18 @@
 </file>
 
 <file path=word/endnotes.xml><?xml version="1.0" encoding="utf-8"?>
-<w:endnotes xmlns:wpc="http://schemas.microsoft.com/office/word/2010/wordprocessingCanvas" xmlns:cx="http://schemas.microsoft.com/office/drawing/2014/chartex" xmlns:cx1="http://schemas.microsoft.com/office/drawing/2015/9/8/chartex" xmlns:cx2="http://schemas.microsoft.com/office/drawing/2015/10/21/chartex" xmlns:cx3="http://schemas.microsoft.com/office/drawing/2016/5/9/chartex" xmlns:cx4="http://schemas.microsoft.com/office/drawing/2016/5/10/chartex" xmlns:cx5="http://schemas.microsoft.com/office/drawing/2016/5/11/chartex" xmlns:cx6="http://schemas.microsoft.com/office/drawing/2016/5/12/chartex" xmlns:cx7="http://schemas.microsoft.com/office/drawing/2016/5/13/chartex" xmlns:cx8="http://schemas.microsoft.com/office/drawing/2016/5/14/chartex" xmlns:mc="http://schemas.openxmlformats.org/markup-compatibility/2006" xmlns:aink="http://schemas.microsoft.com/office/drawing/2016/ink" xmlns:am3d="http://schemas.microsoft.com/office/drawing/2017/model3d" xmlns:o="urn:schemas-microsoft-com:office:office" xmlns:oel="http://schemas.microsoft.com/office/2019/extlst" xmlns:r="http://schemas.openxmlformats.org/officeDocument/2006/relationships" xmlns:m="http://schemas.openxmlformats.org/officeDocument/2006/math" xmlns:v="urn:schemas-microsoft-com:vml" xmlns:wp14="http://schemas.microsoft.com/office/word/2010/wordprocessingDrawing" xmlns:wp="http://schemas.openxmlformats.org/drawingml/2006/wordprocessingDrawing" xmlns:w10="urn:schemas-microsoft-com:office:word" xmlns:w="http://schemas.openxmlformats.org/wordprocessingml/2006/main" xmlns:w14="http://schemas.microsoft.com/office/word/2010/wordml" xmlns:w15="http://schemas.microsoft.com/office/word/2012/wordml" xmlns:w16cex="http://schemas.microsoft.com/office/word/2018/wordml/cex" xmlns:w16cid="http://schemas.microsoft.com/office/word/2016/wordml/cid" xmlns:w16="http://schemas.microsoft.com/office/word/2018/wordml" xmlns:w16du="http://schemas.microsoft.com/office/word/2023/wordml/word16du" xmlns:w16sdtdh="http://schemas.microsoft.com/office/word/2020/wordml/sdtdatahash" xmlns:w16sdtfl="http://schemas.microsoft.com/office/word/2024/wordml/sdtformatlock" xmlns:w16se="http://schemas.microsoft.com/office/word/2015/wordml/symex" xmlns:wpg="http://schemas.microsoft.com/office/word/2010/wordprocessingGroup" xmlns:wpi="http://schemas.microsoft.com/office/word/2010/wordprocessingInk" xmlns:wne="http://schemas.microsoft.com/office/word/2006/wordml" xmlns:wps="http://schemas.microsoft.com/office/word/2010/wordprocessingShape" mc:Ignorable="w14 w15 w16se w16cid w16 w16cex w16sdtdh w16sdtfl w16du wp14">
+<w:endnotes xmlns:wpc="http://schemas.microsoft.com/office/word/2010/wordprocessingCanvas" xmlns:mc="http://schemas.openxmlformats.org/markup-compatibility/2006" xmlns:o="urn:schemas-microsoft-com:office:office" xmlns:r="http://schemas.openxmlformats.org/officeDocument/2006/relationships" xmlns:m="http://schemas.openxmlformats.org/officeDocument/2006/math" xmlns:v="urn:schemas-microsoft-com:vml" xmlns:wp14="http://schemas.microsoft.com/office/word/2010/wordprocessingDrawing" xmlns:wp="http://schemas.openxmlformats.org/drawingml/2006/wordprocessingDrawing" xmlns:w10="urn:schemas-microsoft-com:office:word" xmlns:w="http://schemas.openxmlformats.org/wordprocessingml/2006/main" xmlns:w14="http://schemas.microsoft.com/office/word/2010/wordml" xmlns:w15="http://schemas.microsoft.com/office/word/2012/wordml" xmlns:wpg="http://schemas.microsoft.com/office/word/2010/wordprocessingGroup" xmlns:wpi="http://schemas.microsoft.com/office/word/2010/wordprocessingInk" xmlns:wne="http://schemas.microsoft.com/office/word/2006/wordml" xmlns:wps="http://schemas.microsoft.com/office/word/2010/wordprocessingShape" mc:Ignorable="w14 w15 wp14">
   <w:endnote w:type="separator" w:id="-1">
     <w:p>
+      <w:pPr>
+        <w:spacing w:after="0" w:line="240" w:lineRule="auto"/>
+      </w:pPr>
+      <w:r>
+        <w:rPr>
+          <w:rStyle w:val="EndnoteReference"/>
+        </w:rPr>
+        <w:endnoteRef/>
+      </w:r>
       <w:r>
         <w:separator/>
       </w:r>
@@ -1957,6 +1960,15 @@
   </w:endnote>
   <w:endnote w:type="continuationSeparator" w:id="0">
     <w:p>
+      <w:pPr>
+        <w:spacing w:after="0" w:line="240" w:lineRule="auto"/>
+      </w:pPr>
+      <w:r>
+        <w:rPr>
+          <w:rStyle w:val="EndnoteReference"/>
+        </w:rPr>
+        <w:endnoteRef/>
+      </w:r>
       <w:r>
         <w:continuationSeparator/>
       </w:r>
@@ -1966,7 +1978,7 @@
 </file>
 
 <file path=word/footer1.xml><?xml version="1.0" encoding="utf-8"?>
-<w:ftr xmlns:wpc="http://schemas.microsoft.com/office/word/2010/wordprocessingCanvas" xmlns:cx="http://schemas.microsoft.com/office/drawing/2014/chartex" xmlns:cx1="http://schemas.microsoft.com/office/drawing/2015/9/8/chartex" xmlns:cx2="http://schemas.microsoft.com/office/drawing/2015/10/21/chartex" xmlns:cx3="http://schemas.microsoft.com/office/drawing/2016/5/9/chartex" xmlns:cx4="http://schemas.microsoft.com/office/drawing/2016/5/10/chartex" xmlns:cx5="http://schemas.microsoft.com/office/drawing/2016/5/11/chartex" xmlns:cx6="http://schemas.microsoft.com/office/drawing/2016/5/12/chartex" xmlns:cx7="http://schemas.microsoft.com/office/drawing/2016/5/13/chartex" xmlns:cx8="http://schemas.microsoft.com/office/drawing/2016/5/14/chartex" xmlns:mc="http://schemas.openxmlformats.org/markup-compatibility/2006" xmlns:aink="http://schemas.microsoft.com/office/drawing/2016/ink" xmlns:am3d="http://schemas.microsoft.com/office/drawing/2017/model3d" xmlns:o="urn:schemas-microsoft-com:office:office" xmlns:oel="http://schemas.microsoft.com/office/2019/extlst" xmlns:r="http://schemas.openxmlformats.org/officeDocument/2006/relationships" xmlns:m="http://schemas.openxmlformats.org/officeDocument/2006/math" xmlns:v="urn:schemas-microsoft-com:vml" xmlns:wp14="http://schemas.microsoft.com/office/word/2010/wordprocessingDrawing" xmlns:wp="http://schemas.openxmlformats.org/drawingml/2006/wordprocessingDrawing" xmlns:w10="urn:schemas-microsoft-com:office:word" xmlns:w="http://schemas.openxmlformats.org/wordprocessingml/2006/main" xmlns:w14="http://schemas.microsoft.com/office/word/2010/wordml" xmlns:w15="http://schemas.microsoft.com/office/word/2012/wordml" xmlns:w16cex="http://schemas.microsoft.com/office/word/2018/wordml/cex" xmlns:w16cid="http://schemas.microsoft.com/office/word/2016/wordml/cid" xmlns:w16="http://schemas.microsoft.com/office/word/2018/wordml" xmlns:w16du="http://schemas.microsoft.com/office/word/2023/wordml/word16du" xmlns:w16sdtdh="http://schemas.microsoft.com/office/word/2020/wordml/sdtdatahash" xmlns:w16sdtfl="http://schemas.microsoft.com/office/word/2024/wordml/sdtformatlock" xmlns:w16se="http://schemas.microsoft.com/office/word/2015/wordml/symex" xmlns:wpg="http://schemas.microsoft.com/office/word/2010/wordprocessingGroup" xmlns:wpi="http://schemas.microsoft.com/office/word/2010/wordprocessingInk" xmlns:wne="http://schemas.microsoft.com/office/word/2006/wordml" xmlns:wps="http://schemas.microsoft.com/office/word/2010/wordprocessingShape" mc:Ignorable="w14 w15 w16se w16cid w16 w16cex w16sdtdh w16sdtfl w16du wp14">
+<w:ftr xmlns:wpc="http://schemas.microsoft.com/office/word/2010/wordprocessingCanvas" xmlns:mc="http://schemas.openxmlformats.org/markup-compatibility/2006" xmlns:o="urn:schemas-microsoft-com:office:office" xmlns:r="http://schemas.openxmlformats.org/officeDocument/2006/relationships" xmlns:m="http://schemas.openxmlformats.org/officeDocument/2006/math" xmlns:v="urn:schemas-microsoft-com:vml" xmlns:wp14="http://schemas.microsoft.com/office/word/2010/wordprocessingDrawing" xmlns:wp="http://schemas.openxmlformats.org/drawingml/2006/wordprocessingDrawing" xmlns:w10="urn:schemas-microsoft-com:office:word" xmlns:w="http://schemas.openxmlformats.org/wordprocessingml/2006/main" xmlns:w14="http://schemas.microsoft.com/office/word/2010/wordml" xmlns:w15="http://schemas.microsoft.com/office/word/2012/wordml" xmlns:wpg="http://schemas.microsoft.com/office/word/2010/wordprocessingGroup" xmlns:wpi="http://schemas.microsoft.com/office/word/2010/wordprocessingInk" xmlns:wne="http://schemas.microsoft.com/office/word/2006/wordml" xmlns:wps="http://schemas.microsoft.com/office/word/2010/wordprocessingShape">
   <w:p>
     <w:pPr>
       <w:jc w:val="right"/>
@@ -1993,7 +2005,7 @@
         <w:sz w:val="16"/>
         <w:szCs w:val="16"/>
       </w:rPr>
-      <w:instrText>PAGE</w:instrText>
+      <w:instrText xml:space="preserve">PAGE</w:instrText>
     </w:r>
     <w:r>
       <w:rPr>
@@ -2002,15 +2014,6 @@
         <w:szCs w:val="16"/>
       </w:rPr>
       <w:fldChar w:fldCharType="separate"/>
-    </w:r>
-    <w:r>
-      <w:rPr>
-        <w:noProof/>
-        <w:color w:val="5F6473"/>
-        <w:sz w:val="16"/>
-        <w:szCs w:val="16"/>
-      </w:rPr>
-      <w:t>1</w:t>
     </w:r>
     <w:r>
       <w:rPr>
@@ -2025,9 +2028,18 @@
 </file>
 
 <file path=word/footnotes.xml><?xml version="1.0" encoding="utf-8"?>
-<w:footnotes xmlns:wpc="http://schemas.microsoft.com/office/word/2010/wordprocessingCanvas" xmlns:cx="http://schemas.microsoft.com/office/drawing/2014/chartex" xmlns:cx1="http://schemas.microsoft.com/office/drawing/2015/9/8/chartex" xmlns:cx2="http://schemas.microsoft.com/office/drawing/2015/10/21/chartex" xmlns:cx3="http://schemas.microsoft.com/office/drawing/2016/5/9/chartex" xmlns:cx4="http://schemas.microsoft.com/office/drawing/2016/5/10/chartex" xmlns:cx5="http://schemas.microsoft.com/office/drawing/2016/5/11/chartex" xmlns:cx6="http://schemas.microsoft.com/office/drawing/2016/5/12/chartex" xmlns:cx7="http://schemas.microsoft.com/office/drawing/2016/5/13/chartex" xmlns:cx8="http://schemas.microsoft.com/office/drawing/2016/5/14/chartex" xmlns:mc="http://schemas.openxmlformats.org/markup-compatibility/2006" xmlns:aink="http://schemas.microsoft.com/office/drawing/2016/ink" xmlns:am3d="http://schemas.microsoft.com/office/drawing/2017/model3d" xmlns:o="urn:schemas-microsoft-com:office:office" xmlns:oel="http://schemas.microsoft.com/office/2019/extlst" xmlns:r="http://schemas.openxmlformats.org/officeDocument/2006/relationships" xmlns:m="http://schemas.openxmlformats.org/officeDocument/2006/math" xmlns:v="urn:schemas-microsoft-com:vml" xmlns:wp14="http://schemas.microsoft.com/office/word/2010/wordprocessingDrawing" xmlns:wp="http://schemas.openxmlformats.org/drawingml/2006/wordprocessingDrawing" xmlns:w10="urn:schemas-microsoft-com:office:word" xmlns:w="http://schemas.openxmlformats.org/wordprocessingml/2006/main" xmlns:w14="http://schemas.microsoft.com/office/word/2010/wordml" xmlns:w15="http://schemas.microsoft.com/office/word/2012/wordml" xmlns:w16cex="http://schemas.microsoft.com/office/word/2018/wordml/cex" xmlns:w16cid="http://schemas.microsoft.com/office/word/2016/wordml/cid" xmlns:w16="http://schemas.microsoft.com/office/word/2018/wordml" xmlns:w16du="http://schemas.microsoft.com/office/word/2023/wordml/word16du" xmlns:w16sdtdh="http://schemas.microsoft.com/office/word/2020/wordml/sdtdatahash" xmlns:w16sdtfl="http://schemas.microsoft.com/office/word/2024/wordml/sdtformatlock" xmlns:w16se="http://schemas.microsoft.com/office/word/2015/wordml/symex" xmlns:wpg="http://schemas.microsoft.com/office/word/2010/wordprocessingGroup" xmlns:wpi="http://schemas.microsoft.com/office/word/2010/wordprocessingInk" xmlns:wne="http://schemas.microsoft.com/office/word/2006/wordml" xmlns:wps="http://schemas.microsoft.com/office/word/2010/wordprocessingShape" mc:Ignorable="w14 w15 w16se w16cid w16 w16cex w16sdtdh w16sdtfl w16du wp14">
+<w:footnotes xmlns:wpc="http://schemas.microsoft.com/office/word/2010/wordprocessingCanvas" xmlns:mc="http://schemas.openxmlformats.org/markup-compatibility/2006" xmlns:o="urn:schemas-microsoft-com:office:office" xmlns:r="http://schemas.openxmlformats.org/officeDocument/2006/relationships" xmlns:m="http://schemas.openxmlformats.org/officeDocument/2006/math" xmlns:v="urn:schemas-microsoft-com:vml" xmlns:wp14="http://schemas.microsoft.com/office/word/2010/wordprocessingDrawing" xmlns:wp="http://schemas.openxmlformats.org/drawingml/2006/wordprocessingDrawing" xmlns:w10="urn:schemas-microsoft-com:office:word" xmlns:w="http://schemas.openxmlformats.org/wordprocessingml/2006/main" xmlns:w14="http://schemas.microsoft.com/office/word/2010/wordml" xmlns:w15="http://schemas.microsoft.com/office/word/2012/wordml" xmlns:wpg="http://schemas.microsoft.com/office/word/2010/wordprocessingGroup" xmlns:wpi="http://schemas.microsoft.com/office/word/2010/wordprocessingInk" xmlns:wne="http://schemas.microsoft.com/office/word/2006/wordml" xmlns:wps="http://schemas.microsoft.com/office/word/2010/wordprocessingShape" mc:Ignorable="w14 w15 wp14">
   <w:footnote w:type="separator" w:id="-1">
     <w:p>
+      <w:pPr>
+        <w:spacing w:after="0" w:line="240" w:lineRule="auto"/>
+      </w:pPr>
+      <w:r>
+        <w:rPr>
+          <w:rStyle w:val="FootnoteReference"/>
+        </w:rPr>
+        <w:footnoteRef/>
+      </w:r>
       <w:r>
         <w:separator/>
       </w:r>
@@ -2035,6 +2047,15 @@
   </w:footnote>
   <w:footnote w:type="continuationSeparator" w:id="0">
     <w:p>
+      <w:pPr>
+        <w:spacing w:after="0" w:line="240" w:lineRule="auto"/>
+      </w:pPr>
+      <w:r>
+        <w:rPr>
+          <w:rStyle w:val="FootnoteReference"/>
+        </w:rPr>
+        <w:footnoteRef/>
+      </w:r>
       <w:r>
         <w:continuationSeparator/>
       </w:r>
@@ -2044,12 +2065,10 @@
 </file>
 
 <file path=word/numbering.xml><?xml version="1.0" encoding="utf-8"?>
-<w:numbering xmlns:wpc="http://schemas.microsoft.com/office/word/2010/wordprocessingCanvas" xmlns:cx="http://schemas.microsoft.com/office/drawing/2014/chartex" xmlns:cx1="http://schemas.microsoft.com/office/drawing/2015/9/8/chartex" xmlns:cx2="http://schemas.microsoft.com/office/drawing/2015/10/21/chartex" xmlns:cx3="http://schemas.microsoft.com/office/drawing/2016/5/9/chartex" xmlns:cx4="http://schemas.microsoft.com/office/drawing/2016/5/10/chartex" xmlns:cx5="http://schemas.microsoft.com/office/drawing/2016/5/11/chartex" xmlns:cx6="http://schemas.microsoft.com/office/drawing/2016/5/12/chartex" xmlns:cx7="http://schemas.microsoft.com/office/drawing/2016/5/13/chartex" xmlns:cx8="http://schemas.microsoft.com/office/drawing/2016/5/14/chartex" xmlns:mc="http://schemas.openxmlformats.org/markup-compatibility/2006" xmlns:aink="http://schemas.microsoft.com/office/drawing/2016/ink" xmlns:am3d="http://schemas.microsoft.com/office/drawing/2017/model3d" xmlns:o="urn:schemas-microsoft-com:office:office" xmlns:oel="http://schemas.microsoft.com/office/2019/extlst" xmlns:r="http://schemas.openxmlformats.org/officeDocument/2006/relationships" xmlns:m="http://schemas.openxmlformats.org/officeDocument/2006/math" xmlns:v="urn:schemas-microsoft-com:vml" xmlns:wp14="http://schemas.microsoft.com/office/word/2010/wordprocessingDrawing" xmlns:wp="http://schemas.openxmlformats.org/drawingml/2006/wordprocessingDrawing" xmlns:w10="urn:schemas-microsoft-com:office:word" xmlns:w="http://schemas.openxmlformats.org/wordprocessingml/2006/main" xmlns:w14="http://schemas.microsoft.com/office/word/2010/wordml" xmlns:w15="http://schemas.microsoft.com/office/word/2012/wordml" xmlns:w16cex="http://schemas.microsoft.com/office/word/2018/wordml/cex" xmlns:w16cid="http://schemas.microsoft.com/office/word/2016/wordml/cid" xmlns:w16="http://schemas.microsoft.com/office/word/2018/wordml" xmlns:w16du="http://schemas.microsoft.com/office/word/2023/wordml/word16du" xmlns:w16sdtdh="http://schemas.microsoft.com/office/word/2020/wordml/sdtdatahash" xmlns:w16sdtfl="http://schemas.microsoft.com/office/word/2024/wordml/sdtformatlock" xmlns:w16se="http://schemas.microsoft.com/office/word/2015/wordml/symex" xmlns:wpg="http://schemas.microsoft.com/office/word/2010/wordprocessingGroup" xmlns:wpi="http://schemas.microsoft.com/office/word/2010/wordprocessingInk" xmlns:wne="http://schemas.microsoft.com/office/word/2006/wordml" xmlns:wps="http://schemas.microsoft.com/office/word/2010/wordprocessingShape" mc:Ignorable="w14 w15 w16se w16cid w16 w16cex w16sdtdh w16sdtfl w16du wp14">
-  <w:abstractNum w:abstractNumId="0" w15:restartNumberingAfterBreak="0">
-    <w:nsid w:val="57757284"/>
+<w:numbering xmlns:wpc="http://schemas.microsoft.com/office/word/2010/wordprocessingCanvas" xmlns:mc="http://schemas.openxmlformats.org/markup-compatibility/2006" xmlns:o="urn:schemas-microsoft-com:office:office" xmlns:r="http://schemas.openxmlformats.org/officeDocument/2006/relationships" xmlns:m="http://schemas.openxmlformats.org/officeDocument/2006/math" xmlns:v="urn:schemas-microsoft-com:vml" xmlns:wp14="http://schemas.microsoft.com/office/word/2010/wordprocessingDrawing" xmlns:wp="http://schemas.openxmlformats.org/drawingml/2006/wordprocessingDrawing" xmlns:w10="urn:schemas-microsoft-com:office:word" xmlns:w="http://schemas.openxmlformats.org/wordprocessingml/2006/main" xmlns:w14="http://schemas.microsoft.com/office/word/2010/wordml" xmlns:w15="http://schemas.microsoft.com/office/word/2012/wordml" xmlns:wpg="http://schemas.microsoft.com/office/word/2010/wordprocessingGroup" xmlns:wpi="http://schemas.microsoft.com/office/word/2010/wordprocessingInk" xmlns:wne="http://schemas.microsoft.com/office/word/2006/wordml" xmlns:wps="http://schemas.microsoft.com/office/word/2010/wordprocessingShape" mc:Ignorable="w14 w15 wp14">
+  <w:abstractNum w:abstractNumId="1" w15:restartNumberingAfterBreak="0">
     <w:multiLevelType w:val="hybridMultilevel"/>
-    <w:tmpl w:val="8BB63686"/>
-    <w:lvl w:ilvl="0" w:tplc="253E0C44">
+    <w:lvl w:ilvl="0" w:tentative="1">
       <w:start w:val="1"/>
       <w:numFmt w:val="bullet"/>
       <w:lvlText w:val="●"/>
@@ -2058,7 +2077,7 @@
         <w:ind w:left="720" w:hanging="360"/>
       </w:pPr>
     </w:lvl>
-    <w:lvl w:ilvl="1" w:tplc="FF144A82" w:tentative="1">
+    <w:lvl w:ilvl="1" w:tentative="1">
       <w:start w:val="1"/>
       <w:numFmt w:val="bullet"/>
       <w:lvlText w:val="○"/>
@@ -2067,7 +2086,7 @@
         <w:ind w:left="1440" w:hanging="360"/>
       </w:pPr>
     </w:lvl>
-    <w:lvl w:ilvl="2" w:tplc="DF5ED472" w:tentative="1">
+    <w:lvl w:ilvl="2" w:tentative="1">
       <w:start w:val="1"/>
       <w:numFmt w:val="bullet"/>
       <w:lvlText w:val="■"/>
@@ -2076,7 +2095,7 @@
         <w:ind w:left="2160" w:hanging="360"/>
       </w:pPr>
     </w:lvl>
-    <w:lvl w:ilvl="3" w:tplc="9C8A0432" w:tentative="1">
+    <w:lvl w:ilvl="3" w:tentative="1">
       <w:start w:val="1"/>
       <w:numFmt w:val="bullet"/>
       <w:lvlText w:val="●"/>
@@ -2085,7 +2104,7 @@
         <w:ind w:left="2880" w:hanging="360"/>
       </w:pPr>
     </w:lvl>
-    <w:lvl w:ilvl="4" w:tplc="4836A180" w:tentative="1">
+    <w:lvl w:ilvl="4" w:tentative="1">
       <w:start w:val="1"/>
       <w:numFmt w:val="bullet"/>
       <w:lvlText w:val="○"/>
@@ -2094,7 +2113,7 @@
         <w:ind w:left="3600" w:hanging="360"/>
       </w:pPr>
     </w:lvl>
-    <w:lvl w:ilvl="5" w:tplc="1DAEE55E" w:tentative="1">
+    <w:lvl w:ilvl="5" w:tentative="1">
       <w:start w:val="1"/>
       <w:numFmt w:val="bullet"/>
       <w:lvlText w:val="■"/>
@@ -2103,7 +2122,7 @@
         <w:ind w:left="4320" w:hanging="360"/>
       </w:pPr>
     </w:lvl>
-    <w:lvl w:ilvl="6" w:tplc="E90ADFDE" w:tentative="1">
+    <w:lvl w:ilvl="6" w:tentative="1">
       <w:start w:val="1"/>
       <w:numFmt w:val="bullet"/>
       <w:lvlText w:val="●"/>
@@ -2112,7 +2131,7 @@
         <w:ind w:left="5040" w:hanging="360"/>
       </w:pPr>
     </w:lvl>
-    <w:lvl w:ilvl="7" w:tplc="C584F3BC" w:tentative="1">
+    <w:lvl w:ilvl="7" w:tentative="1">
       <w:start w:val="1"/>
       <w:numFmt w:val="bullet"/>
       <w:lvlText w:val="●"/>
@@ -2121,7 +2140,7 @@
         <w:ind w:left="5760" w:hanging="360"/>
       </w:pPr>
     </w:lvl>
-    <w:lvl w:ilvl="8" w:tplc="37BA37C0" w:tentative="1">
+    <w:lvl w:ilvl="8" w:tentative="1">
       <w:start w:val="1"/>
       <w:numFmt w:val="bullet"/>
       <w:lvlText w:val="●"/>
@@ -2131,8 +2150,8 @@
       </w:pPr>
     </w:lvl>
   </w:abstractNum>
-  <w:num w:numId="1" w16cid:durableId="1201088930">
-    <w:abstractNumId w:val="0"/>
+  <w:num w:numId="1">
+    <w:abstractNumId w:val="1"/>
     <w:lvlOverride w:ilvl="0">
       <w:startOverride w:val="1"/>
     </w:lvlOverride>
@@ -2141,543 +2160,88 @@
 </file>
 
 <file path=word/styles.xml><?xml version="1.0" encoding="utf-8"?>
-<w:styles xmlns:mc="http://schemas.openxmlformats.org/markup-compatibility/2006" xmlns:r="http://schemas.openxmlformats.org/officeDocument/2006/relationships" xmlns:w="http://schemas.openxmlformats.org/wordprocessingml/2006/main" xmlns:w14="http://schemas.microsoft.com/office/word/2010/wordml" xmlns:w15="http://schemas.microsoft.com/office/word/2012/wordml" xmlns:w16cex="http://schemas.microsoft.com/office/word/2018/wordml/cex" xmlns:w16cid="http://schemas.microsoft.com/office/word/2016/wordml/cid" xmlns:w16="http://schemas.microsoft.com/office/word/2018/wordml" xmlns:w16du="http://schemas.microsoft.com/office/word/2023/wordml/word16du" xmlns:w16sdtdh="http://schemas.microsoft.com/office/word/2020/wordml/sdtdatahash" xmlns:w16sdtfl="http://schemas.microsoft.com/office/word/2024/wordml/sdtformatlock" xmlns:w16se="http://schemas.microsoft.com/office/word/2015/wordml/symex" mc:Ignorable="w14 w15 w16se w16cid w16 w16cex w16sdtdh w16sdtfl w16du">
+<w:styles xmlns:mc="http://schemas.openxmlformats.org/markup-compatibility/2006" xmlns:r="http://schemas.openxmlformats.org/officeDocument/2006/relationships" xmlns:w="http://schemas.openxmlformats.org/wordprocessingml/2006/main" xmlns:w14="http://schemas.microsoft.com/office/word/2010/wordml" xmlns:w15="http://schemas.microsoft.com/office/word/2012/wordml" mc:Ignorable="w14 w15">
   <w:docDefaults>
     <w:rPrDefault>
       <w:rPr>
-        <w:rFonts w:ascii="Calibri" w:eastAsia="Calibri" w:hAnsi="Calibri" w:cs="Calibri"/>
+        <w:rFonts w:ascii="Calibri" w:cs="Calibri" w:eastAsia="Calibri" w:hAnsi="Calibri"/>
         <w:sz w:val="22"/>
         <w:szCs w:val="22"/>
-        <w:lang w:val="fr-FR" w:eastAsia="fr-FR" w:bidi="ar-SA"/>
       </w:rPr>
     </w:rPrDefault>
     <w:pPrDefault/>
   </w:docDefaults>
-  <w:latentStyles w:defLockedState="0" w:defUIPriority="99" w:defSemiHidden="0" w:defUnhideWhenUsed="0" w:defQFormat="0" w:count="376">
-    <w:lsdException w:name="Normal" w:uiPriority="0" w:qFormat="1"/>
-    <w:lsdException w:name="heading 1" w:uiPriority="9" w:qFormat="1"/>
-    <w:lsdException w:name="heading 2" w:semiHidden="1" w:uiPriority="9" w:unhideWhenUsed="1" w:qFormat="1"/>
-    <w:lsdException w:name="heading 3" w:semiHidden="1" w:uiPriority="9" w:unhideWhenUsed="1" w:qFormat="1"/>
-    <w:lsdException w:name="heading 4" w:semiHidden="1" w:uiPriority="9" w:unhideWhenUsed="1" w:qFormat="1"/>
-    <w:lsdException w:name="heading 5" w:semiHidden="1" w:uiPriority="9" w:unhideWhenUsed="1" w:qFormat="1"/>
-    <w:lsdException w:name="heading 6" w:semiHidden="1" w:uiPriority="9" w:unhideWhenUsed="1" w:qFormat="1"/>
-    <w:lsdException w:name="heading 7" w:semiHidden="1" w:uiPriority="9" w:unhideWhenUsed="1" w:qFormat="1"/>
-    <w:lsdException w:name="heading 8" w:semiHidden="1" w:uiPriority="9" w:unhideWhenUsed="1" w:qFormat="1"/>
-    <w:lsdException w:name="heading 9" w:semiHidden="1" w:uiPriority="9" w:unhideWhenUsed="1" w:qFormat="1"/>
-    <w:lsdException w:name="index 1" w:semiHidden="1" w:unhideWhenUsed="1"/>
-    <w:lsdException w:name="index 2" w:semiHidden="1" w:unhideWhenUsed="1"/>
-    <w:lsdException w:name="index 3" w:semiHidden="1" w:unhideWhenUsed="1"/>
-    <w:lsdException w:name="index 4" w:semiHidden="1" w:unhideWhenUsed="1"/>
-    <w:lsdException w:name="index 5" w:semiHidden="1" w:unhideWhenUsed="1"/>
-    <w:lsdException w:name="index 6" w:semiHidden="1" w:unhideWhenUsed="1"/>
-    <w:lsdException w:name="index 7" w:semiHidden="1" w:unhideWhenUsed="1"/>
-    <w:lsdException w:name="index 8" w:semiHidden="1" w:unhideWhenUsed="1"/>
-    <w:lsdException w:name="index 9" w:semiHidden="1" w:unhideWhenUsed="1"/>
-    <w:lsdException w:name="toc 1" w:semiHidden="1" w:uiPriority="39" w:unhideWhenUsed="1"/>
-    <w:lsdException w:name="toc 2" w:semiHidden="1" w:uiPriority="39" w:unhideWhenUsed="1"/>
-    <w:lsdException w:name="toc 3" w:semiHidden="1" w:uiPriority="39" w:unhideWhenUsed="1"/>
-    <w:lsdException w:name="toc 4" w:semiHidden="1" w:uiPriority="39" w:unhideWhenUsed="1"/>
-    <w:lsdException w:name="toc 5" w:semiHidden="1" w:uiPriority="39" w:unhideWhenUsed="1"/>
-    <w:lsdException w:name="toc 6" w:semiHidden="1" w:uiPriority="39" w:unhideWhenUsed="1"/>
-    <w:lsdException w:name="toc 7" w:semiHidden="1" w:uiPriority="39" w:unhideWhenUsed="1"/>
-    <w:lsdException w:name="toc 8" w:semiHidden="1" w:uiPriority="39" w:unhideWhenUsed="1"/>
-    <w:lsdException w:name="toc 9" w:semiHidden="1" w:uiPriority="39" w:unhideWhenUsed="1"/>
-    <w:lsdException w:name="Normal Indent" w:semiHidden="1" w:unhideWhenUsed="1"/>
-    <w:lsdException w:name="footnote text" w:semiHidden="1" w:unhideWhenUsed="1"/>
-    <w:lsdException w:name="annotation text" w:semiHidden="1" w:unhideWhenUsed="1"/>
-    <w:lsdException w:name="header" w:semiHidden="1" w:unhideWhenUsed="1"/>
-    <w:lsdException w:name="footer" w:semiHidden="1" w:unhideWhenUsed="1"/>
-    <w:lsdException w:name="index heading" w:semiHidden="1" w:unhideWhenUsed="1"/>
-    <w:lsdException w:name="caption" w:semiHidden="1" w:uiPriority="35" w:unhideWhenUsed="1" w:qFormat="1"/>
-    <w:lsdException w:name="table of figures" w:semiHidden="1" w:unhideWhenUsed="1"/>
-    <w:lsdException w:name="envelope address" w:semiHidden="1" w:unhideWhenUsed="1"/>
-    <w:lsdException w:name="envelope return" w:semiHidden="1" w:unhideWhenUsed="1"/>
-    <w:lsdException w:name="footnote reference" w:semiHidden="1" w:unhideWhenUsed="1"/>
-    <w:lsdException w:name="annotation reference" w:semiHidden="1" w:unhideWhenUsed="1"/>
-    <w:lsdException w:name="line number" w:semiHidden="1" w:unhideWhenUsed="1"/>
-    <w:lsdException w:name="page number" w:semiHidden="1" w:unhideWhenUsed="1"/>
-    <w:lsdException w:name="endnote reference" w:semiHidden="1" w:unhideWhenUsed="1"/>
-    <w:lsdException w:name="endnote text" w:semiHidden="1" w:unhideWhenUsed="1"/>
-    <w:lsdException w:name="table of authorities" w:semiHidden="1" w:unhideWhenUsed="1"/>
-    <w:lsdException w:name="macro" w:semiHidden="1" w:unhideWhenUsed="1"/>
-    <w:lsdException w:name="toa heading" w:semiHidden="1" w:unhideWhenUsed="1"/>
-    <w:lsdException w:name="List" w:semiHidden="1" w:unhideWhenUsed="1"/>
-    <w:lsdException w:name="List Bullet" w:semiHidden="1" w:unhideWhenUsed="1"/>
-    <w:lsdException w:name="List Number" w:semiHidden="1" w:unhideWhenUsed="1"/>
-    <w:lsdException w:name="List 2" w:semiHidden="1" w:unhideWhenUsed="1"/>
-    <w:lsdException w:name="List 3" w:semiHidden="1" w:unhideWhenUsed="1"/>
-    <w:lsdException w:name="List 4" w:semiHidden="1" w:unhideWhenUsed="1"/>
-    <w:lsdException w:name="List 5" w:semiHidden="1" w:unhideWhenUsed="1"/>
-    <w:lsdException w:name="List Bullet 2" w:semiHidden="1" w:unhideWhenUsed="1"/>
-    <w:lsdException w:name="List Bullet 3" w:semiHidden="1" w:unhideWhenUsed="1"/>
-    <w:lsdException w:name="List Bullet 4" w:semiHidden="1" w:unhideWhenUsed="1"/>
-    <w:lsdException w:name="List Bullet 5" w:semiHidden="1" w:unhideWhenUsed="1"/>
-    <w:lsdException w:name="List Number 2" w:semiHidden="1" w:unhideWhenUsed="1"/>
-    <w:lsdException w:name="List Number 3" w:semiHidden="1" w:unhideWhenUsed="1"/>
-    <w:lsdException w:name="List Number 4" w:semiHidden="1" w:unhideWhenUsed="1"/>
-    <w:lsdException w:name="List Number 5" w:semiHidden="1" w:unhideWhenUsed="1"/>
-    <w:lsdException w:name="Title" w:uiPriority="10" w:qFormat="1"/>
-    <w:lsdException w:name="Closing" w:semiHidden="1" w:unhideWhenUsed="1"/>
-    <w:lsdException w:name="Signature" w:semiHidden="1" w:unhideWhenUsed="1"/>
-    <w:lsdException w:name="Default Paragraph Font" w:semiHidden="1" w:uiPriority="1" w:unhideWhenUsed="1"/>
-    <w:lsdException w:name="Body Text" w:semiHidden="1" w:unhideWhenUsed="1"/>
-    <w:lsdException w:name="Body Text Indent" w:semiHidden="1" w:unhideWhenUsed="1"/>
-    <w:lsdException w:name="List Continue" w:semiHidden="1" w:unhideWhenUsed="1"/>
-    <w:lsdException w:name="List Continue 2" w:semiHidden="1" w:unhideWhenUsed="1"/>
-    <w:lsdException w:name="List Continue 3" w:semiHidden="1" w:unhideWhenUsed="1"/>
-    <w:lsdException w:name="List Continue 4" w:semiHidden="1" w:unhideWhenUsed="1"/>
-    <w:lsdException w:name="List Continue 5" w:semiHidden="1" w:unhideWhenUsed="1"/>
-    <w:lsdException w:name="Message Header" w:semiHidden="1" w:unhideWhenUsed="1"/>
-    <w:lsdException w:name="Subtitle" w:uiPriority="11" w:qFormat="1"/>
-    <w:lsdException w:name="Salutation" w:semiHidden="1" w:unhideWhenUsed="1"/>
-    <w:lsdException w:name="Date" w:semiHidden="1" w:unhideWhenUsed="1"/>
-    <w:lsdException w:name="Body Text First Indent" w:semiHidden="1" w:unhideWhenUsed="1"/>
-    <w:lsdException w:name="Body Text First Indent 2" w:semiHidden="1" w:unhideWhenUsed="1"/>
-    <w:lsdException w:name="Note Heading" w:semiHidden="1" w:unhideWhenUsed="1"/>
-    <w:lsdException w:name="Body Text 2" w:semiHidden="1" w:unhideWhenUsed="1"/>
-    <w:lsdException w:name="Body Text 3" w:semiHidden="1" w:unhideWhenUsed="1"/>
-    <w:lsdException w:name="Body Text Indent 2" w:semiHidden="1" w:unhideWhenUsed="1"/>
-    <w:lsdException w:name="Body Text Indent 3" w:semiHidden="1" w:unhideWhenUsed="1"/>
-    <w:lsdException w:name="Block Text" w:semiHidden="1" w:unhideWhenUsed="1"/>
-    <w:lsdException w:name="Hyperlink" w:semiHidden="1" w:unhideWhenUsed="1"/>
-    <w:lsdException w:name="FollowedHyperlink" w:semiHidden="1" w:unhideWhenUsed="1"/>
-    <w:lsdException w:name="Strong" w:uiPriority="22" w:qFormat="1"/>
-    <w:lsdException w:name="Emphasis" w:uiPriority="20" w:qFormat="1"/>
-    <w:lsdException w:name="Document Map" w:semiHidden="1" w:unhideWhenUsed="1"/>
-    <w:lsdException w:name="Plain Text" w:semiHidden="1" w:unhideWhenUsed="1"/>
-    <w:lsdException w:name="E-mail Signature" w:semiHidden="1" w:unhideWhenUsed="1"/>
-    <w:lsdException w:name="HTML Top of Form" w:semiHidden="1" w:unhideWhenUsed="1"/>
-    <w:lsdException w:name="HTML Bottom of Form" w:semiHidden="1" w:unhideWhenUsed="1"/>
-    <w:lsdException w:name="Normal (Web)" w:semiHidden="1" w:unhideWhenUsed="1"/>
-    <w:lsdException w:name="HTML Acronym" w:semiHidden="1" w:unhideWhenUsed="1"/>
-    <w:lsdException w:name="HTML Address" w:semiHidden="1" w:unhideWhenUsed="1"/>
-    <w:lsdException w:name="HTML Cite" w:semiHidden="1" w:unhideWhenUsed="1"/>
-    <w:lsdException w:name="HTML Code" w:semiHidden="1" w:unhideWhenUsed="1"/>
-    <w:lsdException w:name="HTML Definition" w:semiHidden="1" w:unhideWhenUsed="1"/>
-    <w:lsdException w:name="HTML Keyboard" w:semiHidden="1" w:unhideWhenUsed="1"/>
-    <w:lsdException w:name="HTML Preformatted" w:semiHidden="1" w:unhideWhenUsed="1"/>
-    <w:lsdException w:name="HTML Sample" w:semiHidden="1" w:unhideWhenUsed="1"/>
-    <w:lsdException w:name="HTML Typewriter" w:semiHidden="1" w:unhideWhenUsed="1"/>
-    <w:lsdException w:name="HTML Variable" w:semiHidden="1" w:unhideWhenUsed="1"/>
-    <w:lsdException w:name="Normal Table" w:semiHidden="1" w:unhideWhenUsed="1"/>
-    <w:lsdException w:name="annotation subject" w:semiHidden="1" w:unhideWhenUsed="1"/>
-    <w:lsdException w:name="No List" w:semiHidden="1" w:unhideWhenUsed="1"/>
-    <w:lsdException w:name="Outline List 1" w:semiHidden="1" w:unhideWhenUsed="1"/>
-    <w:lsdException w:name="Outline List 2" w:semiHidden="1" w:unhideWhenUsed="1"/>
-    <w:lsdException w:name="Outline List 3" w:semiHidden="1" w:unhideWhenUsed="1"/>
-    <w:lsdException w:name="Table Simple 1" w:semiHidden="1" w:unhideWhenUsed="1"/>
-    <w:lsdException w:name="Table Simple 2" w:semiHidden="1" w:unhideWhenUsed="1"/>
-    <w:lsdException w:name="Table Simple 3" w:semiHidden="1" w:unhideWhenUsed="1"/>
-    <w:lsdException w:name="Table Classic 1" w:semiHidden="1" w:unhideWhenUsed="1"/>
-    <w:lsdException w:name="Table Classic 2" w:semiHidden="1" w:unhideWhenUsed="1"/>
-    <w:lsdException w:name="Table Classic 3" w:semiHidden="1" w:unhideWhenUsed="1"/>
-    <w:lsdException w:name="Table Classic 4" w:semiHidden="1" w:unhideWhenUsed="1"/>
-    <w:lsdException w:name="Table Colorful 1" w:semiHidden="1" w:unhideWhenUsed="1"/>
-    <w:lsdException w:name="Table Colorful 2" w:semiHidden="1" w:unhideWhenUsed="1"/>
-    <w:lsdException w:name="Table Colorful 3" w:semiHidden="1" w:unhideWhenUsed="1"/>
-    <w:lsdException w:name="Table Columns 1" w:semiHidden="1" w:unhideWhenUsed="1"/>
-    <w:lsdException w:name="Table Columns 2" w:semiHidden="1" w:unhideWhenUsed="1"/>
-    <w:lsdException w:name="Table Columns 3" w:semiHidden="1" w:unhideWhenUsed="1"/>
-    <w:lsdException w:name="Table Columns 4" w:semiHidden="1" w:unhideWhenUsed="1"/>
-    <w:lsdException w:name="Table Columns 5" w:semiHidden="1" w:unhideWhenUsed="1"/>
-    <w:lsdException w:name="Table Grid 1" w:semiHidden="1" w:unhideWhenUsed="1"/>
-    <w:lsdException w:name="Table Grid 2" w:semiHidden="1" w:unhideWhenUsed="1"/>
-    <w:lsdException w:name="Table Grid 3" w:semiHidden="1" w:unhideWhenUsed="1"/>
-    <w:lsdException w:name="Table Grid 4" w:semiHidden="1" w:unhideWhenUsed="1"/>
-    <w:lsdException w:name="Table Grid 5" w:semiHidden="1" w:unhideWhenUsed="1"/>
-    <w:lsdException w:name="Table Grid 6" w:semiHidden="1" w:unhideWhenUsed="1"/>
-    <w:lsdException w:name="Table Grid 7" w:semiHidden="1" w:unhideWhenUsed="1"/>
-    <w:lsdException w:name="Table Grid 8" w:semiHidden="1" w:unhideWhenUsed="1"/>
-    <w:lsdException w:name="Table List 1" w:semiHidden="1" w:unhideWhenUsed="1"/>
-    <w:lsdException w:name="Table List 2" w:semiHidden="1" w:unhideWhenUsed="1"/>
-    <w:lsdException w:name="Table List 3" w:semiHidden="1" w:unhideWhenUsed="1"/>
-    <w:lsdException w:name="Table List 4" w:semiHidden="1" w:unhideWhenUsed="1"/>
-    <w:lsdException w:name="Table List 5" w:semiHidden="1" w:unhideWhenUsed="1"/>
-    <w:lsdException w:name="Table List 6" w:semiHidden="1" w:unhideWhenUsed="1"/>
-    <w:lsdException w:name="Table List 7" w:semiHidden="1" w:unhideWhenUsed="1"/>
-    <w:lsdException w:name="Table List 8" w:semiHidden="1" w:unhideWhenUsed="1"/>
-    <w:lsdException w:name="Table 3D effects 1" w:semiHidden="1" w:unhideWhenUsed="1"/>
-    <w:lsdException w:name="Table 3D effects 2" w:semiHidden="1" w:unhideWhenUsed="1"/>
-    <w:lsdException w:name="Table 3D effects 3" w:semiHidden="1" w:unhideWhenUsed="1"/>
-    <w:lsdException w:name="Table Contemporary" w:semiHidden="1" w:unhideWhenUsed="1"/>
-    <w:lsdException w:name="Table Elegant" w:semiHidden="1" w:unhideWhenUsed="1"/>
-    <w:lsdException w:name="Table Professional" w:semiHidden="1" w:unhideWhenUsed="1"/>
-    <w:lsdException w:name="Table Subtle 1" w:semiHidden="1" w:unhideWhenUsed="1"/>
-    <w:lsdException w:name="Table Subtle 2" w:semiHidden="1" w:unhideWhenUsed="1"/>
-    <w:lsdException w:name="Table Web 1" w:semiHidden="1" w:unhideWhenUsed="1"/>
-    <w:lsdException w:name="Table Web 2" w:semiHidden="1" w:unhideWhenUsed="1"/>
-    <w:lsdException w:name="Table Web 3" w:semiHidden="1" w:unhideWhenUsed="1"/>
-    <w:lsdException w:name="Balloon Text" w:semiHidden="1" w:unhideWhenUsed="1"/>
-    <w:lsdException w:name="Table Grid" w:uiPriority="39"/>
-    <w:lsdException w:name="Table Theme" w:semiHidden="1" w:unhideWhenUsed="1"/>
-    <w:lsdException w:name="Placeholder Text" w:semiHidden="1"/>
-    <w:lsdException w:name="No Spacing" w:uiPriority="1" w:qFormat="1"/>
-    <w:lsdException w:name="Light Shading" w:uiPriority="60"/>
-    <w:lsdException w:name="Light List" w:uiPriority="61"/>
-    <w:lsdException w:name="Light Grid" w:uiPriority="62"/>
-    <w:lsdException w:name="Medium Shading 1" w:uiPriority="63"/>
-    <w:lsdException w:name="Medium Shading 2" w:uiPriority="64"/>
-    <w:lsdException w:name="Medium List 1" w:uiPriority="65"/>
-    <w:lsdException w:name="Medium List 2" w:uiPriority="66"/>
-    <w:lsdException w:name="Medium Grid 1" w:uiPriority="67"/>
-    <w:lsdException w:name="Medium Grid 2" w:uiPriority="68"/>
-    <w:lsdException w:name="Medium Grid 3" w:uiPriority="69"/>
-    <w:lsdException w:name="Dark List" w:uiPriority="70"/>
-    <w:lsdException w:name="Colorful Shading" w:uiPriority="71"/>
-    <w:lsdException w:name="Colorful List" w:uiPriority="72"/>
-    <w:lsdException w:name="Colorful Grid" w:uiPriority="73"/>
-    <w:lsdException w:name="Light Shading Accent 1" w:uiPriority="60"/>
-    <w:lsdException w:name="Light List Accent 1" w:uiPriority="61"/>
-    <w:lsdException w:name="Light Grid Accent 1" w:uiPriority="62"/>
-    <w:lsdException w:name="Medium Shading 1 Accent 1" w:uiPriority="63"/>
-    <w:lsdException w:name="Medium Shading 2 Accent 1" w:uiPriority="64"/>
-    <w:lsdException w:name="Medium List 1 Accent 1" w:uiPriority="65"/>
-    <w:lsdException w:name="Revision" w:semiHidden="1"/>
-    <w:lsdException w:name="List Paragraph" w:uiPriority="34" w:qFormat="1"/>
-    <w:lsdException w:name="Quote" w:uiPriority="29" w:qFormat="1"/>
-    <w:lsdException w:name="Intense Quote" w:uiPriority="30" w:qFormat="1"/>
-    <w:lsdException w:name="Medium List 2 Accent 1" w:uiPriority="66"/>
-    <w:lsdException w:name="Medium Grid 1 Accent 1" w:uiPriority="67"/>
-    <w:lsdException w:name="Medium Grid 2 Accent 1" w:uiPriority="68"/>
-    <w:lsdException w:name="Medium Grid 3 Accent 1" w:uiPriority="69"/>
-    <w:lsdException w:name="Dark List Accent 1" w:uiPriority="70"/>
-    <w:lsdException w:name="Colorful Shading Accent 1" w:uiPriority="71"/>
-    <w:lsdException w:name="Colorful List Accent 1" w:uiPriority="72"/>
-    <w:lsdException w:name="Colorful Grid Accent 1" w:uiPriority="73"/>
-    <w:lsdException w:name="Light Shading Accent 2" w:uiPriority="60"/>
-    <w:lsdException w:name="Light List Accent 2" w:uiPriority="61"/>
-    <w:lsdException w:name="Light Grid Accent 2" w:uiPriority="62"/>
-    <w:lsdException w:name="Medium Shading 1 Accent 2" w:uiPriority="63"/>
-    <w:lsdException w:name="Medium Shading 2 Accent 2" w:uiPriority="64"/>
-    <w:lsdException w:name="Medium List 1 Accent 2" w:uiPriority="65"/>
-    <w:lsdException w:name="Medium List 2 Accent 2" w:uiPriority="66"/>
-    <w:lsdException w:name="Medium Grid 1 Accent 2" w:uiPriority="67"/>
-    <w:lsdException w:name="Medium Grid 2 Accent 2" w:uiPriority="68"/>
-    <w:lsdException w:name="Medium Grid 3 Accent 2" w:uiPriority="69"/>
-    <w:lsdException w:name="Dark List Accent 2" w:uiPriority="70"/>
-    <w:lsdException w:name="Colorful Shading Accent 2" w:uiPriority="71"/>
-    <w:lsdException w:name="Colorful List Accent 2" w:uiPriority="72"/>
-    <w:lsdException w:name="Colorful Grid Accent 2" w:uiPriority="73"/>
-    <w:lsdException w:name="Light Shading Accent 3" w:uiPriority="60"/>
-    <w:lsdException w:name="Light List Accent 3" w:uiPriority="61"/>
-    <w:lsdException w:name="Light Grid Accent 3" w:uiPriority="62"/>
-    <w:lsdException w:name="Medium Shading 1 Accent 3" w:uiPriority="63"/>
-    <w:lsdException w:name="Medium Shading 2 Accent 3" w:uiPriority="64"/>
-    <w:lsdException w:name="Medium List 1 Accent 3" w:uiPriority="65"/>
-    <w:lsdException w:name="Medium List 2 Accent 3" w:uiPriority="66"/>
-    <w:lsdException w:name="Medium Grid 1 Accent 3" w:uiPriority="67"/>
-    <w:lsdException w:name="Medium Grid 2 Accent 3" w:uiPriority="68"/>
-    <w:lsdException w:name="Medium Grid 3 Accent 3" w:uiPriority="69"/>
-    <w:lsdException w:name="Dark List Accent 3" w:uiPriority="70"/>
-    <w:lsdException w:name="Colorful Shading Accent 3" w:uiPriority="71"/>
-    <w:lsdException w:name="Colorful List Accent 3" w:uiPriority="72"/>
-    <w:lsdException w:name="Colorful Grid Accent 3" w:uiPriority="73"/>
-    <w:lsdException w:name="Light Shading Accent 4" w:uiPriority="60"/>
-    <w:lsdException w:name="Light List Accent 4" w:uiPriority="61"/>
-    <w:lsdException w:name="Light Grid Accent 4" w:uiPriority="62"/>
-    <w:lsdException w:name="Medium Shading 1 Accent 4" w:uiPriority="63"/>
-    <w:lsdException w:name="Medium Shading 2 Accent 4" w:uiPriority="64"/>
-    <w:lsdException w:name="Medium List 1 Accent 4" w:uiPriority="65"/>
-    <w:lsdException w:name="Medium List 2 Accent 4" w:uiPriority="66"/>
-    <w:lsdException w:name="Medium Grid 1 Accent 4" w:uiPriority="67"/>
-    <w:lsdException w:name="Medium Grid 2 Accent 4" w:uiPriority="68"/>
-    <w:lsdException w:name="Medium Grid 3 Accent 4" w:uiPriority="69"/>
-    <w:lsdException w:name="Dark List Accent 4" w:uiPriority="70"/>
-    <w:lsdException w:name="Colorful Shading Accent 4" w:uiPriority="71"/>
-    <w:lsdException w:name="Colorful List Accent 4" w:uiPriority="72"/>
-    <w:lsdException w:name="Colorful Grid Accent 4" w:uiPriority="73"/>
-    <w:lsdException w:name="Light Shading Accent 5" w:uiPriority="60"/>
-    <w:lsdException w:name="Light List Accent 5" w:uiPriority="61"/>
-    <w:lsdException w:name="Light Grid Accent 5" w:uiPriority="62"/>
-    <w:lsdException w:name="Medium Shading 1 Accent 5" w:uiPriority="63"/>
-    <w:lsdException w:name="Medium Shading 2 Accent 5" w:uiPriority="64"/>
-    <w:lsdException w:name="Medium List 1 Accent 5" w:uiPriority="65"/>
-    <w:lsdException w:name="Medium List 2 Accent 5" w:uiPriority="66"/>
-    <w:lsdException w:name="Medium Grid 1 Accent 5" w:uiPriority="67"/>
-    <w:lsdException w:name="Medium Grid 2 Accent 5" w:uiPriority="68"/>
-    <w:lsdException w:name="Medium Grid 3 Accent 5" w:uiPriority="69"/>
-    <w:lsdException w:name="Dark List Accent 5" w:uiPriority="70"/>
-    <w:lsdException w:name="Colorful Shading Accent 5" w:uiPriority="71"/>
-    <w:lsdException w:name="Colorful List Accent 5" w:uiPriority="72"/>
-    <w:lsdException w:name="Colorful Grid Accent 5" w:uiPriority="73"/>
-    <w:lsdException w:name="Light Shading Accent 6" w:uiPriority="60"/>
-    <w:lsdException w:name="Light List Accent 6" w:uiPriority="61"/>
-    <w:lsdException w:name="Light Grid Accent 6" w:uiPriority="62"/>
-    <w:lsdException w:name="Medium Shading 1 Accent 6" w:uiPriority="63"/>
-    <w:lsdException w:name="Medium Shading 2 Accent 6" w:uiPriority="64"/>
-    <w:lsdException w:name="Medium List 1 Accent 6" w:uiPriority="65"/>
-    <w:lsdException w:name="Medium List 2 Accent 6" w:uiPriority="66"/>
-    <w:lsdException w:name="Medium Grid 1 Accent 6" w:uiPriority="67"/>
-    <w:lsdException w:name="Medium Grid 2 Accent 6" w:uiPriority="68"/>
-    <w:lsdException w:name="Medium Grid 3 Accent 6" w:uiPriority="69"/>
-    <w:lsdException w:name="Dark List Accent 6" w:uiPriority="70"/>
-    <w:lsdException w:name="Colorful Shading Accent 6" w:uiPriority="71"/>
-    <w:lsdException w:name="Colorful List Accent 6" w:uiPriority="72"/>
-    <w:lsdException w:name="Colorful Grid Accent 6" w:uiPriority="73"/>
-    <w:lsdException w:name="Subtle Emphasis" w:uiPriority="19" w:qFormat="1"/>
-    <w:lsdException w:name="Intense Emphasis" w:uiPriority="21" w:qFormat="1"/>
-    <w:lsdException w:name="Subtle Reference" w:uiPriority="31" w:qFormat="1"/>
-    <w:lsdException w:name="Intense Reference" w:uiPriority="32" w:qFormat="1"/>
-    <w:lsdException w:name="Book Title" w:uiPriority="33" w:qFormat="1"/>
-    <w:lsdException w:name="Bibliography" w:semiHidden="1" w:uiPriority="37" w:unhideWhenUsed="1"/>
-    <w:lsdException w:name="TOC Heading" w:semiHidden="1" w:uiPriority="39" w:unhideWhenUsed="1" w:qFormat="1"/>
-    <w:lsdException w:name="Plain Table 1" w:uiPriority="41"/>
-    <w:lsdException w:name="Plain Table 2" w:uiPriority="42"/>
-    <w:lsdException w:name="Plain Table 3" w:uiPriority="43"/>
-    <w:lsdException w:name="Plain Table 4" w:uiPriority="44"/>
-    <w:lsdException w:name="Plain Table 5" w:uiPriority="45"/>
-    <w:lsdException w:name="Grid Table Light" w:uiPriority="40"/>
-    <w:lsdException w:name="Grid Table 1 Light" w:uiPriority="46"/>
-    <w:lsdException w:name="Grid Table 2" w:uiPriority="47"/>
-    <w:lsdException w:name="Grid Table 3" w:uiPriority="48"/>
-    <w:lsdException w:name="Grid Table 4" w:uiPriority="49"/>
-    <w:lsdException w:name="Grid Table 5 Dark" w:uiPriority="50"/>
-    <w:lsdException w:name="Grid Table 6 Colorful" w:uiPriority="51"/>
-    <w:lsdException w:name="Grid Table 7 Colorful" w:uiPriority="52"/>
-    <w:lsdException w:name="Grid Table 1 Light Accent 1" w:uiPriority="46"/>
-    <w:lsdException w:name="Grid Table 2 Accent 1" w:uiPriority="47"/>
-    <w:lsdException w:name="Grid Table 3 Accent 1" w:uiPriority="48"/>
-    <w:lsdException w:name="Grid Table 4 Accent 1" w:uiPriority="49"/>
-    <w:lsdException w:name="Grid Table 5 Dark Accent 1" w:uiPriority="50"/>
-    <w:lsdException w:name="Grid Table 6 Colorful Accent 1" w:uiPriority="51"/>
-    <w:lsdException w:name="Grid Table 7 Colorful Accent 1" w:uiPriority="52"/>
-    <w:lsdException w:name="Grid Table 1 Light Accent 2" w:uiPriority="46"/>
-    <w:lsdException w:name="Grid Table 2 Accent 2" w:uiPriority="47"/>
-    <w:lsdException w:name="Grid Table 3 Accent 2" w:uiPriority="48"/>
-    <w:lsdException w:name="Grid Table 4 Accent 2" w:uiPriority="49"/>
-    <w:lsdException w:name="Grid Table 5 Dark Accent 2" w:uiPriority="50"/>
-    <w:lsdException w:name="Grid Table 6 Colorful Accent 2" w:uiPriority="51"/>
-    <w:lsdException w:name="Grid Table 7 Colorful Accent 2" w:uiPriority="52"/>
-    <w:lsdException w:name="Grid Table 1 Light Accent 3" w:uiPriority="46"/>
-    <w:lsdException w:name="Grid Table 2 Accent 3" w:uiPriority="47"/>
-    <w:lsdException w:name="Grid Table 3 Accent 3" w:uiPriority="48"/>
-    <w:lsdException w:name="Grid Table 4 Accent 3" w:uiPriority="49"/>
-    <w:lsdException w:name="Grid Table 5 Dark Accent 3" w:uiPriority="50"/>
-    <w:lsdException w:name="Grid Table 6 Colorful Accent 3" w:uiPriority="51"/>
-    <w:lsdException w:name="Grid Table 7 Colorful Accent 3" w:uiPriority="52"/>
-    <w:lsdException w:name="Grid Table 1 Light Accent 4" w:uiPriority="46"/>
-    <w:lsdException w:name="Grid Table 2 Accent 4" w:uiPriority="47"/>
-    <w:lsdException w:name="Grid Table 3 Accent 4" w:uiPriority="48"/>
-    <w:lsdException w:name="Grid Table 4 Accent 4" w:uiPriority="49"/>
-    <w:lsdException w:name="Grid Table 5 Dark Accent 4" w:uiPriority="50"/>
-    <w:lsdException w:name="Grid Table 6 Colorful Accent 4" w:uiPriority="51"/>
-    <w:lsdException w:name="Grid Table 7 Colorful Accent 4" w:uiPriority="52"/>
-    <w:lsdException w:name="Grid Table 1 Light Accent 5" w:uiPriority="46"/>
-    <w:lsdException w:name="Grid Table 2 Accent 5" w:uiPriority="47"/>
-    <w:lsdException w:name="Grid Table 3 Accent 5" w:uiPriority="48"/>
-    <w:lsdException w:name="Grid Table 4 Accent 5" w:uiPriority="49"/>
-    <w:lsdException w:name="Grid Table 5 Dark Accent 5" w:uiPriority="50"/>
-    <w:lsdException w:name="Grid Table 6 Colorful Accent 5" w:uiPriority="51"/>
-    <w:lsdException w:name="Grid Table 7 Colorful Accent 5" w:uiPriority="52"/>
-    <w:lsdException w:name="Grid Table 1 Light Accent 6" w:uiPriority="46"/>
-    <w:lsdException w:name="Grid Table 2 Accent 6" w:uiPriority="47"/>
-    <w:lsdException w:name="Grid Table 3 Accent 6" w:uiPriority="48"/>
-    <w:lsdException w:name="Grid Table 4 Accent 6" w:uiPriority="49"/>
-    <w:lsdException w:name="Grid Table 5 Dark Accent 6" w:uiPriority="50"/>
-    <w:lsdException w:name="Grid Table 6 Colorful Accent 6" w:uiPriority="51"/>
-    <w:lsdException w:name="Grid Table 7 Colorful Accent 6" w:uiPriority="52"/>
-    <w:lsdException w:name="List Table 1 Light" w:uiPriority="46"/>
-    <w:lsdException w:name="List Table 2" w:uiPriority="47"/>
-    <w:lsdException w:name="List Table 3" w:uiPriority="48"/>
-    <w:lsdException w:name="List Table 4" w:uiPriority="49"/>
-    <w:lsdException w:name="List Table 5 Dark" w:uiPriority="50"/>
-    <w:lsdException w:name="List Table 6 Colorful" w:uiPriority="51"/>
-    <w:lsdException w:name="List Table 7 Colorful" w:uiPriority="52"/>
-    <w:lsdException w:name="List Table 1 Light Accent 1" w:uiPriority="46"/>
-    <w:lsdException w:name="List Table 2 Accent 1" w:uiPriority="47"/>
-    <w:lsdException w:name="List Table 3 Accent 1" w:uiPriority="48"/>
-    <w:lsdException w:name="List Table 4 Accent 1" w:uiPriority="49"/>
-    <w:lsdException w:name="List Table 5 Dark Accent 1" w:uiPriority="50"/>
-    <w:lsdException w:name="List Table 6 Colorful Accent 1" w:uiPriority="51"/>
-    <w:lsdException w:name="List Table 7 Colorful Accent 1" w:uiPriority="52"/>
-    <w:lsdException w:name="List Table 1 Light Accent 2" w:uiPriority="46"/>
-    <w:lsdException w:name="List Table 2 Accent 2" w:uiPriority="47"/>
-    <w:lsdException w:name="List Table 3 Accent 2" w:uiPriority="48"/>
-    <w:lsdException w:name="List Table 4 Accent 2" w:uiPriority="49"/>
-    <w:lsdException w:name="List Table 5 Dark Accent 2" w:uiPriority="50"/>
-    <w:lsdException w:name="List Table 6 Colorful Accent 2" w:uiPriority="51"/>
-    <w:lsdException w:name="List Table 7 Colorful Accent 2" w:uiPriority="52"/>
-    <w:lsdException w:name="List Table 1 Light Accent 3" w:uiPriority="46"/>
-    <w:lsdException w:name="List Table 2 Accent 3" w:uiPriority="47"/>
-    <w:lsdException w:name="List Table 3 Accent 3" w:uiPriority="48"/>
-    <w:lsdException w:name="List Table 4 Accent 3" w:uiPriority="49"/>
-    <w:lsdException w:name="List Table 5 Dark Accent 3" w:uiPriority="50"/>
-    <w:lsdException w:name="List Table 6 Colorful Accent 3" w:uiPriority="51"/>
-    <w:lsdException w:name="List Table 7 Colorful Accent 3" w:uiPriority="52"/>
-    <w:lsdException w:name="List Table 1 Light Accent 4" w:uiPriority="46"/>
-    <w:lsdException w:name="List Table 2 Accent 4" w:uiPriority="47"/>
-    <w:lsdException w:name="List Table 3 Accent 4" w:uiPriority="48"/>
-    <w:lsdException w:name="List Table 4 Accent 4" w:uiPriority="49"/>
-    <w:lsdException w:name="List Table 5 Dark Accent 4" w:uiPriority="50"/>
-    <w:lsdException w:name="List Table 6 Colorful Accent 4" w:uiPriority="51"/>
-    <w:lsdException w:name="List Table 7 Colorful Accent 4" w:uiPriority="52"/>
-    <w:lsdException w:name="List Table 1 Light Accent 5" w:uiPriority="46"/>
-    <w:lsdException w:name="List Table 2 Accent 5" w:uiPriority="47"/>
-    <w:lsdException w:name="List Table 3 Accent 5" w:uiPriority="48"/>
-    <w:lsdException w:name="List Table 4 Accent 5" w:uiPriority="49"/>
-    <w:lsdException w:name="List Table 5 Dark Accent 5" w:uiPriority="50"/>
-    <w:lsdException w:name="List Table 6 Colorful Accent 5" w:uiPriority="51"/>
-    <w:lsdException w:name="List Table 7 Colorful Accent 5" w:uiPriority="52"/>
-    <w:lsdException w:name="List Table 1 Light Accent 6" w:uiPriority="46"/>
-    <w:lsdException w:name="List Table 2 Accent 6" w:uiPriority="47"/>
-    <w:lsdException w:name="List Table 3 Accent 6" w:uiPriority="48"/>
-    <w:lsdException w:name="List Table 4 Accent 6" w:uiPriority="49"/>
-    <w:lsdException w:name="List Table 5 Dark Accent 6" w:uiPriority="50"/>
-    <w:lsdException w:name="List Table 6 Colorful Accent 6" w:uiPriority="51"/>
-    <w:lsdException w:name="List Table 7 Colorful Accent 6" w:uiPriority="52"/>
-    <w:lsdException w:name="Mention" w:semiHidden="1" w:unhideWhenUsed="1"/>
-    <w:lsdException w:name="Smart Hyperlink" w:semiHidden="1" w:unhideWhenUsed="1"/>
-    <w:lsdException w:name="Hashtag" w:semiHidden="1" w:unhideWhenUsed="1"/>
-    <w:lsdException w:name="Unresolved Mention" w:semiHidden="1" w:unhideWhenUsed="1"/>
-    <w:lsdException w:name="Smart Link" w:semiHidden="1" w:unhideWhenUsed="1"/>
-  </w:latentStyles>
-  <w:style w:type="paragraph" w:default="1" w:styleId="Normal">
+  <w:style w:type="paragraph" w:styleId="Normal" w:default="1">
     <w:name w:val="Normal"/>
     <w:qFormat/>
   </w:style>
-  <w:style w:type="paragraph" w:styleId="Titre1">
-    <w:name w:val="heading 1"/>
+  <w:style w:type="table" w:styleId="TableNormal" w:default="true">
+    <w:name w:val="Normal Table"/>
+    <w:uiPriority w:val="99"/>
+    <w:semiHidden/>
+    <w:unhideWhenUsed/>
+    <w:tblPr>
+      <w:tblInd w:type="dxa" w:w="0"/>
+      <w:tblCellMar>
+        <w:top w:type="dxa" w:w="0"/>
+        <w:left w:type="dxa" w:w="108"/>
+        <w:bottom w:type="dxa" w:w="0"/>
+        <w:right w:type="dxa" w:w="108"/>
+      </w:tblCellMar>
+    </w:tblPr>
+  </w:style>
+  <w:style w:type="paragraph" w:styleId="Title">
+    <w:name w:val="Title"/>
     <w:basedOn w:val="Normal"/>
     <w:next w:val="Normal"/>
-    <w:uiPriority w:val="9"/>
     <w:qFormat/>
-    <w:pPr>
-      <w:spacing w:before="360" w:after="60"/>
-      <w:outlineLvl w:val="0"/>
-    </w:pPr>
     <w:rPr>
-      <w:rFonts w:ascii="Cambria" w:eastAsia="Cambria" w:hAnsi="Cambria" w:cs="Cambria"/>
-      <w:b/>
-      <w:bCs/>
-      <w:color w:val="1C2433"/>
-      <w:sz w:val="30"/>
-      <w:szCs w:val="30"/>
+      <w:sz w:val="56"/>
+      <w:szCs w:val="56"/>
     </w:rPr>
   </w:style>
-  <w:style w:type="paragraph" w:styleId="Titre2">
-    <w:name w:val="heading 2"/>
+  <w:style w:type="paragraph" w:styleId="Heading3">
+    <w:name w:val="Heading 3"/>
     <w:basedOn w:val="Normal"/>
     <w:next w:val="Normal"/>
-    <w:uiPriority w:val="9"/>
-    <w:unhideWhenUsed/>
     <w:qFormat/>
-    <w:pPr>
-      <w:spacing w:before="200" w:after="80"/>
-      <w:outlineLvl w:val="1"/>
-    </w:pPr>
-    <w:rPr>
-      <w:rFonts w:ascii="Cambria" w:eastAsia="Cambria" w:hAnsi="Cambria" w:cs="Cambria"/>
-      <w:b/>
-      <w:bCs/>
-      <w:color w:val="1C2433"/>
-      <w:sz w:val="24"/>
-      <w:szCs w:val="24"/>
-    </w:rPr>
-  </w:style>
-  <w:style w:type="paragraph" w:styleId="Titre3">
-    <w:name w:val="heading 3"/>
-    <w:basedOn w:val="Normal"/>
-    <w:next w:val="Normal"/>
-    <w:uiPriority w:val="9"/>
-    <w:semiHidden/>
-    <w:unhideWhenUsed/>
-    <w:qFormat/>
-    <w:pPr>
-      <w:outlineLvl w:val="2"/>
-    </w:pPr>
     <w:rPr>
       <w:color w:val="1F4D78"/>
       <w:sz w:val="24"/>
       <w:szCs w:val="24"/>
     </w:rPr>
   </w:style>
-  <w:style w:type="paragraph" w:styleId="Titre4">
-    <w:name w:val="heading 4"/>
+  <w:style w:type="paragraph" w:styleId="Heading4">
+    <w:name w:val="Heading 4"/>
     <w:basedOn w:val="Normal"/>
     <w:next w:val="Normal"/>
-    <w:uiPriority w:val="9"/>
-    <w:semiHidden/>
-    <w:unhideWhenUsed/>
     <w:qFormat/>
-    <w:pPr>
-      <w:outlineLvl w:val="3"/>
-    </w:pPr>
     <w:rPr>
       <w:i/>
       <w:iCs/>
       <w:color w:val="2E74B5"/>
     </w:rPr>
   </w:style>
-  <w:style w:type="paragraph" w:styleId="Titre5">
-    <w:name w:val="heading 5"/>
+  <w:style w:type="paragraph" w:styleId="Heading5">
+    <w:name w:val="Heading 5"/>
     <w:basedOn w:val="Normal"/>
     <w:next w:val="Normal"/>
-    <w:uiPriority w:val="9"/>
-    <w:semiHidden/>
-    <w:unhideWhenUsed/>
     <w:qFormat/>
-    <w:pPr>
-      <w:outlineLvl w:val="4"/>
-    </w:pPr>
     <w:rPr>
       <w:color w:val="2E74B5"/>
     </w:rPr>
   </w:style>
-  <w:style w:type="paragraph" w:styleId="Titre6">
-    <w:name w:val="heading 6"/>
+  <w:style w:type="paragraph" w:styleId="Heading6">
+    <w:name w:val="Heading 6"/>
     <w:basedOn w:val="Normal"/>
     <w:next w:val="Normal"/>
-    <w:uiPriority w:val="9"/>
-    <w:semiHidden/>
-    <w:unhideWhenUsed/>
     <w:qFormat/>
-    <w:pPr>
-      <w:outlineLvl w:val="5"/>
-    </w:pPr>
     <w:rPr>
       <w:color w:val="1F4D78"/>
     </w:rPr>
   </w:style>
-  <w:style w:type="character" w:default="1" w:styleId="Policepardfaut">
-    <w:name w:val="Default Paragraph Font"/>
-    <w:uiPriority w:val="1"/>
-    <w:semiHidden/>
-    <w:unhideWhenUsed/>
-  </w:style>
-  <w:style w:type="table" w:default="1" w:styleId="TableauNormal">
-    <w:name w:val="Normal Table"/>
-    <w:uiPriority w:val="99"/>
-    <w:semiHidden/>
-    <w:unhideWhenUsed/>
-    <w:tblPr>
-      <w:tblInd w:w="0" w:type="dxa"/>
-      <w:tblCellMar>
-        <w:top w:w="0" w:type="dxa"/>
-        <w:left w:w="108" w:type="dxa"/>
-        <w:bottom w:w="0" w:type="dxa"/>
-        <w:right w:w="108" w:type="dxa"/>
-      </w:tblCellMar>
-    </w:tblPr>
-  </w:style>
-  <w:style w:type="numbering" w:default="1" w:styleId="Aucuneliste">
-    <w:name w:val="No List"/>
-    <w:uiPriority w:val="99"/>
-    <w:semiHidden/>
-    <w:unhideWhenUsed/>
-  </w:style>
-  <w:style w:type="paragraph" w:styleId="Titre">
-    <w:name w:val="Title"/>
-    <w:basedOn w:val="Normal"/>
-    <w:next w:val="Normal"/>
-    <w:uiPriority w:val="10"/>
-    <w:qFormat/>
-    <w:rPr>
-      <w:sz w:val="56"/>
-      <w:szCs w:val="56"/>
-    </w:rPr>
-  </w:style>
-  <w:style w:type="paragraph" w:customStyle="1" w:styleId="lev1">
-    <w:name w:val="Élevé1"/>
+  <w:style w:type="paragraph" w:styleId="Strong">
+    <w:name w:val="Strong"/>
     <w:basedOn w:val="Normal"/>
     <w:next w:val="Normal"/>
     <w:qFormat/>
@@ -2686,13 +2250,14 @@
       <w:bCs/>
     </w:rPr>
   </w:style>
-  <w:style w:type="paragraph" w:styleId="Paragraphedeliste">
+  <w:style w:type="paragraph" w:styleId="ListParagraph">
     <w:name w:val="List Paragraph"/>
     <w:basedOn w:val="Normal"/>
     <w:qFormat/>
   </w:style>
-  <w:style w:type="character" w:styleId="Lienhypertexte">
+  <w:style w:type="character" w:styleId="Hyperlink">
     <w:name w:val="Hyperlink"/>
+    <w:basedOn w:val="DefaultParagraphFont"/>
     <w:uiPriority w:val="99"/>
     <w:unhideWhenUsed/>
     <w:rPr>
@@ -2700,8 +2265,9 @@
       <w:u w:val="single"/>
     </w:rPr>
   </w:style>
-  <w:style w:type="character" w:styleId="Appelnotedebasdep">
+  <w:style w:type="character" w:styleId="FootnoteReference">
     <w:name w:val="footnote reference"/>
+    <w:basedOn w:val="DefaultParagraphFont"/>
     <w:uiPriority w:val="99"/>
     <w:semiHidden/>
     <w:unhideWhenUsed/>
@@ -2709,10 +2275,25 @@
       <w:vertAlign w:val="superscript"/>
     </w:rPr>
   </w:style>
-  <w:style w:type="paragraph" w:styleId="Notedebasdepage">
+  <w:style w:type="paragraph" w:styleId="FootnoteText">
     <w:name w:val="footnote text"/>
     <w:basedOn w:val="Normal"/>
-    <w:link w:val="NotedebasdepageCar"/>
+    <w:link w:val="FootnoteTextChar"/>
+    <w:uiPriority w:val="99"/>
+    <w:semiHidden/>
+    <w:unhideWhenUsed/>
+    <w:pPr>
+      <w:spacing w:after="0" w:line="240" w:lineRule="auto"/>
+    </w:pPr>
+    <w:rPr>
+      <w:sz w:val="20"/>
+      <w:szCs w:val="20"/>
+    </w:rPr>
+  </w:style>
+  <w:style w:type="character" w:styleId="FootnoteTextChar">
+    <w:name w:val="Footnote Text Char"/>
+    <w:basedOn w:val="DefaultParagraphFont"/>
+    <w:link w:val="FootnoteText"/>
     <w:uiPriority w:val="99"/>
     <w:semiHidden/>
     <w:unhideWhenUsed/>
@@ -2721,9 +2302,35 @@
       <w:szCs w:val="20"/>
     </w:rPr>
   </w:style>
-  <w:style w:type="character" w:customStyle="1" w:styleId="NotedebasdepageCar">
-    <w:name w:val="Note de bas de page Car"/>
-    <w:link w:val="Notedebasdepage"/>
+  <w:style w:type="character" w:styleId="EndnoteReference">
+    <w:name w:val="endnote reference"/>
+    <w:basedOn w:val="DefaultParagraphFont"/>
+    <w:uiPriority w:val="99"/>
+    <w:semiHidden/>
+    <w:unhideWhenUsed/>
+    <w:rPr>
+      <w:vertAlign w:val="superscript"/>
+    </w:rPr>
+  </w:style>
+  <w:style w:type="paragraph" w:styleId="EndnoteText">
+    <w:name w:val="endnote text"/>
+    <w:basedOn w:val="Normal"/>
+    <w:link w:val="EndnoteTextChar"/>
+    <w:uiPriority w:val="99"/>
+    <w:semiHidden/>
+    <w:unhideWhenUsed/>
+    <w:pPr>
+      <w:spacing w:after="0" w:line="240" w:lineRule="auto"/>
+    </w:pPr>
+    <w:rPr>
+      <w:sz w:val="20"/>
+      <w:szCs w:val="20"/>
+    </w:rPr>
+  </w:style>
+  <w:style w:type="character" w:styleId="EndnoteTextChar">
+    <w:name w:val="Endnote Text Char"/>
+    <w:basedOn w:val="DefaultParagraphFont"/>
+    <w:link w:val="EndnoteText"/>
     <w:uiPriority w:val="99"/>
     <w:semiHidden/>
     <w:unhideWhenUsed/>
@@ -2732,36 +2339,40 @@
       <w:szCs w:val="20"/>
     </w:rPr>
   </w:style>
-  <w:style w:type="character" w:styleId="Appeldenotedefin">
-    <w:name w:val="endnote reference"/>
-    <w:uiPriority w:val="99"/>
-    <w:semiHidden/>
-    <w:unhideWhenUsed/>
+  <w:style w:type="paragraph" w:styleId="Heading1">
+    <w:name w:val="Heading 1"/>
+    <w:basedOn w:val="Normal"/>
+    <w:next w:val="Normal"/>
+    <w:qFormat/>
+    <w:pPr>
+      <w:spacing w:after="60" w:before="360"/>
+      <w:outlineLvl w:val="0"/>
+    </w:pPr>
     <w:rPr>
-      <w:vertAlign w:val="superscript"/>
+      <w:rFonts w:ascii="Cambria" w:cs="Cambria" w:eastAsia="Cambria" w:hAnsi="Cambria"/>
+      <w:b/>
+      <w:bCs/>
+      <w:color w:val="1C2433"/>
+      <w:sz w:val="30"/>
+      <w:szCs w:val="30"/>
     </w:rPr>
   </w:style>
-  <w:style w:type="paragraph" w:styleId="Notedefin">
-    <w:name w:val="endnote text"/>
+  <w:style w:type="paragraph" w:styleId="Heading2">
+    <w:name w:val="Heading 2"/>
     <w:basedOn w:val="Normal"/>
-    <w:link w:val="NotedefinCar"/>
-    <w:uiPriority w:val="99"/>
-    <w:semiHidden/>
-    <w:unhideWhenUsed/>
+    <w:next w:val="Normal"/>
+    <w:qFormat/>
+    <w:pPr>
+      <w:spacing w:after="80" w:before="200"/>
+      <w:outlineLvl w:val="1"/>
+    </w:pPr>
     <w:rPr>
-      <w:sz w:val="20"/>
-      <w:szCs w:val="20"/>
-    </w:rPr>
-  </w:style>
-  <w:style w:type="character" w:customStyle="1" w:styleId="NotedefinCar">
-    <w:name w:val="Note de fin Car"/>
-    <w:link w:val="Notedefin"/>
-    <w:uiPriority w:val="99"/>
-    <w:semiHidden/>
-    <w:unhideWhenUsed/>
-    <w:rPr>
-      <w:sz w:val="20"/>
-      <w:szCs w:val="20"/>
+      <w:rFonts w:ascii="Cambria" w:cs="Cambria" w:eastAsia="Cambria" w:hAnsi="Cambria"/>
+      <w:b/>
+      <w:bCs/>
+      <w:color w:val="1C2433"/>
+      <w:sz w:val="24"/>
+      <w:szCs w:val="24"/>
     </w:rPr>
   </w:style>
 </w:styles>
@@ -2919,7 +2530,7 @@
         <a:solidFill>
           <a:schemeClr val="phClr"/>
         </a:solidFill>
-        <a:gradFill rotWithShape="1">
+        <a:gradFill rotWithShape="true">
           <a:gsLst>
             <a:gs pos="0">
               <a:schemeClr val="phClr">
@@ -2943,9 +2554,9 @@
               </a:schemeClr>
             </a:gs>
           </a:gsLst>
-          <a:lin ang="5400000" scaled="0"/>
+          <a:lin ang="5400000" scaled="false"/>
         </a:gradFill>
-        <a:gradFill rotWithShape="1">
+        <a:gradFill rotWithShape="true">
           <a:gsLst>
             <a:gs pos="0">
               <a:schemeClr val="phClr">
@@ -2969,7 +2580,7 @@
               </a:schemeClr>
             </a:gs>
           </a:gsLst>
-          <a:lin ang="5400000" scaled="0"/>
+          <a:lin ang="5400000" scaled="false"/>
         </a:gradFill>
       </a:fillStyleLst>
       <a:lnStyleLst>
@@ -3004,7 +2615,7 @@
         </a:effectStyle>
         <a:effectStyle>
           <a:effectLst>
-            <a:outerShdw blurRad="57150" dist="19050" dir="5400000" algn="ctr" rotWithShape="0">
+            <a:outerShdw blurRad="57150" dist="19050" dir="5400000" algn="ctr" rotWithShape="false">
               <a:srgbClr val="000000">
                 <a:alpha val="63000"/>
               </a:srgbClr>
@@ -3022,7 +2633,7 @@
             <a:satMod val="170000"/>
           </a:schemeClr>
         </a:solidFill>
-        <a:gradFill rotWithShape="1">
+        <a:gradFill rotWithShape="true">
           <a:gsLst>
             <a:gs pos="0">
               <a:schemeClr val="phClr">
@@ -3047,7 +2658,7 @@
               </a:schemeClr>
             </a:gs>
           </a:gsLst>
-          <a:lin ang="5400000" scaled="0"/>
+          <a:lin ang="5400000" scaled="false"/>
         </a:gradFill>
       </a:bgFillStyleLst>
     </a:fmtScheme>

</xml_diff>

<commit_message>
Say that ResNet18 is frozen first and fine-tuned later on slide 6
</commit_message>
<xml_diff>
--- a/presentation/oral_script.docx
+++ b/presentation/oral_script.docx
@@ -42,7 +42,7 @@
         <w:pStyle w:val="Paragraphedeliste"/>
         <w:numPr>
           <w:ilvl w:val="0"/>
-          <w:numId w:val="1"/>
+          <w:numId w:val="2"/>
         </w:numPr>
         <w:spacing w:after="80"/>
       </w:pPr>
@@ -51,7 +51,7 @@
           <w:sz w:val="21"/>
           <w:szCs w:val="21"/>
         </w:rPr>
-        <w:t>About 1251 words: at a calm pace (about 130 words per minute), this is about 10 minutes. Without the 47 optional words, about 9 minutes. The rest of the 10 minutes is a safety margin for pauses, clicks and nerves.</w:t>
+        <w:t>About 1256 words: at a calm pace (about 130 words per minute), this is about 10 minutes. Without the 47 optional words, about 9 minutes. The rest of the 10 minutes is a safety margin for pauses, clicks and nerves.</w:t>
       </w:r>
     </w:p>
     <w:p>
@@ -59,7 +59,7 @@
         <w:pStyle w:val="Paragraphedeliste"/>
         <w:numPr>
           <w:ilvl w:val="0"/>
-          <w:numId w:val="1"/>
+          <w:numId w:val="2"/>
         </w:numPr>
         <w:spacing w:after="80"/>
       </w:pPr>
@@ -76,7 +76,7 @@
         <w:pStyle w:val="Paragraphedeliste"/>
         <w:numPr>
           <w:ilvl w:val="0"/>
-          <w:numId w:val="1"/>
+          <w:numId w:val="2"/>
         </w:numPr>
         <w:spacing w:after="80"/>
       </w:pPr>
@@ -93,7 +93,7 @@
         <w:pStyle w:val="Paragraphedeliste"/>
         <w:numPr>
           <w:ilvl w:val="0"/>
-          <w:numId w:val="1"/>
+          <w:numId w:val="2"/>
         </w:numPr>
         <w:spacing w:after="80"/>
       </w:pPr>
@@ -110,7 +110,7 @@
         <w:pStyle w:val="Paragraphedeliste"/>
         <w:numPr>
           <w:ilvl w:val="0"/>
-          <w:numId w:val="1"/>
+          <w:numId w:val="2"/>
         </w:numPr>
         <w:spacing w:after="80"/>
       </w:pPr>
@@ -1044,7 +1044,7 @@
           <w:sz w:val="19"/>
           <w:szCs w:val="19"/>
         </w:rPr>
-        <w:t>3:45 to 4:45 · 60 s · 129 words</w:t>
+        <w:t>3:45 to 4:45 · 60 s · 134 words</w:t>
       </w:r>
     </w:p>
     <w:p>
@@ -1100,7 +1100,23 @@
           <w:sz w:val="25"/>
           <w:szCs w:val="25"/>
         </w:rPr>
-        <w:t xml:space="preserve">ResNet18 already learned this on 1.2 million ImageNet photos, so we keep it frozen. </w:t>
+        <w:t xml:space="preserve">ResNet18 already learned this on 1.2 million ImageNet photos, so </w:t>
+      </w:r>
+      <w:r>
+        <w:rPr>
+          <w:b/>
+          <w:bCs/>
+          <w:sz w:val="25"/>
+          <w:szCs w:val="25"/>
+        </w:rPr>
+        <w:t>first, we keep it frozen.</w:t>
+      </w:r>
+      <w:r>
+        <w:rPr>
+          <w:sz w:val="25"/>
+          <w:szCs w:val="25"/>
+        </w:rPr>
+        <w:t xml:space="preserve"> </w:t>
       </w:r>
       <w:r>
         <w:rPr>
@@ -1134,7 +1150,7 @@
           <w:sz w:val="25"/>
           <w:szCs w:val="25"/>
         </w:rPr>
-        <w:t xml:space="preserve"> We replace its last layer, made for ImageNet, by our own: from these 512 numbers to our 5 styles, 2 565 weights, the only ones we train. </w:t>
+        <w:t xml:space="preserve"> We replace its last layer, made for ImageNet, by our own: from these 512 numbers to our 5 styles, 2 565 weights, the only ones we train in this first version. </w:t>
       </w:r>
       <w:r>
         <w:rPr>
@@ -2166,15 +2182,6 @@
     </w:r>
     <w:r>
       <w:rPr>
-        <w:noProof/>
-        <w:color w:val="5F6473"/>
-        <w:sz w:val="16"/>
-        <w:szCs w:val="16"/>
-      </w:rPr>
-      <w:t>1</w:t>
-    </w:r>
-    <w:r>
-      <w:rPr>
         <w:color w:val="5F6473"/>
         <w:sz w:val="16"/>
         <w:szCs w:val="16"/>
@@ -2207,10 +2214,10 @@
 <file path=word/numbering.xml><?xml version="1.0" encoding="utf-8"?>
 <w:numbering xmlns:wpc="http://schemas.microsoft.com/office/word/2010/wordprocessingCanvas" xmlns:cx="http://schemas.microsoft.com/office/drawing/2014/chartex" xmlns:cx1="http://schemas.microsoft.com/office/drawing/2015/9/8/chartex" xmlns:cx2="http://schemas.microsoft.com/office/drawing/2015/10/21/chartex" xmlns:cx3="http://schemas.microsoft.com/office/drawing/2016/5/9/chartex" xmlns:cx4="http://schemas.microsoft.com/office/drawing/2016/5/10/chartex" xmlns:cx5="http://schemas.microsoft.com/office/drawing/2016/5/11/chartex" xmlns:cx6="http://schemas.microsoft.com/office/drawing/2016/5/12/chartex" xmlns:cx7="http://schemas.microsoft.com/office/drawing/2016/5/13/chartex" xmlns:cx8="http://schemas.microsoft.com/office/drawing/2016/5/14/chartex" xmlns:mc="http://schemas.openxmlformats.org/markup-compatibility/2006" xmlns:aink="http://schemas.microsoft.com/office/drawing/2016/ink" xmlns:am3d="http://schemas.microsoft.com/office/drawing/2017/model3d" xmlns:o="urn:schemas-microsoft-com:office:office" xmlns:oel="http://schemas.microsoft.com/office/2019/extlst" xmlns:r="http://schemas.openxmlformats.org/officeDocument/2006/relationships" xmlns:m="http://schemas.openxmlformats.org/officeDocument/2006/math" xmlns:v="urn:schemas-microsoft-com:vml" xmlns:wp14="http://schemas.microsoft.com/office/word/2010/wordprocessingDrawing" xmlns:wp="http://schemas.openxmlformats.org/drawingml/2006/wordprocessingDrawing" xmlns:w10="urn:schemas-microsoft-com:office:word" xmlns:w="http://schemas.openxmlformats.org/wordprocessingml/2006/main" xmlns:w14="http://schemas.microsoft.com/office/word/2010/wordml" xmlns:w15="http://schemas.microsoft.com/office/word/2012/wordml" xmlns:w16cex="http://schemas.microsoft.com/office/word/2018/wordml/cex" xmlns:w16cid="http://schemas.microsoft.com/office/word/2016/wordml/cid" xmlns:w16="http://schemas.microsoft.com/office/word/2018/wordml" xmlns:w16du="http://schemas.microsoft.com/office/word/2023/wordml/word16du" xmlns:w16sdtdh="http://schemas.microsoft.com/office/word/2020/wordml/sdtdatahash" xmlns:w16sdtfl="http://schemas.microsoft.com/office/word/2024/wordml/sdtformatlock" xmlns:w16se="http://schemas.microsoft.com/office/word/2015/wordml/symex" xmlns:wpg="http://schemas.microsoft.com/office/word/2010/wordprocessingGroup" xmlns:wpi="http://schemas.microsoft.com/office/word/2010/wordprocessingInk" xmlns:wne="http://schemas.microsoft.com/office/word/2006/wordml" xmlns:wps="http://schemas.microsoft.com/office/word/2010/wordprocessingShape" mc:Ignorable="w14 w15 w16se w16cid w16 w16cex w16sdtdh w16sdtfl w16du wp14">
   <w:abstractNum w:abstractNumId="0" w15:restartNumberingAfterBreak="0">
-    <w:nsid w:val="46520B83"/>
+    <w:nsid w:val="21D6391C"/>
     <w:multiLevelType w:val="hybridMultilevel"/>
-    <w:tmpl w:val="09CADAE8"/>
-    <w:lvl w:ilvl="0" w:tplc="743EFF28">
+    <w:tmpl w:val="1D941838"/>
+    <w:lvl w:ilvl="0" w:tplc="68342EAA">
       <w:start w:val="1"/>
       <w:numFmt w:val="bullet"/>
       <w:lvlText w:val="●"/>
@@ -2219,7 +2226,7 @@
         <w:ind w:left="720" w:hanging="360"/>
       </w:pPr>
     </w:lvl>
-    <w:lvl w:ilvl="1" w:tplc="241CCD7C" w:tentative="1">
+    <w:lvl w:ilvl="1" w:tplc="A38264D4" w:tentative="1">
       <w:start w:val="1"/>
       <w:numFmt w:val="bullet"/>
       <w:lvlText w:val="○"/>
@@ -2228,7 +2235,7 @@
         <w:ind w:left="1440" w:hanging="360"/>
       </w:pPr>
     </w:lvl>
-    <w:lvl w:ilvl="2" w:tplc="C2363F10" w:tentative="1">
+    <w:lvl w:ilvl="2" w:tplc="A41EBB40" w:tentative="1">
       <w:start w:val="1"/>
       <w:numFmt w:val="bullet"/>
       <w:lvlText w:val="■"/>
@@ -2237,7 +2244,7 @@
         <w:ind w:left="2160" w:hanging="360"/>
       </w:pPr>
     </w:lvl>
-    <w:lvl w:ilvl="3" w:tplc="9D0A024C" w:tentative="1">
+    <w:lvl w:ilvl="3" w:tplc="0FDE297A" w:tentative="1">
       <w:start w:val="1"/>
       <w:numFmt w:val="bullet"/>
       <w:lvlText w:val="●"/>
@@ -2246,7 +2253,7 @@
         <w:ind w:left="2880" w:hanging="360"/>
       </w:pPr>
     </w:lvl>
-    <w:lvl w:ilvl="4" w:tplc="7C5EBB44" w:tentative="1">
+    <w:lvl w:ilvl="4" w:tplc="B0764008" w:tentative="1">
       <w:start w:val="1"/>
       <w:numFmt w:val="bullet"/>
       <w:lvlText w:val="○"/>
@@ -2255,7 +2262,7 @@
         <w:ind w:left="3600" w:hanging="360"/>
       </w:pPr>
     </w:lvl>
-    <w:lvl w:ilvl="5" w:tplc="9D347FE2" w:tentative="1">
+    <w:lvl w:ilvl="5" w:tplc="D26620C2" w:tentative="1">
       <w:start w:val="1"/>
       <w:numFmt w:val="bullet"/>
       <w:lvlText w:val="■"/>
@@ -2264,7 +2271,7 @@
         <w:ind w:left="4320" w:hanging="360"/>
       </w:pPr>
     </w:lvl>
-    <w:lvl w:ilvl="6" w:tplc="9DF8AEC0" w:tentative="1">
+    <w:lvl w:ilvl="6" w:tplc="0AA492E2" w:tentative="1">
       <w:start w:val="1"/>
       <w:numFmt w:val="bullet"/>
       <w:lvlText w:val="●"/>
@@ -2273,7 +2280,7 @@
         <w:ind w:left="5040" w:hanging="360"/>
       </w:pPr>
     </w:lvl>
-    <w:lvl w:ilvl="7" w:tplc="9604BCA8" w:tentative="1">
+    <w:lvl w:ilvl="7" w:tplc="7F58F32A" w:tentative="1">
       <w:start w:val="1"/>
       <w:numFmt w:val="bullet"/>
       <w:lvlText w:val="●"/>
@@ -2282,7 +2289,7 @@
         <w:ind w:left="5760" w:hanging="360"/>
       </w:pPr>
     </w:lvl>
-    <w:lvl w:ilvl="8" w:tplc="F274D62A" w:tentative="1">
+    <w:lvl w:ilvl="8" w:tplc="54641236" w:tentative="1">
       <w:start w:val="1"/>
       <w:numFmt w:val="bullet"/>
       <w:lvlText w:val="●"/>
@@ -2292,8 +2299,100 @@
       </w:pPr>
     </w:lvl>
   </w:abstractNum>
-  <w:num w:numId="1" w16cid:durableId="1395733531">
+  <w:abstractNum w:abstractNumId="1" w15:restartNumberingAfterBreak="0">
+    <w:nsid w:val="33243C70"/>
+    <w:multiLevelType w:val="hybridMultilevel"/>
+    <w:tmpl w:val="B0D8EDFE"/>
+    <w:lvl w:ilvl="0" w:tplc="EF36AA86" w:tentative="1">
+      <w:start w:val="1"/>
+      <w:numFmt w:val="bullet"/>
+      <w:lvlText w:val="●"/>
+      <w:lvlJc w:val="left"/>
+      <w:pPr>
+        <w:ind w:left="720" w:hanging="360"/>
+      </w:pPr>
+    </w:lvl>
+    <w:lvl w:ilvl="1" w:tplc="4D1EEE02" w:tentative="1">
+      <w:start w:val="1"/>
+      <w:numFmt w:val="bullet"/>
+      <w:lvlText w:val="○"/>
+      <w:lvlJc w:val="left"/>
+      <w:pPr>
+        <w:ind w:left="1440" w:hanging="360"/>
+      </w:pPr>
+    </w:lvl>
+    <w:lvl w:ilvl="2" w:tplc="73AE7B4C" w:tentative="1">
+      <w:start w:val="1"/>
+      <w:numFmt w:val="bullet"/>
+      <w:lvlText w:val="■"/>
+      <w:lvlJc w:val="left"/>
+      <w:pPr>
+        <w:ind w:left="2160" w:hanging="360"/>
+      </w:pPr>
+    </w:lvl>
+    <w:lvl w:ilvl="3" w:tplc="7CE265F6" w:tentative="1">
+      <w:start w:val="1"/>
+      <w:numFmt w:val="bullet"/>
+      <w:lvlText w:val="●"/>
+      <w:lvlJc w:val="left"/>
+      <w:pPr>
+        <w:ind w:left="2880" w:hanging="360"/>
+      </w:pPr>
+    </w:lvl>
+    <w:lvl w:ilvl="4" w:tplc="FBD60CD4" w:tentative="1">
+      <w:start w:val="1"/>
+      <w:numFmt w:val="bullet"/>
+      <w:lvlText w:val="○"/>
+      <w:lvlJc w:val="left"/>
+      <w:pPr>
+        <w:ind w:left="3600" w:hanging="360"/>
+      </w:pPr>
+    </w:lvl>
+    <w:lvl w:ilvl="5" w:tplc="8F80C5D0" w:tentative="1">
+      <w:start w:val="1"/>
+      <w:numFmt w:val="bullet"/>
+      <w:lvlText w:val="■"/>
+      <w:lvlJc w:val="left"/>
+      <w:pPr>
+        <w:ind w:left="4320" w:hanging="360"/>
+      </w:pPr>
+    </w:lvl>
+    <w:lvl w:ilvl="6" w:tplc="35D20B1A" w:tentative="1">
+      <w:start w:val="1"/>
+      <w:numFmt w:val="bullet"/>
+      <w:lvlText w:val="●"/>
+      <w:lvlJc w:val="left"/>
+      <w:pPr>
+        <w:ind w:left="5040" w:hanging="360"/>
+      </w:pPr>
+    </w:lvl>
+    <w:lvl w:ilvl="7" w:tplc="3426F698" w:tentative="1">
+      <w:start w:val="1"/>
+      <w:numFmt w:val="bullet"/>
+      <w:lvlText w:val="●"/>
+      <w:lvlJc w:val="left"/>
+      <w:pPr>
+        <w:ind w:left="5760" w:hanging="360"/>
+      </w:pPr>
+    </w:lvl>
+    <w:lvl w:ilvl="8" w:tplc="C0446A34" w:tentative="1">
+      <w:start w:val="1"/>
+      <w:numFmt w:val="bullet"/>
+      <w:lvlText w:val="●"/>
+      <w:lvlJc w:val="left"/>
+      <w:pPr>
+        <w:ind w:left="6480" w:hanging="360"/>
+      </w:pPr>
+    </w:lvl>
+  </w:abstractNum>
+  <w:num w:numId="1" w16cid:durableId="1650548327">
     <w:abstractNumId w:val="0"/>
+    <w:lvlOverride w:ilvl="0">
+      <w:startOverride w:val="1"/>
+    </w:lvlOverride>
+  </w:num>
+  <w:num w:numId="2" w16cid:durableId="819804977">
+    <w:abstractNumId w:val="1"/>
     <w:lvlOverride w:ilvl="0">
       <w:startOverride w:val="1"/>
     </w:lvlOverride>
@@ -2925,6 +3024,52 @@
       <w:szCs w:val="20"/>
     </w:rPr>
   </w:style>
+  <w:style w:type="paragraph" w:styleId="En-tte">
+    <w:name w:val="header"/>
+    <w:basedOn w:val="Normal"/>
+    <w:link w:val="En-tteCar"/>
+    <w:uiPriority w:val="99"/>
+    <w:semiHidden/>
+    <w:unhideWhenUsed/>
+    <w:rsid w:val="00BB6CC3"/>
+    <w:pPr>
+      <w:tabs>
+        <w:tab w:val="center" w:pos="4536"/>
+        <w:tab w:val="right" w:pos="9072"/>
+      </w:tabs>
+    </w:pPr>
+  </w:style>
+  <w:style w:type="character" w:customStyle="1" w:styleId="En-tteCar">
+    <w:name w:val="En-tête Car"/>
+    <w:basedOn w:val="Policepardfaut"/>
+    <w:link w:val="En-tte"/>
+    <w:uiPriority w:val="99"/>
+    <w:semiHidden/>
+    <w:rsid w:val="00BB6CC3"/>
+  </w:style>
+  <w:style w:type="paragraph" w:styleId="Pieddepage">
+    <w:name w:val="footer"/>
+    <w:basedOn w:val="Normal"/>
+    <w:link w:val="PieddepageCar"/>
+    <w:uiPriority w:val="99"/>
+    <w:semiHidden/>
+    <w:unhideWhenUsed/>
+    <w:rsid w:val="00BB6CC3"/>
+    <w:pPr>
+      <w:tabs>
+        <w:tab w:val="center" w:pos="4536"/>
+        <w:tab w:val="right" w:pos="9072"/>
+      </w:tabs>
+    </w:pPr>
+  </w:style>
+  <w:style w:type="character" w:customStyle="1" w:styleId="PieddepageCar">
+    <w:name w:val="Pied de page Car"/>
+    <w:basedOn w:val="Policepardfaut"/>
+    <w:link w:val="Pieddepage"/>
+    <w:uiPriority w:val="99"/>
+    <w:semiHidden/>
+    <w:rsid w:val="00BB6CC3"/>
+  </w:style>
 </w:styles>
 </file>
 

</xml_diff>